<commit_message>
August 18th Submission Update
</commit_message>
<xml_diff>
--- a/Documents/Predicting Formula 1 Race Outcomes.docx
+++ b/Documents/Predicting Formula 1 Race Outcomes.docx
@@ -1023,7 +1023,7 @@
                 <w:noProof/>
                 <w:webHidden/>
               </w:rPr>
-              <w:t>7</w:t>
+              <w:t>8</w:t>
             </w:r>
             <w:r>
               <w:rPr>
@@ -1463,7 +1463,7 @@
                 <w:noProof/>
                 <w:webHidden/>
               </w:rPr>
-              <w:t>12</w:t>
+              <w:t>13</w:t>
             </w:r>
             <w:r>
               <w:rPr>
@@ -1551,7 +1551,7 @@
                 <w:noProof/>
                 <w:webHidden/>
               </w:rPr>
-              <w:t>12</w:t>
+              <w:t>13</w:t>
             </w:r>
             <w:r>
               <w:rPr>
@@ -2365,21 +2365,11 @@
       <w:r>
         <w:t>While it is well-acknowledged that constructors play a pivotal role in Formula 1 success, there is a need to delve deeper into the individual variances attributable to constructors and drivers. Prior analyses (</w:t>
       </w:r>
-      <w:proofErr w:type="spellStart"/>
       <w:r>
         <w:t>Kesteren</w:t>
       </w:r>
-      <w:proofErr w:type="spellEnd"/>
-      <w:r>
-        <w:t xml:space="preserve">, 2023; </w:t>
-      </w:r>
-      <w:proofErr w:type="spellStart"/>
-      <w:r>
-        <w:t>Rockerbie</w:t>
-      </w:r>
-      <w:proofErr w:type="spellEnd"/>
-      <w:r>
-        <w:t>, 2021; Bell, 2016) have explored the overall variance explained by constructors versus drivers, often assigning “skill” values to each.</w:t>
+      <w:r>
+        <w:t>, 2023; Rockerbie, 2021; Bell, 2016) have explored the overall variance explained by constructors versus drivers, often assigning “skill” values to each.</w:t>
       </w:r>
     </w:p>
     <w:p>
@@ -2394,24 +2384,17 @@
       <w:r>
         <w:t xml:space="preserve">Moreover, our approach differs from the existing literature. Bell (2016) and </w:t>
       </w:r>
-      <w:proofErr w:type="spellStart"/>
       <w:r>
         <w:t>Kesteren</w:t>
       </w:r>
-      <w:proofErr w:type="spellEnd"/>
       <w:r>
         <w:t xml:space="preserve"> (2023) have produced the most prominent and similar work in the field. Bell's methodology treats a driver's entire career as a single entity, while </w:t>
       </w:r>
-      <w:proofErr w:type="spellStart"/>
       <w:r>
         <w:t>Kesteren</w:t>
       </w:r>
       <w:r>
-        <w:t>'s</w:t>
-      </w:r>
-      <w:proofErr w:type="spellEnd"/>
-      <w:r>
-        <w:t xml:space="preserve"> analysis is conducted at the season level. In contrast, our model </w:t>
+        <w:t xml:space="preserve">'s analysis is conducted at the season level. In contrast, our model </w:t>
       </w:r>
       <w:r>
         <w:lastRenderedPageBreak/>
@@ -2439,26 +2422,10 @@
         <w:t>W</w:t>
       </w:r>
       <w:r>
-        <w:t xml:space="preserve">e collect data from all Formula 1 races through the </w:t>
-      </w:r>
-      <w:proofErr w:type="spellStart"/>
-      <w:r>
-        <w:t>Ergast</w:t>
-      </w:r>
-      <w:proofErr w:type="spellEnd"/>
-      <w:r>
-        <w:t xml:space="preserve"> API via the f1dataR R package</w:t>
-      </w:r>
-      <w:r>
-        <w:t xml:space="preserve"> (</w:t>
-      </w:r>
-      <w:proofErr w:type="spellStart"/>
-      <w:r>
-        <w:t>Ergast</w:t>
-      </w:r>
-      <w:proofErr w:type="spellEnd"/>
-      <w:r>
-        <w:t>, f1dataR)</w:t>
+        <w:t>e collect data from all Formula 1 races through the Ergast API via the f1dataR R package</w:t>
+      </w:r>
+      <w:r>
+        <w:t xml:space="preserve"> (Ergast, f1dataR)</w:t>
       </w:r>
       <w:r>
         <w:t>. Our analysis primarily focuses on the hybrid engine era (2014 to present), utilizing race results from 2012 onwards to provide a warm start.</w:t>
@@ -2468,39 +2435,21 @@
       <w:r>
         <w:t xml:space="preserve">For our primary model, we exclude non-finishers (DNF) to avoid the additional noise and complexity they introduce to the outcome of interest, as similarly noted by </w:t>
       </w:r>
-      <w:proofErr w:type="spellStart"/>
       <w:r>
         <w:t>Kesteren</w:t>
       </w:r>
-      <w:proofErr w:type="spellEnd"/>
       <w:r>
         <w:t xml:space="preserve"> (2023). Assigning the root cause of certain DNFs, particularly driver-driver collisions, can be challenging. Given the time-decay and point-in-time nature of our study, indexing on DNFs may disproportionately add negative noise to a driver or constructor coefficient. However, we also test model variants that include DNFs wholly and another that partially assigns DNF cause to either driver or constructor based on the type of DNF. DNFs categorized as Collision, Accident, or Spun-Off are attributed to driver fault, while other causes are attributed to constructor fault.</w:t>
       </w:r>
     </w:p>
     <w:p>
       <w:r>
-        <w:t xml:space="preserve">The features used in the model are binary indicators for the parent constructor and driver at the race level. The term "parent constructor" refers to constructors that have undergone name changes but remain the same underlying entity. For example, Toro Rosso, Alpha Tauri, and RB are considered the same </w:t>
-      </w:r>
-      <w:proofErr w:type="gramStart"/>
-      <w:r>
-        <w:t>constructor</w:t>
-      </w:r>
-      <w:proofErr w:type="gramEnd"/>
-      <w:r>
-        <w:t xml:space="preserve"> in this analysis.</w:t>
-      </w:r>
-    </w:p>
-    <w:p>
-      <w:r>
-        <w:t xml:space="preserve">The response variable is the rank finish of the driver-constructor pair </w:t>
-      </w:r>
-      <w:proofErr w:type="gramStart"/>
-      <w:r>
-        <w:t>in a given</w:t>
-      </w:r>
-      <w:proofErr w:type="gramEnd"/>
-      <w:r>
-        <w:t xml:space="preserve"> race. Points-scoring positions (ranks 1 to 10) are weighted equally, as drivers are expected to compete equally for these positions. Positions beyond 10 are weighted on a linear decay until the last position, reflecting the expectation that the effort expended for lower places is probably less than that for the top places (Henderson, 2021).</w:t>
+        <w:t>The features used in the model are binary indicators for the parent constructor and driver at the race level. The term "parent constructor" refers to constructors that have undergone name changes but remain the same underlying entity. For example, Toro Rosso, Alpha Tauri, and RB are considered the same constructor in this analysis.</w:t>
+      </w:r>
+    </w:p>
+    <w:p>
+      <w:r>
+        <w:t>The response variable is the rank finish of the driver-constructor pair in a given race. Points-scoring positions (ranks 1 to 10) are weighted equally, as drivers are expected to compete equally for these positions. Positions beyond 10 are weighted on a linear decay until the last position, reflecting the expectation that the effort expended for lower places is probably less than that for the top places (Henderson, 2021).</w:t>
       </w:r>
       <w:r>
         <w:t xml:space="preserve"> The </w:t>
@@ -2836,15 +2785,7 @@
       </w:r>
       <w:bookmarkStart w:id="5" w:name="_Toc172717661"/>
       <w:r>
-        <w:t xml:space="preserve">Linear Model </w:t>
-      </w:r>
-      <w:proofErr w:type="gramStart"/>
-      <w:r>
-        <w:t>With</w:t>
-      </w:r>
-      <w:proofErr w:type="gramEnd"/>
-      <w:r>
-        <w:t xml:space="preserve"> Ridge Regression</w:t>
+        <w:t>Linear Model With Ridge Regression</w:t>
       </w:r>
       <w:bookmarkEnd w:id="5"/>
     </w:p>
@@ -2926,18 +2867,8 @@
           <w:i/>
           <w:iCs/>
         </w:rPr>
-        <w:t xml:space="preserve">X: Sparse matrix of drivers and </w:t>
-      </w:r>
-      <w:proofErr w:type="spellStart"/>
-      <w:r>
-        <w:rPr>
-          <w:rFonts w:ascii="Cambria Math" w:eastAsiaTheme="minorEastAsia" w:hAnsi="Cambria Math"/>
-          <w:i/>
-          <w:iCs/>
-        </w:rPr>
-        <w:t>consturoctrs</w:t>
-      </w:r>
-      <w:proofErr w:type="spellEnd"/>
+        <w:t>X: Sparse matrix of drivers and consturoctrs</w:t>
+      </w:r>
     </w:p>
     <w:p>
       <w:pPr>
@@ -2956,7 +2887,6 @@
           <m:t>β</m:t>
         </m:r>
       </m:oMath>
-      <w:proofErr w:type="gramStart"/>
       <w:r>
         <w:rPr>
           <w:rFonts w:ascii="Cambria Math" w:eastAsiaTheme="minorEastAsia" w:hAnsi="Cambria Math"/>
@@ -2971,16 +2901,7 @@
           <w:i/>
           <w:iCs/>
         </w:rPr>
-        <w:t>Matrix</w:t>
-      </w:r>
-      <w:proofErr w:type="gramEnd"/>
-      <w:r>
-        <w:rPr>
-          <w:rFonts w:ascii="Cambria Math" w:eastAsiaTheme="minorEastAsia" w:hAnsi="Cambria Math"/>
-          <w:i/>
-          <w:iCs/>
-        </w:rPr>
-        <w:t xml:space="preserve"> of individual driver and constructor coefficients</w:t>
+        <w:t>Matrix of individual driver and constructor coefficients</w:t>
       </w:r>
     </w:p>
     <w:p>
@@ -4340,15 +4261,7 @@
         <w:t xml:space="preserve">, </w:t>
       </w:r>
       <w:r>
-        <w:t>which utilize ridge regression (</w:t>
-      </w:r>
-      <w:proofErr w:type="spellStart"/>
-      <w:r>
-        <w:t>Mevedovsky</w:t>
-      </w:r>
-      <w:proofErr w:type="spellEnd"/>
-      <w:r>
-        <w:t xml:space="preserve">). </w:t>
+        <w:t xml:space="preserve">which utilize ridge regression (Mevedovsky). </w:t>
       </w:r>
     </w:p>
     <w:p/>
@@ -4810,11 +4723,9 @@
       <w:r>
         <w:t xml:space="preserve">As discussed in the Introduction, the features used are a sparse matrix of parent constructors and drivers. Unlike </w:t>
       </w:r>
-      <w:proofErr w:type="spellStart"/>
       <w:r>
         <w:t>Kesteren</w:t>
       </w:r>
-      <w:proofErr w:type="spellEnd"/>
       <w:r>
         <w:t xml:space="preserve"> and Bell’s work, which included weather conditions, we exclude weather due to its unpredictability before a race weekend. Circuit type (street </w:t>
       </w:r>
@@ -4871,10 +4782,10 @@
           <w:noProof/>
         </w:rPr>
         <w:drawing>
-          <wp:inline distT="0" distB="0" distL="0" distR="0" wp14:anchorId="3179FCA6" wp14:editId="63CC3899">
+          <wp:inline distT="0" distB="0" distL="0" distR="0" wp14:anchorId="3179FCA6" wp14:editId="60854878">
             <wp:extent cx="5486400" cy="2743200"/>
             <wp:effectExtent l="0" t="0" r="0" b="0"/>
-            <wp:docPr id="1792358666" name="Picture 1" descr="A graph of a graph&#10;&#10;Description automatically generated with medium confidence"/>
+            <wp:docPr id="1792358666" name="Picture 1"/>
             <wp:cNvGraphicFramePr>
               <a:graphicFrameLocks xmlns:a="http://schemas.openxmlformats.org/drawingml/2006/main" noChangeAspect="1"/>
             </wp:cNvGraphicFramePr>
@@ -4882,7 +4793,7 @@
               <a:graphicData uri="http://schemas.openxmlformats.org/drawingml/2006/picture">
                 <pic:pic xmlns:pic="http://schemas.openxmlformats.org/drawingml/2006/picture">
                   <pic:nvPicPr>
-                    <pic:cNvPr id="1792358666" name="Picture 1" descr="A graph of a graph&#10;&#10;Description automatically generated with medium confidence"/>
+                    <pic:cNvPr id="1792358666" name="Picture 1"/>
                     <pic:cNvPicPr>
                       <a:picLocks noChangeAspect="1" noChangeArrowheads="1"/>
                     </pic:cNvPicPr>
@@ -4895,7 +4806,6 @@
                         </a:ext>
                       </a:extLst>
                     </a:blip>
-                    <a:srcRect/>
                     <a:stretch>
                       <a:fillRect/>
                     </a:stretch>
@@ -4925,35 +4835,41 @@
         <w:pStyle w:val="Caption"/>
         <w:jc w:val="center"/>
         <w:rPr>
-          <w:color w:val="auto"/>
-        </w:rPr>
-      </w:pPr>
-      <w:r>
-        <w:rPr>
+          <w:rFonts w:ascii="Arial" w:hAnsi="Arial" w:cs="Arial"/>
+          <w:color w:val="auto"/>
+        </w:rPr>
+      </w:pPr>
+      <w:r>
+        <w:rPr>
+          <w:rFonts w:ascii="Arial" w:hAnsi="Arial" w:cs="Arial"/>
           <w:color w:val="auto"/>
         </w:rPr>
         <w:t xml:space="preserve">Figure </w:t>
       </w:r>
       <w:r>
         <w:rPr>
+          <w:rFonts w:ascii="Arial" w:hAnsi="Arial" w:cs="Arial"/>
           <w:color w:val="auto"/>
         </w:rPr>
         <w:fldChar w:fldCharType="begin"/>
       </w:r>
       <w:r>
         <w:rPr>
+          <w:rFonts w:ascii="Arial" w:hAnsi="Arial" w:cs="Arial"/>
           <w:color w:val="auto"/>
         </w:rPr>
         <w:instrText xml:space="preserve"> SEQ Figure \* ARABIC </w:instrText>
       </w:r>
       <w:r>
         <w:rPr>
+          <w:rFonts w:ascii="Arial" w:hAnsi="Arial" w:cs="Arial"/>
           <w:color w:val="auto"/>
         </w:rPr>
         <w:fldChar w:fldCharType="separate"/>
       </w:r>
       <w:r>
         <w:rPr>
+          <w:rFonts w:ascii="Arial" w:hAnsi="Arial" w:cs="Arial"/>
           <w:noProof/>
           <w:color w:val="auto"/>
         </w:rPr>
@@ -4961,24 +4877,28 @@
       </w:r>
       <w:r>
         <w:rPr>
+          <w:rFonts w:ascii="Arial" w:hAnsi="Arial" w:cs="Arial"/>
           <w:color w:val="auto"/>
         </w:rPr>
         <w:fldChar w:fldCharType="end"/>
       </w:r>
       <w:r>
         <w:rPr>
+          <w:rFonts w:ascii="Arial" w:hAnsi="Arial" w:cs="Arial"/>
           <w:color w:val="auto"/>
         </w:rPr>
         <w:t>: Daniel Riccardo raw (model-derived) coefficient</w:t>
       </w:r>
       <w:r>
         <w:rPr>
+          <w:rFonts w:ascii="Arial" w:hAnsi="Arial" w:cs="Arial"/>
           <w:color w:val="auto"/>
         </w:rPr>
         <w:t xml:space="preserve">. The model-derived coefficient is particularly noisy at the start of Ricciardo’s career, and each time he switches constructors. </w:t>
       </w:r>
       <w:r>
         <w:rPr>
+          <w:rFonts w:ascii="Arial" w:hAnsi="Arial" w:cs="Arial"/>
           <w:color w:val="auto"/>
         </w:rPr>
         <w:t>Shaded area represents a 95% confidence interval.</w:t>
@@ -5390,12 +5310,12 @@
         <w:jc w:val="right"/>
       </w:pPr>
       <w:r>
+        <w:lastRenderedPageBreak/>
         <w:t>(5)</w:t>
       </w:r>
     </w:p>
     <w:p>
       <w:r>
-        <w:lastRenderedPageBreak/>
         <w:t>This smoothing methodology yields a less noisy and more accurate time series for constructor and driver rating</w:t>
       </w:r>
       <w:r>
@@ -5412,10 +5332,10 @@
           <w:noProof/>
         </w:rPr>
         <w:drawing>
-          <wp:inline distT="0" distB="0" distL="0" distR="0" wp14:anchorId="5EB38752" wp14:editId="5DAA27F8">
+          <wp:inline distT="0" distB="0" distL="0" distR="0" wp14:anchorId="5EB38752" wp14:editId="7B4D5365">
             <wp:extent cx="5486400" cy="2743200"/>
             <wp:effectExtent l="0" t="0" r="0" b="0"/>
-            <wp:docPr id="1158603833" name="Picture 2" descr="A graph of a driver rating&#10;&#10;Description automatically generated"/>
+            <wp:docPr id="1158603833" name="Picture 2"/>
             <wp:cNvGraphicFramePr>
               <a:graphicFrameLocks xmlns:a="http://schemas.openxmlformats.org/drawingml/2006/main" noChangeAspect="1"/>
             </wp:cNvGraphicFramePr>
@@ -5423,7 +5343,7 @@
               <a:graphicData uri="http://schemas.openxmlformats.org/drawingml/2006/picture">
                 <pic:pic xmlns:pic="http://schemas.openxmlformats.org/drawingml/2006/picture">
                   <pic:nvPicPr>
-                    <pic:cNvPr id="1158603833" name="Picture 2" descr="A graph of a driver rating&#10;&#10;Description automatically generated"/>
+                    <pic:cNvPr id="1158603833" name="Picture 2"/>
                     <pic:cNvPicPr>
                       <a:picLocks noChangeAspect="1" noChangeArrowheads="1"/>
                     </pic:cNvPicPr>
@@ -5436,7 +5356,6 @@
                         </a:ext>
                       </a:extLst>
                     </a:blip>
-                    <a:srcRect/>
                     <a:stretch>
                       <a:fillRect/>
                     </a:stretch>
@@ -5466,35 +5385,41 @@
         <w:pStyle w:val="Caption"/>
         <w:jc w:val="center"/>
         <w:rPr>
-          <w:color w:val="auto"/>
-        </w:rPr>
-      </w:pPr>
-      <w:r>
-        <w:rPr>
+          <w:rFonts w:ascii="Arial" w:hAnsi="Arial" w:cs="Arial"/>
+          <w:color w:val="auto"/>
+        </w:rPr>
+      </w:pPr>
+      <w:r>
+        <w:rPr>
+          <w:rFonts w:ascii="Arial" w:hAnsi="Arial" w:cs="Arial"/>
           <w:color w:val="auto"/>
         </w:rPr>
         <w:t xml:space="preserve">Figure </w:t>
       </w:r>
       <w:r>
         <w:rPr>
+          <w:rFonts w:ascii="Arial" w:hAnsi="Arial" w:cs="Arial"/>
           <w:color w:val="auto"/>
         </w:rPr>
         <w:fldChar w:fldCharType="begin"/>
       </w:r>
       <w:r>
         <w:rPr>
+          <w:rFonts w:ascii="Arial" w:hAnsi="Arial" w:cs="Arial"/>
           <w:color w:val="auto"/>
         </w:rPr>
         <w:instrText xml:space="preserve"> SEQ Figure \* ARABIC </w:instrText>
       </w:r>
       <w:r>
         <w:rPr>
+          <w:rFonts w:ascii="Arial" w:hAnsi="Arial" w:cs="Arial"/>
           <w:color w:val="auto"/>
         </w:rPr>
         <w:fldChar w:fldCharType="separate"/>
       </w:r>
       <w:r>
         <w:rPr>
+          <w:rFonts w:ascii="Arial" w:hAnsi="Arial" w:cs="Arial"/>
           <w:noProof/>
           <w:color w:val="auto"/>
         </w:rPr>
@@ -5502,33 +5427,31 @@
       </w:r>
       <w:r>
         <w:rPr>
+          <w:rFonts w:ascii="Arial" w:hAnsi="Arial" w:cs="Arial"/>
           <w:color w:val="auto"/>
         </w:rPr>
         <w:fldChar w:fldCharType="end"/>
       </w:r>
       <w:r>
         <w:rPr>
+          <w:rFonts w:ascii="Arial" w:hAnsi="Arial" w:cs="Arial"/>
           <w:color w:val="auto"/>
         </w:rPr>
         <w:t>: Daniel Riccardo LOESS-blended coefficient</w:t>
       </w:r>
       <w:r>
         <w:rPr>
+          <w:rFonts w:ascii="Arial" w:hAnsi="Arial" w:cs="Arial"/>
           <w:color w:val="auto"/>
         </w:rPr>
         <w:t>. The LOESS blended coefficient is quick to pick up the initial performance surge at the start his career while maintaining stability in his driver coefficient later in his career. The transparent points represent the model-derived coefficient seen in Figure 1.</w:t>
       </w:r>
       <w:r>
         <w:rPr>
-          <w:color w:val="auto"/>
-        </w:rPr>
-        <w:t xml:space="preserve"> </w:t>
-      </w:r>
-      <w:r>
-        <w:rPr>
-          <w:color w:val="auto"/>
-        </w:rPr>
-        <w:t>Shaded area represents a 95% confidence interval.</w:t>
+          <w:rFonts w:ascii="Arial" w:hAnsi="Arial" w:cs="Arial"/>
+          <w:color w:val="auto"/>
+        </w:rPr>
+        <w:t xml:space="preserve"> Shaded area represents a 95% confidence interval.</w:t>
       </w:r>
     </w:p>
     <w:p>
@@ -5554,42 +5477,16 @@
         <w:pStyle w:val="NormalWeb"/>
       </w:pPr>
       <w:r>
-        <w:t xml:space="preserve">However, </w:t>
-      </w:r>
-      <w:proofErr w:type="spellStart"/>
-      <w:r>
-        <w:t>its</w:t>
-      </w:r>
-      <w:proofErr w:type="spellEnd"/>
-      <w:r>
-        <w:t xml:space="preserve"> important to note that we are solely measuring the variance of individual coefficients. That variance is likely understated for drivers and constructors with limited sample sizes as those coefficients will be penalized and shrunk through regularization. Additionally, penalized regression can result in non-normal distribution </w:t>
+        <w:t xml:space="preserve">However, its important to note that we are solely measuring the variance of individual coefficients. That variance is likely understated for drivers and constructors with limited sample sizes as those coefficients will be penalized and shrunk through regularization. Additionally, penalized regression can result in non-normal distribution </w:t>
       </w:r>
       <w:r>
         <w:t>of those coefficients (</w:t>
       </w:r>
-      <w:proofErr w:type="spellStart"/>
       <w:r>
         <w:t>Croiseau</w:t>
       </w:r>
-      <w:proofErr w:type="spellEnd"/>
-      <w:r>
-        <w:t xml:space="preserve"> 2009). As such, the confidence intervals provided have limited value for sensitivity </w:t>
-      </w:r>
-      <w:proofErr w:type="gramStart"/>
-      <w:r>
-        <w:t>analysis, but</w:t>
-      </w:r>
-      <w:proofErr w:type="gramEnd"/>
-      <w:r>
-        <w:t xml:space="preserve"> provide directional indicators to the variability of coefficients </w:t>
-      </w:r>
-      <w:proofErr w:type="gramStart"/>
-      <w:r>
-        <w:t>relatively</w:t>
-      </w:r>
-      <w:proofErr w:type="gramEnd"/>
-      <w:r>
-        <w:t xml:space="preserve"> to each other. </w:t>
+      <w:r>
+        <w:t xml:space="preserve"> 2009). As such, the confidence intervals provided have limited value for sensitivity analysis, but provide directional indicators to the variability of coefficients relatively to each other. </w:t>
       </w:r>
     </w:p>
     <w:p>
@@ -5621,6 +5518,7 @@
         <w:pStyle w:val="Heading4"/>
       </w:pPr>
       <w:r>
+        <w:lastRenderedPageBreak/>
         <w:t>Test Data</w:t>
       </w:r>
     </w:p>
@@ -5688,7 +5586,6 @@
           <w:sz w:val="22"/>
           <w:szCs w:val="22"/>
         </w:rPr>
-        <w:lastRenderedPageBreak/>
         <w:t xml:space="preserve">The test data is the immediate next race following the current race </w:t>
       </w:r>
       <w:r>
@@ -5736,33 +5633,15 @@
           <w:szCs w:val="22"/>
           <w:vertAlign w:val="subscript"/>
         </w:rPr>
-        <w:t xml:space="preserve">2016, Round </w:t>
-      </w:r>
-      <w:proofErr w:type="gramStart"/>
+        <w:t xml:space="preserve">2016, Round 5 </w:t>
+      </w:r>
       <w:r>
         <w:rPr>
           <w:sz w:val="22"/>
           <w:szCs w:val="22"/>
-          <w:vertAlign w:val="subscript"/>
-        </w:rPr>
-        <w:t xml:space="preserve">5 </w:t>
-      </w:r>
-      <w:r>
-        <w:rPr>
-          <w:sz w:val="22"/>
-          <w:szCs w:val="22"/>
-        </w:rPr>
-        <w:t>)</w:t>
-      </w:r>
-      <w:proofErr w:type="gramEnd"/>
-      <w:r>
-        <w:rPr>
-          <w:sz w:val="22"/>
-          <w:szCs w:val="22"/>
-        </w:rPr>
-        <w:t xml:space="preserve"> predicts the outcomes for the 2016 Monaco Grand Prix (2016 season, round 6). The predictions from the model are linearly ranked and used as </w:t>
-      </w:r>
-      <w:proofErr w:type="spellStart"/>
+        </w:rPr>
+        <w:t xml:space="preserve">) predicts the outcomes for the 2016 Monaco Grand Prix (2016 season, round 6). The predictions from the model are linearly ranked and used as </w:t>
+      </w:r>
       <w:r>
         <w:rPr>
           <w:i/>
@@ -5782,7 +5661,6 @@
         </w:rPr>
         <w:t>pred</w:t>
       </w:r>
-      <w:proofErr w:type="spellEnd"/>
       <w:r>
         <w:rPr>
           <w:sz w:val="22"/>
@@ -5790,7 +5668,6 @@
         </w:rPr>
         <w:t xml:space="preserve">. This same process is applied to get </w:t>
       </w:r>
-      <w:proofErr w:type="spellStart"/>
       <w:r>
         <w:rPr>
           <w:i/>
@@ -5810,7 +5687,6 @@
         </w:rPr>
         <w:t>pred</w:t>
       </w:r>
-      <w:proofErr w:type="spellEnd"/>
       <w:r>
         <w:rPr>
           <w:sz w:val="22"/>
@@ -6940,27 +6816,7 @@
           <w:sz w:val="20"/>
           <w:szCs w:val="20"/>
         </w:rPr>
-        <w:t xml:space="preserve">the Kendall’s Tau between constructors-only </w:t>
-      </w:r>
-      <w:proofErr w:type="gramStart"/>
-      <w:r>
-        <w:rPr>
-          <w:rFonts w:eastAsiaTheme="minorEastAsia"/>
-          <w:iCs/>
-          <w:sz w:val="20"/>
-          <w:szCs w:val="20"/>
-        </w:rPr>
-        <w:t>predictions  and</w:t>
-      </w:r>
-      <w:proofErr w:type="gramEnd"/>
-      <w:r>
-        <w:rPr>
-          <w:rFonts w:eastAsiaTheme="minorEastAsia"/>
-          <w:iCs/>
-          <w:sz w:val="20"/>
-          <w:szCs w:val="20"/>
-        </w:rPr>
-        <w:t xml:space="preserve"> drivers-only predictions</w:t>
+        <w:t>the Kendall’s Tau between constructors-only predictions  and drivers-only predictions</w:t>
       </w:r>
     </w:p>
     <w:p>
@@ -6976,18 +6832,10 @@
         <w:t>From there, we</w:t>
       </w:r>
       <w:r>
-        <w:t xml:space="preserve"> </w:t>
-      </w:r>
-      <w:proofErr w:type="gramStart"/>
-      <w:r>
-        <w:t>are</w:t>
-      </w:r>
-      <w:r>
-        <w:t xml:space="preserve"> able to</w:t>
-      </w:r>
-      <w:proofErr w:type="gramEnd"/>
-      <w:r>
-        <w:t xml:space="preserve"> describe the proportion variance explained by drivers versus constructors.</w:t>
+        <w:t xml:space="preserve"> are</w:t>
+      </w:r>
+      <w:r>
+        <w:t xml:space="preserve"> able to describe the proportion variance explained by drivers versus constructors.</w:t>
       </w:r>
     </w:p>
     <w:p/>
@@ -7147,6 +6995,7 @@
         <w:rPr>
           <w:rFonts w:eastAsiaTheme="minorEastAsia"/>
         </w:rPr>
+        <w:lastRenderedPageBreak/>
         <w:t>(8)</w:t>
       </w:r>
     </w:p>
@@ -7163,7 +7012,6 @@
     <w:p/>
     <w:p>
       <w:r>
-        <w:lastRenderedPageBreak/>
         <w:t>In addition to the linear ridge regression, we design</w:t>
       </w:r>
       <w:r>
@@ -8170,19 +8018,80 @@
     <w:p/>
     <w:p>
       <w:pPr>
+        <w:pStyle w:val="Caption"/>
         <w:keepNext/>
         <w:jc w:val="center"/>
-      </w:pPr>
-      <w:r>
-        <w:rPr>
+        <w:rPr>
+          <w:rFonts w:ascii="Arial" w:hAnsi="Arial" w:cs="Arial"/>
+          <w:color w:val="auto"/>
+        </w:rPr>
+      </w:pPr>
+      <w:r>
+        <w:rPr>
+          <w:rFonts w:ascii="Arial" w:hAnsi="Arial" w:cs="Arial"/>
+          <w:color w:val="auto"/>
+        </w:rPr>
+        <w:lastRenderedPageBreak/>
+        <w:t xml:space="preserve">Table </w:t>
+      </w:r>
+      <w:r>
+        <w:rPr>
+          <w:rFonts w:ascii="Arial" w:hAnsi="Arial" w:cs="Arial"/>
+          <w:color w:val="auto"/>
+        </w:rPr>
+        <w:fldChar w:fldCharType="begin"/>
+      </w:r>
+      <w:r>
+        <w:rPr>
+          <w:rFonts w:ascii="Arial" w:hAnsi="Arial" w:cs="Arial"/>
+          <w:color w:val="auto"/>
+        </w:rPr>
+        <w:instrText xml:space="preserve"> SEQ Table \* ARABIC </w:instrText>
+      </w:r>
+      <w:r>
+        <w:rPr>
+          <w:rFonts w:ascii="Arial" w:hAnsi="Arial" w:cs="Arial"/>
+          <w:color w:val="auto"/>
+        </w:rPr>
+        <w:fldChar w:fldCharType="separate"/>
+      </w:r>
+      <w:r>
+        <w:rPr>
+          <w:rFonts w:ascii="Arial" w:hAnsi="Arial" w:cs="Arial"/>
           <w:noProof/>
-        </w:rPr>
-        <w:lastRenderedPageBreak/>
+          <w:color w:val="auto"/>
+        </w:rPr>
+        <w:t>1</w:t>
+      </w:r>
+      <w:r>
+        <w:rPr>
+          <w:rFonts w:ascii="Arial" w:hAnsi="Arial" w:cs="Arial"/>
+          <w:color w:val="auto"/>
+        </w:rPr>
+        <w:fldChar w:fldCharType="end"/>
+      </w:r>
+      <w:r>
+        <w:rPr>
+          <w:rFonts w:ascii="Arial" w:hAnsi="Arial" w:cs="Arial"/>
+          <w:color w:val="auto"/>
+        </w:rPr>
+        <w:t>: Performance metrics for Time-Decay Ridge Regression Model. Kendall Tau is the primary test metric against predicted rank position of driver-constructors. Kendall's Tau is used over Spearman Rho due its robustness against outliers</w:t>
+      </w:r>
+    </w:p>
+    <w:p>
+      <w:pPr>
+        <w:keepNext/>
+        <w:jc w:val="center"/>
+      </w:pPr>
+      <w:r>
+        <w:rPr>
+          <w:noProof/>
+        </w:rPr>
         <w:drawing>
-          <wp:inline distT="0" distB="0" distL="0" distR="0" wp14:anchorId="3483145F" wp14:editId="1BFD40C3">
-            <wp:extent cx="5937250" cy="1670050"/>
-            <wp:effectExtent l="0" t="0" r="6350" b="6350"/>
-            <wp:docPr id="502443583" name="Picture 1" descr="A screenshot of a computer&#10;&#10;Description automatically generated"/>
+          <wp:inline distT="0" distB="0" distL="0" distR="0" wp14:anchorId="3483145F" wp14:editId="6EB220DB">
+            <wp:extent cx="5486400" cy="1686847"/>
+            <wp:effectExtent l="0" t="0" r="0" b="8890"/>
+            <wp:docPr id="502443583" name="Picture 1"/>
             <wp:cNvGraphicFramePr>
               <a:graphicFrameLocks xmlns:a="http://schemas.openxmlformats.org/drawingml/2006/main" noChangeAspect="1"/>
             </wp:cNvGraphicFramePr>
@@ -8190,7 +8099,7 @@
               <a:graphicData uri="http://schemas.openxmlformats.org/drawingml/2006/picture">
                 <pic:pic xmlns:pic="http://schemas.openxmlformats.org/drawingml/2006/picture">
                   <pic:nvPicPr>
-                    <pic:cNvPr id="502443583" name="Picture 1" descr="A screenshot of a computer&#10;&#10;Description automatically generated"/>
+                    <pic:cNvPr id="502443583" name="Picture 1"/>
                     <pic:cNvPicPr>
                       <a:picLocks noChangeAspect="1" noChangeArrowheads="1"/>
                     </pic:cNvPicPr>
@@ -8203,7 +8112,6 @@
                         </a:ext>
                       </a:extLst>
                     </a:blip>
-                    <a:srcRect/>
                     <a:stretch>
                       <a:fillRect/>
                     </a:stretch>
@@ -8211,7 +8119,7 @@
                   <pic:spPr bwMode="auto">
                     <a:xfrm>
                       <a:off x="0" y="0"/>
-                      <a:ext cx="5937250" cy="1670050"/>
+                      <a:ext cx="5486400" cy="1686847"/>
                     </a:xfrm>
                     <a:prstGeom prst="rect">
                       <a:avLst/>
@@ -8230,71 +8138,6 @@
     </w:p>
     <w:p>
       <w:pPr>
-        <w:pStyle w:val="Caption"/>
-        <w:jc w:val="center"/>
-        <w:rPr>
-          <w:color w:val="auto"/>
-        </w:rPr>
-      </w:pPr>
-      <w:r>
-        <w:rPr>
-          <w:color w:val="auto"/>
-        </w:rPr>
-        <w:t xml:space="preserve">Figure </w:t>
-      </w:r>
-      <w:r>
-        <w:rPr>
-          <w:color w:val="auto"/>
-        </w:rPr>
-        <w:fldChar w:fldCharType="begin"/>
-      </w:r>
-      <w:r>
-        <w:rPr>
-          <w:color w:val="auto"/>
-        </w:rPr>
-        <w:instrText xml:space="preserve"> SEQ Figure \* ARABIC </w:instrText>
-      </w:r>
-      <w:r>
-        <w:rPr>
-          <w:color w:val="auto"/>
-        </w:rPr>
-        <w:fldChar w:fldCharType="separate"/>
-      </w:r>
-      <w:r>
-        <w:rPr>
-          <w:noProof/>
-          <w:color w:val="auto"/>
-        </w:rPr>
-        <w:t>3</w:t>
-      </w:r>
-      <w:r>
-        <w:rPr>
-          <w:color w:val="auto"/>
-        </w:rPr>
-        <w:fldChar w:fldCharType="end"/>
-      </w:r>
-      <w:r>
-        <w:rPr>
-          <w:color w:val="auto"/>
-        </w:rPr>
-        <w:t>:</w:t>
-      </w:r>
-      <w:r>
-        <w:rPr>
-          <w:color w:val="auto"/>
-        </w:rPr>
-        <w:t xml:space="preserve"> Performance metrics for Time-Decay Ridge Regression Model</w:t>
-      </w:r>
-      <w:r>
-        <w:rPr>
-          <w:noProof/>
-          <w:color w:val="auto"/>
-        </w:rPr>
-        <w:t>. Kendall Tau is the primary test metric against predicted rank position of driver-constructors. Kendall's Tau is used over Spearman Rho due its robustness against outliers</w:t>
-      </w:r>
-    </w:p>
-    <w:p>
-      <w:pPr>
         <w:rPr>
           <w:sz w:val="24"/>
           <w:szCs w:val="24"/>
@@ -8304,7 +8147,13 @@
         <w:t xml:space="preserve">Our model testing yields the metrics displayed </w:t>
       </w:r>
       <w:r>
-        <w:t>in Figure 3 above</w:t>
+        <w:t xml:space="preserve">in </w:t>
+      </w:r>
+      <w:r>
+        <w:t>Table 1</w:t>
+      </w:r>
+      <w:r>
+        <w:t xml:space="preserve"> above</w:t>
       </w:r>
       <w:r>
         <w:t>. Intuitively, the DNF-Excluded model outperforms the DNF-inclusive models, as removing DNFs largely removes outlier results. Notably, the LOESS-blended coefficients perform better than the raw coefficients.</w:t>
@@ -8326,11 +8175,9 @@
       <w:r>
         <w:t xml:space="preserve">% variance explained by constructors in the DNF-excluded model contrasts with the 88% constructor-explained variance that </w:t>
       </w:r>
-      <w:proofErr w:type="spellStart"/>
       <w:r>
         <w:t>Kesteren</w:t>
       </w:r>
-      <w:proofErr w:type="spellEnd"/>
       <w:r>
         <w:t xml:space="preserve"> (2023) reported. The </w:t>
       </w:r>
@@ -8376,7 +8223,10 @@
         <w:t>% of the variance is explained by constructors, compared to 86% in Bell's DNF-inclusive model (Bell 2016). That difference can be likely explained through the wider time frame Bell uses (1979 - 2014). Classification percentage, a percentage of how many racers finished 90%+ of the race, has significantly increased over time</w:t>
       </w:r>
       <w:r>
-        <w:t>, as shown in Figure 4</w:t>
+        <w:t xml:space="preserve">, as shown in </w:t>
+      </w:r>
+      <w:r>
+        <w:t>Figure 3 below</w:t>
       </w:r>
       <w:r>
         <w:t>. Consequently, constructor influence when looking at races before the V8 (2006 - 2013) era may be more of a measure of reliability than ability. We also observe a slight drop in classification percentage at the start of new engine regulations, suggesting our model may lose predictive power with the new regulations set for the 2026 season.</w:t>
@@ -8396,10 +8246,10 @@
         </w:rPr>
         <w:lastRenderedPageBreak/>
         <w:drawing>
-          <wp:inline distT="0" distB="0" distL="0" distR="0" wp14:anchorId="7693D91C" wp14:editId="2D97E091">
-            <wp:extent cx="5492268" cy="2743200"/>
+          <wp:inline distT="0" distB="0" distL="0" distR="0" wp14:anchorId="7693D91C" wp14:editId="55338806">
+            <wp:extent cx="5486400" cy="2743200"/>
             <wp:effectExtent l="0" t="0" r="0" b="0"/>
-            <wp:docPr id="374281055" name="Picture 2" descr="A graph with red lines&#10;&#10;Description automatically generated"/>
+            <wp:docPr id="374281055" name="Picture 2"/>
             <wp:cNvGraphicFramePr>
               <a:graphicFrameLocks xmlns:a="http://schemas.openxmlformats.org/drawingml/2006/main" noChangeAspect="1"/>
             </wp:cNvGraphicFramePr>
@@ -8407,7 +8257,7 @@
               <a:graphicData uri="http://schemas.openxmlformats.org/drawingml/2006/picture">
                 <pic:pic xmlns:pic="http://schemas.openxmlformats.org/drawingml/2006/picture">
                   <pic:nvPicPr>
-                    <pic:cNvPr id="374281055" name="Picture 2" descr="A graph with red lines&#10;&#10;Description automatically generated"/>
+                    <pic:cNvPr id="374281055" name="Picture 2"/>
                     <pic:cNvPicPr>
                       <a:picLocks noChangeAspect="1" noChangeArrowheads="1"/>
                     </pic:cNvPicPr>
@@ -8420,7 +8270,6 @@
                         </a:ext>
                       </a:extLst>
                     </a:blip>
-                    <a:srcRect/>
                     <a:stretch>
                       <a:fillRect/>
                     </a:stretch>
@@ -8428,7 +8277,7 @@
                   <pic:spPr bwMode="auto">
                     <a:xfrm>
                       <a:off x="0" y="0"/>
-                      <a:ext cx="5492268" cy="2743200"/>
+                      <a:ext cx="5486400" cy="2743200"/>
                     </a:xfrm>
                     <a:prstGeom prst="rect">
                       <a:avLst/>
@@ -8450,75 +8299,143 @@
         <w:pStyle w:val="Caption"/>
         <w:jc w:val="center"/>
         <w:rPr>
-          <w:color w:val="auto"/>
-        </w:rPr>
-      </w:pPr>
-      <w:r>
-        <w:rPr>
+          <w:rFonts w:ascii="Arial" w:hAnsi="Arial" w:cs="Arial"/>
+          <w:color w:val="auto"/>
+        </w:rPr>
+      </w:pPr>
+      <w:r>
+        <w:rPr>
+          <w:rFonts w:ascii="Arial" w:hAnsi="Arial" w:cs="Arial"/>
           <w:color w:val="auto"/>
         </w:rPr>
         <w:t xml:space="preserve">Figure </w:t>
       </w:r>
       <w:r>
         <w:rPr>
+          <w:rFonts w:ascii="Arial" w:hAnsi="Arial" w:cs="Arial"/>
           <w:color w:val="auto"/>
         </w:rPr>
         <w:fldChar w:fldCharType="begin"/>
       </w:r>
       <w:r>
         <w:rPr>
+          <w:rFonts w:ascii="Arial" w:hAnsi="Arial" w:cs="Arial"/>
           <w:color w:val="auto"/>
         </w:rPr>
         <w:instrText xml:space="preserve"> SEQ Figure \* ARABIC </w:instrText>
       </w:r>
       <w:r>
         <w:rPr>
+          <w:rFonts w:ascii="Arial" w:hAnsi="Arial" w:cs="Arial"/>
           <w:color w:val="auto"/>
         </w:rPr>
         <w:fldChar w:fldCharType="separate"/>
       </w:r>
       <w:r>
         <w:rPr>
+          <w:rFonts w:ascii="Arial" w:hAnsi="Arial" w:cs="Arial"/>
           <w:noProof/>
           <w:color w:val="auto"/>
         </w:rPr>
-        <w:t>4</w:t>
-      </w:r>
-      <w:r>
-        <w:rPr>
+        <w:t>3</w:t>
+      </w:r>
+      <w:r>
+        <w:rPr>
+          <w:rFonts w:ascii="Arial" w:hAnsi="Arial" w:cs="Arial"/>
           <w:color w:val="auto"/>
         </w:rPr>
         <w:fldChar w:fldCharType="end"/>
       </w:r>
       <w:r>
         <w:rPr>
-          <w:color w:val="auto"/>
-        </w:rPr>
-        <w:t>:</w:t>
-      </w:r>
-      <w:r>
-        <w:rPr>
-          <w:color w:val="auto"/>
-        </w:rPr>
-        <w:t xml:space="preserve"> Average constructor </w:t>
-      </w:r>
-      <w:r>
-        <w:rPr>
-          <w:color w:val="auto"/>
-        </w:rPr>
-        <w:t>classification</w:t>
-      </w:r>
-      <w:r>
-        <w:rPr>
-          <w:color w:val="auto"/>
-        </w:rPr>
-        <w:t xml:space="preserve"> percentage by season, 1983 to present. As measured through classification percentage, </w:t>
-      </w:r>
-      <w:r>
-        <w:rPr>
-          <w:color w:val="auto"/>
-        </w:rPr>
-        <w:t>car reliability has steadily trended up over the last forty plus years. Consequently, DNF inclusive that use a larger may be a measuring constructor reliability as a proxy for performance. Classification percentage takes a slight dip when new engine regulations are put into place</w:t>
+          <w:rFonts w:ascii="Arial" w:hAnsi="Arial" w:cs="Arial"/>
+          <w:color w:val="auto"/>
+        </w:rPr>
+        <w:t xml:space="preserve">: </w:t>
+      </w:r>
+      <w:r>
+        <w:rPr>
+          <w:rFonts w:ascii="Arial" w:hAnsi="Arial" w:cs="Arial"/>
+          <w:color w:val="auto"/>
+        </w:rPr>
+        <w:t>Classification</w:t>
+      </w:r>
+      <w:r>
+        <w:rPr>
+          <w:rFonts w:ascii="Arial" w:hAnsi="Arial" w:cs="Arial"/>
+          <w:color w:val="auto"/>
+        </w:rPr>
+        <w:t xml:space="preserve"> percentage by season, 1983 to present. </w:t>
+      </w:r>
+      <w:r>
+        <w:rPr>
+          <w:rFonts w:ascii="Arial" w:hAnsi="Arial" w:cs="Arial"/>
+          <w:color w:val="auto"/>
+        </w:rPr>
+        <w:t xml:space="preserve">Classified cars are those that finished 90% of a race. </w:t>
+      </w:r>
+      <w:r>
+        <w:rPr>
+          <w:rFonts w:ascii="Arial" w:hAnsi="Arial" w:cs="Arial"/>
+          <w:color w:val="auto"/>
+        </w:rPr>
+        <w:t xml:space="preserve">As measured through classification percentage, car reliability has steadily trended up over the last forty plus years. Consequently, DNF </w:t>
+      </w:r>
+      <w:r>
+        <w:rPr>
+          <w:rFonts w:ascii="Arial" w:hAnsi="Arial" w:cs="Arial"/>
+          <w:color w:val="auto"/>
+        </w:rPr>
+        <w:t>-</w:t>
+      </w:r>
+      <w:r>
+        <w:rPr>
+          <w:rFonts w:ascii="Arial" w:hAnsi="Arial" w:cs="Arial"/>
+          <w:color w:val="auto"/>
+        </w:rPr>
+        <w:t xml:space="preserve">inclusive </w:t>
+      </w:r>
+      <w:r>
+        <w:rPr>
+          <w:rFonts w:ascii="Arial" w:hAnsi="Arial" w:cs="Arial"/>
+          <w:color w:val="auto"/>
+        </w:rPr>
+        <w:t xml:space="preserve">approaches </w:t>
+      </w:r>
+      <w:r>
+        <w:rPr>
+          <w:rFonts w:ascii="Arial" w:hAnsi="Arial" w:cs="Arial"/>
+          <w:color w:val="auto"/>
+        </w:rPr>
+        <w:t xml:space="preserve">that use a larger </w:t>
+      </w:r>
+      <w:r>
+        <w:rPr>
+          <w:rFonts w:ascii="Arial" w:hAnsi="Arial" w:cs="Arial"/>
+          <w:color w:val="auto"/>
+        </w:rPr>
+        <w:t xml:space="preserve">time horizon may be a measure of </w:t>
+      </w:r>
+      <w:r>
+        <w:rPr>
+          <w:rFonts w:ascii="Arial" w:hAnsi="Arial" w:cs="Arial"/>
+          <w:color w:val="auto"/>
+        </w:rPr>
+        <w:t>reliability</w:t>
+      </w:r>
+      <w:r>
+        <w:rPr>
+          <w:rFonts w:ascii="Arial" w:hAnsi="Arial" w:cs="Arial"/>
+          <w:color w:val="auto"/>
+        </w:rPr>
+        <w:t xml:space="preserve"> </w:t>
+      </w:r>
+      <w:r>
+        <w:rPr>
+          <w:rFonts w:ascii="Arial" w:hAnsi="Arial" w:cs="Arial"/>
+          <w:color w:val="auto"/>
+        </w:rPr>
+        <w:t>rather than ability</w:t>
       </w:r>
     </w:p>
     <w:p>
@@ -8545,18 +8462,79 @@
     </w:p>
     <w:p>
       <w:pPr>
+        <w:pStyle w:val="Caption"/>
         <w:keepNext/>
         <w:jc w:val="center"/>
-      </w:pPr>
-      <w:r>
-        <w:rPr>
+        <w:rPr>
+          <w:rFonts w:ascii="Arial" w:hAnsi="Arial" w:cs="Arial"/>
+          <w:color w:val="auto"/>
+        </w:rPr>
+      </w:pPr>
+      <w:r>
+        <w:rPr>
+          <w:rFonts w:ascii="Arial" w:hAnsi="Arial" w:cs="Arial"/>
+          <w:color w:val="auto"/>
+        </w:rPr>
+        <w:t xml:space="preserve">Table </w:t>
+      </w:r>
+      <w:r>
+        <w:rPr>
+          <w:rFonts w:ascii="Arial" w:hAnsi="Arial" w:cs="Arial"/>
+          <w:color w:val="auto"/>
+        </w:rPr>
+        <w:fldChar w:fldCharType="begin"/>
+      </w:r>
+      <w:r>
+        <w:rPr>
+          <w:rFonts w:ascii="Arial" w:hAnsi="Arial" w:cs="Arial"/>
+          <w:color w:val="auto"/>
+        </w:rPr>
+        <w:instrText xml:space="preserve"> SEQ Table \* ARABIC </w:instrText>
+      </w:r>
+      <w:r>
+        <w:rPr>
+          <w:rFonts w:ascii="Arial" w:hAnsi="Arial" w:cs="Arial"/>
+          <w:color w:val="auto"/>
+        </w:rPr>
+        <w:fldChar w:fldCharType="separate"/>
+      </w:r>
+      <w:r>
+        <w:rPr>
+          <w:rFonts w:ascii="Arial" w:hAnsi="Arial" w:cs="Arial"/>
           <w:noProof/>
+          <w:color w:val="auto"/>
+        </w:rPr>
+        <w:t>2</w:t>
+      </w:r>
+      <w:r>
+        <w:rPr>
+          <w:rFonts w:ascii="Arial" w:hAnsi="Arial" w:cs="Arial"/>
+          <w:color w:val="auto"/>
+        </w:rPr>
+        <w:fldChar w:fldCharType="end"/>
+      </w:r>
+      <w:r>
+        <w:rPr>
+          <w:rFonts w:ascii="Arial" w:hAnsi="Arial" w:cs="Arial"/>
+          <w:color w:val="auto"/>
+        </w:rPr>
+        <w:t>: Performance metrics for Time-Decay Ridge Logistic Regression Model. McFadden’s Pseudo R2is the primary test metric. Constructor influence increases as N increases, though model strength, as measured through McFadden’s R2, decreases</w:t>
+      </w:r>
+    </w:p>
+    <w:p>
+      <w:pPr>
+        <w:keepNext/>
+        <w:jc w:val="center"/>
+      </w:pPr>
+      <w:r>
+        <w:rPr>
+          <w:noProof/>
         </w:rPr>
         <w:drawing>
-          <wp:inline distT="0" distB="0" distL="0" distR="0" wp14:anchorId="37220198" wp14:editId="15D15D84">
-            <wp:extent cx="4784035" cy="1574745"/>
-            <wp:effectExtent l="0" t="0" r="0" b="6985"/>
-            <wp:docPr id="20873651" name="Picture 17" descr="A screenshot of a graph&#10;&#10;Description automatically generated"/>
+          <wp:inline distT="0" distB="0" distL="0" distR="0" wp14:anchorId="37220198" wp14:editId="5C6375FC">
+            <wp:extent cx="5486400" cy="1978475"/>
+            <wp:effectExtent l="0" t="0" r="0" b="3175"/>
+            <wp:docPr id="20873651" name="Picture 17"/>
             <wp:cNvGraphicFramePr>
               <a:graphicFrameLocks xmlns:a="http://schemas.openxmlformats.org/drawingml/2006/main" noChangeAspect="1"/>
             </wp:cNvGraphicFramePr>
@@ -8564,12 +8542,12 @@
               <a:graphicData uri="http://schemas.openxmlformats.org/drawingml/2006/picture">
                 <pic:pic xmlns:pic="http://schemas.openxmlformats.org/drawingml/2006/picture">
                   <pic:nvPicPr>
-                    <pic:cNvPr id="20873651" name="Picture 17" descr="A screenshot of a graph&#10;&#10;Description automatically generated"/>
+                    <pic:cNvPr id="20873651" name="Picture 17"/>
                     <pic:cNvPicPr>
                       <a:picLocks noChangeAspect="1" noChangeArrowheads="1"/>
                     </pic:cNvPicPr>
                   </pic:nvPicPr>
-                  <pic:blipFill>
+                  <pic:blipFill rotWithShape="1">
                     <a:blip r:embed="rId17" cstate="print">
                       <a:extLst>
                         <a:ext uri="{28A0092B-C50C-407E-A947-70E740481C1C}">
@@ -8577,7 +8555,83 @@
                         </a:ext>
                       </a:extLst>
                     </a:blip>
-                    <a:srcRect/>
+                    <a:srcRect l="14785" r="15609"/>
+                    <a:stretch/>
+                  </pic:blipFill>
+                  <pic:spPr bwMode="auto">
+                    <a:xfrm>
+                      <a:off x="0" y="0"/>
+                      <a:ext cx="5486400" cy="1978475"/>
+                    </a:xfrm>
+                    <a:prstGeom prst="rect">
+                      <a:avLst/>
+                    </a:prstGeom>
+                    <a:noFill/>
+                    <a:ln>
+                      <a:noFill/>
+                    </a:ln>
+                    <a:extLst>
+                      <a:ext uri="{53640926-AAD7-44D8-BBD7-CCE9431645EC}">
+                        <a14:shadowObscured xmlns:a14="http://schemas.microsoft.com/office/drawing/2010/main"/>
+                      </a:ext>
+                    </a:extLst>
+                  </pic:spPr>
+                </pic:pic>
+              </a:graphicData>
+            </a:graphic>
+          </wp:inline>
+        </w:drawing>
+      </w:r>
+    </w:p>
+    <w:p>
+      <w:r>
+        <w:t xml:space="preserve">Our logistic model against the 3 key sportsbook benchmarks (Top 3/6/10) suggests a larger constructor influence when examining broader cohorts compared to the rank-ordered predictions of the primary ridge regression model. The increased constructor importance suggests that constructors are the primary driver </w:t>
+      </w:r>
+      <w:r>
+        <w:t>behind</w:t>
+      </w:r>
+      <w:r>
+        <w:t xml:space="preserve"> </w:t>
+      </w:r>
+      <w:r>
+        <w:t>placing drivers into a given cohort (e.g. points, top 6), but the intra-cohort ordering is a larger function of driver ability. </w:t>
+      </w:r>
+    </w:p>
+    <w:p/>
+    <w:p>
+      <w:pPr>
+        <w:keepNext/>
+        <w:jc w:val="center"/>
+      </w:pPr>
+      <w:r>
+        <w:rPr>
+          <w:noProof/>
+        </w:rPr>
+        <w:drawing>
+          <wp:inline distT="0" distB="0" distL="0" distR="0" wp14:anchorId="18881AC7" wp14:editId="097804F9">
+            <wp:extent cx="5486400" cy="1393235"/>
+            <wp:effectExtent l="0" t="0" r="0" b="0"/>
+            <wp:docPr id="1321736302" name="Picture 14"/>
+            <wp:cNvGraphicFramePr>
+              <a:graphicFrameLocks xmlns:a="http://schemas.openxmlformats.org/drawingml/2006/main" noChangeAspect="1"/>
+            </wp:cNvGraphicFramePr>
+            <a:graphic xmlns:a="http://schemas.openxmlformats.org/drawingml/2006/main">
+              <a:graphicData uri="http://schemas.openxmlformats.org/drawingml/2006/picture">
+                <pic:pic xmlns:pic="http://schemas.openxmlformats.org/drawingml/2006/picture">
+                  <pic:nvPicPr>
+                    <pic:cNvPr id="1321736302" name="Picture 14"/>
+                    <pic:cNvPicPr>
+                      <a:picLocks noChangeAspect="1" noChangeArrowheads="1"/>
+                    </pic:cNvPicPr>
+                  </pic:nvPicPr>
+                  <pic:blipFill>
+                    <a:blip r:embed="rId18" cstate="print">
+                      <a:extLst>
+                        <a:ext uri="{28A0092B-C50C-407E-A947-70E740481C1C}">
+                          <a14:useLocalDpi xmlns:a14="http://schemas.microsoft.com/office/drawing/2010/main" val="0"/>
+                        </a:ext>
+                      </a:extLst>
+                    </a:blip>
                     <a:stretch>
                       <a:fillRect/>
                     </a:stretch>
@@ -8585,7 +8639,7 @@
                   <pic:spPr bwMode="auto">
                     <a:xfrm>
                       <a:off x="0" y="0"/>
-                      <a:ext cx="4787974" cy="1576041"/>
+                      <a:ext cx="5486400" cy="1393235"/>
                     </a:xfrm>
                     <a:prstGeom prst="rect">
                       <a:avLst/>
@@ -8607,299 +8661,59 @@
         <w:pStyle w:val="Caption"/>
         <w:jc w:val="center"/>
         <w:rPr>
-          <w:color w:val="auto"/>
-        </w:rPr>
-      </w:pPr>
-      <w:r>
-        <w:rPr>
+          <w:rFonts w:ascii="Arial" w:hAnsi="Arial" w:cs="Arial"/>
+          <w:color w:val="auto"/>
+        </w:rPr>
+      </w:pPr>
+      <w:r>
+        <w:rPr>
+          <w:rFonts w:ascii="Arial" w:hAnsi="Arial" w:cs="Arial"/>
           <w:color w:val="auto"/>
         </w:rPr>
         <w:t xml:space="preserve">Figure </w:t>
       </w:r>
       <w:r>
         <w:rPr>
+          <w:rFonts w:ascii="Arial" w:hAnsi="Arial" w:cs="Arial"/>
           <w:color w:val="auto"/>
         </w:rPr>
         <w:fldChar w:fldCharType="begin"/>
       </w:r>
       <w:r>
         <w:rPr>
+          <w:rFonts w:ascii="Arial" w:hAnsi="Arial" w:cs="Arial"/>
           <w:color w:val="auto"/>
         </w:rPr>
         <w:instrText xml:space="preserve"> SEQ Figure \* ARABIC </w:instrText>
       </w:r>
       <w:r>
         <w:rPr>
+          <w:rFonts w:ascii="Arial" w:hAnsi="Arial" w:cs="Arial"/>
           <w:color w:val="auto"/>
         </w:rPr>
         <w:fldChar w:fldCharType="separate"/>
       </w:r>
       <w:r>
         <w:rPr>
+          <w:rFonts w:ascii="Arial" w:hAnsi="Arial" w:cs="Arial"/>
           <w:noProof/>
           <w:color w:val="auto"/>
         </w:rPr>
-        <w:t>5</w:t>
-      </w:r>
-      <w:r>
-        <w:rPr>
+        <w:t>4</w:t>
+      </w:r>
+      <w:r>
+        <w:rPr>
+          <w:rFonts w:ascii="Arial" w:hAnsi="Arial" w:cs="Arial"/>
           <w:color w:val="auto"/>
         </w:rPr>
         <w:fldChar w:fldCharType="end"/>
       </w:r>
       <w:r>
         <w:rPr>
-          <w:color w:val="auto"/>
-        </w:rPr>
-        <w:t>:</w:t>
-      </w:r>
-      <w:r>
-        <w:rPr>
-          <w:color w:val="auto"/>
-        </w:rPr>
-        <w:t xml:space="preserve"> Performance metrics for Time-Decay Ridge Logistic Regression Mode</w:t>
-      </w:r>
-      <w:r>
-        <w:rPr>
-          <w:color w:val="auto"/>
-        </w:rPr>
-        <w:t xml:space="preserve">l. McFadden’s </w:t>
-      </w:r>
-      <w:r>
-        <w:rPr>
-          <w:color w:val="auto"/>
-        </w:rPr>
-        <w:t>Pseudo</w:t>
-      </w:r>
-      <w:r>
-        <w:rPr>
-          <w:color w:val="auto"/>
-        </w:rPr>
-        <w:t xml:space="preserve"> R</w:t>
-      </w:r>
-      <w:r>
-        <w:rPr>
-          <w:color w:val="auto"/>
-          <w:vertAlign w:val="superscript"/>
-        </w:rPr>
-        <w:t>2</w:t>
-      </w:r>
-      <w:r>
-        <w:rPr>
-          <w:color w:val="auto"/>
-        </w:rPr>
-        <w:t xml:space="preserve">is the </w:t>
-      </w:r>
-      <w:r>
-        <w:rPr>
-          <w:color w:val="auto"/>
-        </w:rPr>
-        <w:t>primary test metric. Constructor influence increases as N increases, though model strength, as measured through McFadden’s R</w:t>
-      </w:r>
-      <w:r>
-        <w:rPr>
-          <w:color w:val="auto"/>
-          <w:vertAlign w:val="superscript"/>
-        </w:rPr>
-        <w:t>2</w:t>
-      </w:r>
-      <w:r>
-        <w:rPr>
-          <w:color w:val="auto"/>
-        </w:rPr>
-        <w:t>, decreases</w:t>
-      </w:r>
-    </w:p>
-    <w:p>
-      <w:r>
-        <w:t xml:space="preserve">Our logistic model against the 3 key sportsbook benchmarks (Top 3/6/10) suggests a larger constructor influence when examining broader cohorts compared to the rank-ordered predictions of the primary ridge regression model. The increased constructor importance suggests that constructors are the primary driver </w:t>
-      </w:r>
-      <w:r>
-        <w:t>behind</w:t>
-      </w:r>
-      <w:r>
-        <w:t xml:space="preserve"> </w:t>
-      </w:r>
-      <w:r>
-        <w:t>placing drivers into a given cohort (e.g. points, top 6), but the intra-cohort ordering is a larger function of driver ability. </w:t>
-      </w:r>
-    </w:p>
-    <w:p/>
-    <w:p>
-      <w:pPr>
-        <w:keepNext/>
-        <w:jc w:val="right"/>
-      </w:pPr>
-      <w:r>
-        <w:rPr>
-          <w:noProof/>
-        </w:rPr>
-        <w:lastRenderedPageBreak/>
-        <w:drawing>
-          <wp:inline distT="0" distB="0" distL="0" distR="0" wp14:anchorId="18881AC7" wp14:editId="357C2C2E">
-            <wp:extent cx="2926080" cy="1463040"/>
-            <wp:effectExtent l="0" t="0" r="7620" b="3810"/>
-            <wp:docPr id="1321736302" name="Picture 14"/>
-            <wp:cNvGraphicFramePr>
-              <a:graphicFrameLocks xmlns:a="http://schemas.openxmlformats.org/drawingml/2006/main" noChangeAspect="1"/>
-            </wp:cNvGraphicFramePr>
-            <a:graphic xmlns:a="http://schemas.openxmlformats.org/drawingml/2006/main">
-              <a:graphicData uri="http://schemas.openxmlformats.org/drawingml/2006/picture">
-                <pic:pic xmlns:pic="http://schemas.openxmlformats.org/drawingml/2006/picture">
-                  <pic:nvPicPr>
-                    <pic:cNvPr id="0" name="Picture 15"/>
-                    <pic:cNvPicPr>
-                      <a:picLocks noChangeAspect="1" noChangeArrowheads="1"/>
-                    </pic:cNvPicPr>
-                  </pic:nvPicPr>
-                  <pic:blipFill>
-                    <a:blip r:embed="rId18" cstate="print">
-                      <a:extLst>
-                        <a:ext uri="{28A0092B-C50C-407E-A947-70E740481C1C}">
-                          <a14:useLocalDpi xmlns:a14="http://schemas.microsoft.com/office/drawing/2010/main" val="0"/>
-                        </a:ext>
-                      </a:extLst>
-                    </a:blip>
-                    <a:srcRect/>
-                    <a:stretch>
-                      <a:fillRect/>
-                    </a:stretch>
-                  </pic:blipFill>
-                  <pic:spPr bwMode="auto">
-                    <a:xfrm>
-                      <a:off x="0" y="0"/>
-                      <a:ext cx="2926080" cy="1463040"/>
-                    </a:xfrm>
-                    <a:prstGeom prst="rect">
-                      <a:avLst/>
-                    </a:prstGeom>
-                    <a:noFill/>
-                    <a:ln>
-                      <a:noFill/>
-                    </a:ln>
-                  </pic:spPr>
-                </pic:pic>
-              </a:graphicData>
-            </a:graphic>
-          </wp:inline>
-        </w:drawing>
-      </w:r>
-      <w:r>
-        <w:rPr>
-          <w:noProof/>
-        </w:rPr>
-        <w:drawing>
-          <wp:inline distT="0" distB="0" distL="0" distR="0" wp14:anchorId="57149F98" wp14:editId="2B8030B7">
-            <wp:extent cx="2926080" cy="1463040"/>
-            <wp:effectExtent l="0" t="0" r="7620" b="3810"/>
-            <wp:docPr id="203021483" name="Picture 16"/>
-            <wp:cNvGraphicFramePr>
-              <a:graphicFrameLocks xmlns:a="http://schemas.openxmlformats.org/drawingml/2006/main" noChangeAspect="1"/>
-            </wp:cNvGraphicFramePr>
-            <a:graphic xmlns:a="http://schemas.openxmlformats.org/drawingml/2006/main">
-              <a:graphicData uri="http://schemas.openxmlformats.org/drawingml/2006/picture">
-                <pic:pic xmlns:pic="http://schemas.openxmlformats.org/drawingml/2006/picture">
-                  <pic:nvPicPr>
-                    <pic:cNvPr id="0" name="Picture 17"/>
-                    <pic:cNvPicPr>
-                      <a:picLocks noChangeAspect="1" noChangeArrowheads="1"/>
-                    </pic:cNvPicPr>
-                  </pic:nvPicPr>
-                  <pic:blipFill>
-                    <a:blip r:embed="rId19" cstate="print">
-                      <a:extLst>
-                        <a:ext uri="{28A0092B-C50C-407E-A947-70E740481C1C}">
-                          <a14:useLocalDpi xmlns:a14="http://schemas.microsoft.com/office/drawing/2010/main" val="0"/>
-                        </a:ext>
-                      </a:extLst>
-                    </a:blip>
-                    <a:srcRect/>
-                    <a:stretch>
-                      <a:fillRect/>
-                    </a:stretch>
-                  </pic:blipFill>
-                  <pic:spPr bwMode="auto">
-                    <a:xfrm>
-                      <a:off x="0" y="0"/>
-                      <a:ext cx="2926080" cy="1463040"/>
-                    </a:xfrm>
-                    <a:prstGeom prst="rect">
-                      <a:avLst/>
-                    </a:prstGeom>
-                    <a:noFill/>
-                    <a:ln>
-                      <a:noFill/>
-                    </a:ln>
-                  </pic:spPr>
-                </pic:pic>
-              </a:graphicData>
-            </a:graphic>
-          </wp:inline>
-        </w:drawing>
-      </w:r>
-    </w:p>
-    <w:p>
-      <w:pPr>
-        <w:pStyle w:val="Caption"/>
-        <w:jc w:val="center"/>
-        <w:rPr>
-          <w:color w:val="auto"/>
-        </w:rPr>
-      </w:pPr>
-      <w:r>
-        <w:rPr>
-          <w:color w:val="auto"/>
-        </w:rPr>
-        <w:t xml:space="preserve">Figure </w:t>
-      </w:r>
-      <w:r>
-        <w:rPr>
-          <w:color w:val="auto"/>
-        </w:rPr>
-        <w:fldChar w:fldCharType="begin"/>
-      </w:r>
-      <w:r>
-        <w:rPr>
-          <w:color w:val="auto"/>
-        </w:rPr>
-        <w:instrText xml:space="preserve"> SEQ Figure \* ARABIC </w:instrText>
-      </w:r>
-      <w:r>
-        <w:rPr>
-          <w:color w:val="auto"/>
-        </w:rPr>
-        <w:fldChar w:fldCharType="separate"/>
-      </w:r>
-      <w:r>
-        <w:rPr>
-          <w:noProof/>
-          <w:color w:val="auto"/>
-        </w:rPr>
-        <w:t>6</w:t>
-      </w:r>
-      <w:r>
-        <w:rPr>
-          <w:color w:val="auto"/>
-        </w:rPr>
-        <w:fldChar w:fldCharType="end"/>
-      </w:r>
-      <w:r>
-        <w:rPr>
-          <w:color w:val="auto"/>
-        </w:rPr>
-        <w:t>:</w:t>
-      </w:r>
-      <w:r>
-        <w:rPr>
-          <w:color w:val="auto"/>
-        </w:rPr>
-        <w:t xml:space="preserve"> Model Metrics and Variance Explained for Top N Logistic Model</w:t>
-      </w:r>
-      <w:r>
-        <w:rPr>
-          <w:color w:val="auto"/>
-        </w:rPr>
-        <w:t>. Model performance peaks at N = 5 before rapidly deteriorating for increasing N. The relative importance of constructors against drivers steadily increases for N greater than 6</w:t>
+          <w:rFonts w:ascii="Arial" w:hAnsi="Arial" w:cs="Arial"/>
+          <w:color w:val="auto"/>
+        </w:rPr>
+        <w:t>: Model Metrics and Variance Explained for Top N Logistic Model. Model performance peaks at N = 5 before rapidly deteriorating for increasing N. The relative importance of constructors against drivers steadily increases for N greater than 6</w:t>
       </w:r>
     </w:p>
     <w:p>
@@ -9161,10 +8975,10 @@
           <w:noProof/>
         </w:rPr>
         <w:drawing>
-          <wp:inline distT="0" distB="0" distL="0" distR="0" wp14:anchorId="73F8C0CA" wp14:editId="39220266">
-            <wp:extent cx="5943600" cy="1504315"/>
+          <wp:inline distT="0" distB="0" distL="0" distR="0" wp14:anchorId="73F8C0CA" wp14:editId="5C583B9B">
+            <wp:extent cx="5912413" cy="1504315"/>
             <wp:effectExtent l="0" t="0" r="0" b="635"/>
-            <wp:docPr id="12" name="Picture 11" descr="A graph of a graph of a graph of a graph of a graph of a graph of a graph of a graph of a graph of a graph of a graph of a graph of a graph of&#10;&#10;Description automatically generated">
+            <wp:docPr id="12" name="Picture 11">
               <a:extLst xmlns:a="http://schemas.openxmlformats.org/drawingml/2006/main">
                 <a:ext uri="{FF2B5EF4-FFF2-40B4-BE49-F238E27FC236}">
                   <a16:creationId xmlns:a16="http://schemas.microsoft.com/office/drawing/2014/main" id="{DE982B60-6ED3-95C9-2C34-5493D455EFB1}"/>
@@ -9178,7 +8992,7 @@
               <a:graphicData uri="http://schemas.openxmlformats.org/drawingml/2006/picture">
                 <pic:pic xmlns:pic="http://schemas.openxmlformats.org/drawingml/2006/picture">
                   <pic:nvPicPr>
-                    <pic:cNvPr id="12" name="Picture 11" descr="A graph of a graph of a graph of a graph of a graph of a graph of a graph of a graph of a graph of a graph of a graph of a graph of a graph of&#10;&#10;Description automatically generated">
+                    <pic:cNvPr id="12" name="Picture 11">
                       <a:extLst>
                         <a:ext uri="{FF2B5EF4-FFF2-40B4-BE49-F238E27FC236}">
                           <a16:creationId xmlns:a16="http://schemas.microsoft.com/office/drawing/2014/main" id="{DE982B60-6ED3-95C9-2C34-5493D455EFB1}"/>
@@ -9190,7 +9004,13 @@
                     </pic:cNvPicPr>
                   </pic:nvPicPr>
                   <pic:blipFill>
-                    <a:blip r:embed="rId20"/>
+                    <a:blip r:embed="rId19" cstate="print">
+                      <a:extLst>
+                        <a:ext uri="{28A0092B-C50C-407E-A947-70E740481C1C}">
+                          <a14:useLocalDpi xmlns:a14="http://schemas.microsoft.com/office/drawing/2010/main" val="0"/>
+                        </a:ext>
+                      </a:extLst>
+                    </a:blip>
                     <a:stretch>
                       <a:fillRect/>
                     </a:stretch>
@@ -9198,7 +9018,7 @@
                   <pic:spPr>
                     <a:xfrm>
                       <a:off x="0" y="0"/>
-                      <a:ext cx="5943600" cy="1504315"/>
+                      <a:ext cx="5912413" cy="1504315"/>
                     </a:xfrm>
                     <a:prstGeom prst="rect">
                       <a:avLst/>
@@ -9219,60 +9039,70 @@
         <w:pStyle w:val="Caption"/>
         <w:jc w:val="center"/>
         <w:rPr>
-          <w:color w:val="auto"/>
-        </w:rPr>
-      </w:pPr>
-      <w:r>
-        <w:rPr>
+          <w:rFonts w:ascii="Arial" w:hAnsi="Arial" w:cs="Arial"/>
+          <w:color w:val="auto"/>
+        </w:rPr>
+      </w:pPr>
+      <w:r>
+        <w:rPr>
+          <w:rFonts w:ascii="Arial" w:hAnsi="Arial" w:cs="Arial"/>
           <w:color w:val="auto"/>
         </w:rPr>
         <w:t xml:space="preserve">Figure </w:t>
       </w:r>
       <w:r>
         <w:rPr>
+          <w:rFonts w:ascii="Arial" w:hAnsi="Arial" w:cs="Arial"/>
           <w:color w:val="auto"/>
         </w:rPr>
         <w:fldChar w:fldCharType="begin"/>
       </w:r>
       <w:r>
         <w:rPr>
+          <w:rFonts w:ascii="Arial" w:hAnsi="Arial" w:cs="Arial"/>
           <w:color w:val="auto"/>
         </w:rPr>
         <w:instrText xml:space="preserve"> SEQ Figure \* ARABIC </w:instrText>
       </w:r>
       <w:r>
         <w:rPr>
+          <w:rFonts w:ascii="Arial" w:hAnsi="Arial" w:cs="Arial"/>
           <w:color w:val="auto"/>
         </w:rPr>
         <w:fldChar w:fldCharType="separate"/>
       </w:r>
       <w:r>
         <w:rPr>
+          <w:rFonts w:ascii="Arial" w:hAnsi="Arial" w:cs="Arial"/>
           <w:noProof/>
           <w:color w:val="auto"/>
         </w:rPr>
-        <w:t>7</w:t>
-      </w:r>
-      <w:r>
-        <w:rPr>
+        <w:t>5</w:t>
+      </w:r>
+      <w:r>
+        <w:rPr>
+          <w:rFonts w:ascii="Arial" w:hAnsi="Arial" w:cs="Arial"/>
           <w:color w:val="auto"/>
         </w:rPr>
         <w:fldChar w:fldCharType="end"/>
       </w:r>
       <w:r>
         <w:rPr>
+          <w:rFonts w:ascii="Arial" w:hAnsi="Arial" w:cs="Arial"/>
           <w:color w:val="auto"/>
         </w:rPr>
         <w:t>:</w:t>
       </w:r>
       <w:r>
         <w:rPr>
+          <w:rFonts w:ascii="Arial" w:hAnsi="Arial" w:cs="Arial"/>
           <w:color w:val="auto"/>
         </w:rPr>
         <w:t xml:space="preserve"> Max Verstappen vs Daniel Ricciardo LOESS-Blended Coefficients/Ratings</w:t>
       </w:r>
       <w:r>
         <w:rPr>
+          <w:rFonts w:ascii="Arial" w:hAnsi="Arial" w:cs="Arial"/>
           <w:color w:val="auto"/>
         </w:rPr>
         <w:t xml:space="preserve">. Verstappen has a similar coefficient at the end of his 2015 Toro Rosso as Ricciardo’s 2015 Red Bull Stint despite nearly doubling Verstappen’s WDC total. The two drivers performed similarly in the 2016 season under the same constructor. </w:t>
@@ -9280,6 +9110,7 @@
     </w:p>
     <w:p>
       <w:r>
+        <w:lastRenderedPageBreak/>
         <w:t>A similar phenomenon is observed in comparing constructor coefficients. Mercedes is consistently seen as the dominant constructor throughout the 2014-2021 period, coinciding with their eight consecutive World Constructors' Championships.</w:t>
       </w:r>
     </w:p>
@@ -9292,12 +9123,11 @@
         <w:rPr>
           <w:noProof/>
         </w:rPr>
-        <w:lastRenderedPageBreak/>
         <w:drawing>
-          <wp:inline distT="0" distB="0" distL="0" distR="0" wp14:anchorId="694B6CDD" wp14:editId="03BDCA72">
-            <wp:extent cx="5943600" cy="1483995"/>
+          <wp:inline distT="0" distB="0" distL="0" distR="0" wp14:anchorId="694B6CDD" wp14:editId="41000046">
+            <wp:extent cx="5797698" cy="1483995"/>
             <wp:effectExtent l="0" t="0" r="0" b="1905"/>
-            <wp:docPr id="384768874" name="Picture 10" descr="A graph of a red ball and a blue ball&#10;&#10;Description automatically generated">
+            <wp:docPr id="384768874" name="Picture 10">
               <a:extLst xmlns:a="http://schemas.openxmlformats.org/drawingml/2006/main">
                 <a:ext uri="{FF2B5EF4-FFF2-40B4-BE49-F238E27FC236}">
                   <a16:creationId xmlns:a16="http://schemas.microsoft.com/office/drawing/2014/main" id="{09F7C33E-F248-B55F-02E0-33A1494015D2}"/>
@@ -9311,7 +9141,7 @@
               <a:graphicData uri="http://schemas.openxmlformats.org/drawingml/2006/picture">
                 <pic:pic xmlns:pic="http://schemas.openxmlformats.org/drawingml/2006/picture">
                   <pic:nvPicPr>
-                    <pic:cNvPr id="384768874" name="Picture 10" descr="A graph of a red ball and a blue ball&#10;&#10;Description automatically generated">
+                    <pic:cNvPr id="384768874" name="Picture 10">
                       <a:extLst>
                         <a:ext uri="{FF2B5EF4-FFF2-40B4-BE49-F238E27FC236}">
                           <a16:creationId xmlns:a16="http://schemas.microsoft.com/office/drawing/2014/main" id="{09F7C33E-F248-B55F-02E0-33A1494015D2}"/>
@@ -9323,7 +9153,13 @@
                     </pic:cNvPicPr>
                   </pic:nvPicPr>
                   <pic:blipFill>
-                    <a:blip r:embed="rId21"/>
+                    <a:blip r:embed="rId20" cstate="print">
+                      <a:extLst>
+                        <a:ext uri="{28A0092B-C50C-407E-A947-70E740481C1C}">
+                          <a14:useLocalDpi xmlns:a14="http://schemas.microsoft.com/office/drawing/2010/main" val="0"/>
+                        </a:ext>
+                      </a:extLst>
+                    </a:blip>
                     <a:stretch>
                       <a:fillRect/>
                     </a:stretch>
@@ -9331,7 +9167,7 @@
                   <pic:spPr>
                     <a:xfrm>
                       <a:off x="0" y="0"/>
-                      <a:ext cx="5943600" cy="1483995"/>
+                      <a:ext cx="5797698" cy="1483995"/>
                     </a:xfrm>
                     <a:prstGeom prst="rect">
                       <a:avLst/>
@@ -9349,91 +9185,83 @@
         <w:pStyle w:val="Caption"/>
         <w:jc w:val="center"/>
         <w:rPr>
-          <w:color w:val="auto"/>
-        </w:rPr>
-      </w:pPr>
-      <w:r>
-        <w:rPr>
+          <w:rFonts w:ascii="Arial" w:hAnsi="Arial" w:cs="Arial"/>
+          <w:color w:val="auto"/>
+        </w:rPr>
+      </w:pPr>
+      <w:r>
+        <w:rPr>
+          <w:rFonts w:ascii="Arial" w:hAnsi="Arial" w:cs="Arial"/>
           <w:color w:val="auto"/>
         </w:rPr>
         <w:t xml:space="preserve">Figure </w:t>
       </w:r>
       <w:r>
         <w:rPr>
+          <w:rFonts w:ascii="Arial" w:hAnsi="Arial" w:cs="Arial"/>
           <w:color w:val="auto"/>
         </w:rPr>
         <w:fldChar w:fldCharType="begin"/>
       </w:r>
       <w:r>
         <w:rPr>
+          <w:rFonts w:ascii="Arial" w:hAnsi="Arial" w:cs="Arial"/>
           <w:color w:val="auto"/>
         </w:rPr>
         <w:instrText xml:space="preserve"> SEQ Figure \* ARABIC </w:instrText>
       </w:r>
       <w:r>
         <w:rPr>
+          <w:rFonts w:ascii="Arial" w:hAnsi="Arial" w:cs="Arial"/>
           <w:color w:val="auto"/>
         </w:rPr>
         <w:fldChar w:fldCharType="separate"/>
       </w:r>
       <w:r>
         <w:rPr>
+          <w:rFonts w:ascii="Arial" w:hAnsi="Arial" w:cs="Arial"/>
           <w:noProof/>
           <w:color w:val="auto"/>
         </w:rPr>
-        <w:t>8</w:t>
-      </w:r>
-      <w:r>
-        <w:rPr>
+        <w:t>6</w:t>
+      </w:r>
+      <w:r>
+        <w:rPr>
+          <w:rFonts w:ascii="Arial" w:hAnsi="Arial" w:cs="Arial"/>
           <w:color w:val="auto"/>
         </w:rPr>
         <w:fldChar w:fldCharType="end"/>
       </w:r>
       <w:r>
         <w:rPr>
+          <w:rFonts w:ascii="Arial" w:hAnsi="Arial" w:cs="Arial"/>
           <w:color w:val="auto"/>
         </w:rPr>
         <w:t>: Mercedes vs Red Bull LOESS-Blended Coefficients/Ratings</w:t>
       </w:r>
       <w:r>
         <w:rPr>
+          <w:rFonts w:ascii="Arial" w:hAnsi="Arial" w:cs="Arial"/>
           <w:color w:val="auto"/>
         </w:rPr>
         <w:t>. Mercedes has a higher coefficient until the 2022 season which is consistent with both teams’ performances in the World Constructor Championships. Mercedes won the WCC from 2014 – 2021 while Red Bull won in 2022 and 2023.</w:t>
       </w:r>
       <w:r>
         <w:rPr>
-          <w:color w:val="auto"/>
-        </w:rPr>
-        <w:t xml:space="preserve"> </w:t>
-      </w:r>
-      <w:r>
-        <w:rPr>
-          <w:color w:val="auto"/>
-        </w:rPr>
-        <w:t>Shaded area represents a 95% confidence interval.</w:t>
-      </w:r>
-    </w:p>
-    <w:p>
-      <w:r>
-        <w:t xml:space="preserve">While coefficients are useful for intra-team driver and constructor comparisons, similar conclusions can often be drawn from Formula </w:t>
-      </w:r>
-      <w:proofErr w:type="gramStart"/>
-      <w:r>
-        <w:t>1 point</w:t>
-      </w:r>
-      <w:proofErr w:type="gramEnd"/>
-      <w:r>
-        <w:t xml:space="preserve"> totals. The back-and-forth between Verstappen and Ricciardo is evident in their point totals for the 2016-2018 seasons. Mercedes' dominance over Red Bull is also clear from their point totals relative to other constructors.</w:t>
-      </w:r>
-    </w:p>
-    <w:p>
-      <w:r>
-        <w:t>The unique insight provided by the ridge regression model lies in inter-team driver comparisons. This is illustrated with Max Verstappen, Lewis Hamilton, and Valtteri Bottas. Hamilton and Bottas finished 1st and 2</w:t>
-      </w:r>
-      <w:proofErr w:type="gramStart"/>
-      <w:r>
-        <w:t>nd</w:t>
+          <w:rFonts w:ascii="Arial" w:hAnsi="Arial" w:cs="Arial"/>
+          <w:color w:val="auto"/>
+        </w:rPr>
+        <w:t xml:space="preserve"> Shaded area represents a 95% confidence interval.</w:t>
+      </w:r>
+    </w:p>
+    <w:p>
+      <w:r>
+        <w:t>While coefficients are useful for intra-team driver and constructor comparisons, similar conclusions can often be drawn from Formula 1 point totals. The back-and-forth between Verstappen and Ricciardo is evident in their point totals for the 2016-2018 seasons. Mercedes' dominance over Red Bull is also clear from their point totals relative to other constructors.</w:t>
+      </w:r>
+    </w:p>
+    <w:p>
+      <w:r>
+        <w:t>The unique insight provided by the ridge regression model lies in inter-team driver comparisons. This is illustrated with Max Verstappen, Lewis Hamilton, and Valtteri Bottas. Hamilton and Bottas finished 1st and 2nd</w:t>
       </w:r>
       <w:r>
         <w:t>,</w:t>
@@ -9441,7 +9269,6 @@
       <w:r>
         <w:t>respectively</w:t>
       </w:r>
-      <w:proofErr w:type="gramEnd"/>
       <w:r>
         <w:t>,</w:t>
       </w:r>
@@ -9459,10 +9286,10 @@
           <w:noProof/>
         </w:rPr>
         <w:drawing>
-          <wp:inline distT="0" distB="0" distL="0" distR="0" wp14:anchorId="5C3E70FC" wp14:editId="340DBE52">
-            <wp:extent cx="5943600" cy="1007745"/>
-            <wp:effectExtent l="0" t="0" r="0" b="1905"/>
-            <wp:docPr id="1670723810" name="Picture 15" descr="A graph of a graph&#10;&#10;Description automatically generated with medium confidence">
+          <wp:inline distT="0" distB="0" distL="0" distR="0" wp14:anchorId="5C3E70FC" wp14:editId="2CDA6724">
+            <wp:extent cx="5846447" cy="1007745"/>
+            <wp:effectExtent l="0" t="0" r="1905" b="1905"/>
+            <wp:docPr id="1670723810" name="Picture 15">
               <a:extLst xmlns:a="http://schemas.openxmlformats.org/drawingml/2006/main">
                 <a:ext uri="{FF2B5EF4-FFF2-40B4-BE49-F238E27FC236}">
                   <a16:creationId xmlns:a16="http://schemas.microsoft.com/office/drawing/2014/main" id="{17B536EC-1AFC-CB02-511A-EF149C3A2F4E}"/>
@@ -9476,7 +9303,7 @@
               <a:graphicData uri="http://schemas.openxmlformats.org/drawingml/2006/picture">
                 <pic:pic xmlns:pic="http://schemas.openxmlformats.org/drawingml/2006/picture">
                   <pic:nvPicPr>
-                    <pic:cNvPr id="1670723810" name="Picture 15" descr="A graph of a graph&#10;&#10;Description automatically generated with medium confidence">
+                    <pic:cNvPr id="1670723810" name="Picture 15">
                       <a:extLst>
                         <a:ext uri="{FF2B5EF4-FFF2-40B4-BE49-F238E27FC236}">
                           <a16:creationId xmlns:a16="http://schemas.microsoft.com/office/drawing/2014/main" id="{17B536EC-1AFC-CB02-511A-EF149C3A2F4E}"/>
@@ -9488,7 +9315,13 @@
                     </pic:cNvPicPr>
                   </pic:nvPicPr>
                   <pic:blipFill>
-                    <a:blip r:embed="rId22"/>
+                    <a:blip r:embed="rId21" cstate="print">
+                      <a:extLst>
+                        <a:ext uri="{28A0092B-C50C-407E-A947-70E740481C1C}">
+                          <a14:useLocalDpi xmlns:a14="http://schemas.microsoft.com/office/drawing/2010/main" val="0"/>
+                        </a:ext>
+                      </a:extLst>
+                    </a:blip>
                     <a:stretch>
                       <a:fillRect/>
                     </a:stretch>
@@ -9496,7 +9329,7 @@
                   <pic:spPr>
                     <a:xfrm>
                       <a:off x="0" y="0"/>
-                      <a:ext cx="5943600" cy="1007745"/>
+                      <a:ext cx="5846447" cy="1007745"/>
                     </a:xfrm>
                     <a:prstGeom prst="rect">
                       <a:avLst/>
@@ -9514,106 +9347,91 @@
         <w:pStyle w:val="Caption"/>
         <w:jc w:val="center"/>
         <w:rPr>
-          <w:color w:val="auto"/>
-        </w:rPr>
-      </w:pPr>
-      <w:r>
-        <w:rPr>
+          <w:rFonts w:ascii="Arial" w:hAnsi="Arial" w:cs="Arial"/>
+          <w:color w:val="auto"/>
+        </w:rPr>
+      </w:pPr>
+      <w:r>
+        <w:rPr>
+          <w:rFonts w:ascii="Arial" w:hAnsi="Arial" w:cs="Arial"/>
           <w:color w:val="auto"/>
         </w:rPr>
         <w:t xml:space="preserve">Figure </w:t>
       </w:r>
       <w:r>
         <w:rPr>
+          <w:rFonts w:ascii="Arial" w:hAnsi="Arial" w:cs="Arial"/>
           <w:color w:val="auto"/>
         </w:rPr>
         <w:fldChar w:fldCharType="begin"/>
       </w:r>
       <w:r>
         <w:rPr>
+          <w:rFonts w:ascii="Arial" w:hAnsi="Arial" w:cs="Arial"/>
           <w:color w:val="auto"/>
         </w:rPr>
         <w:instrText xml:space="preserve"> SEQ Figure \* ARABIC </w:instrText>
       </w:r>
       <w:r>
         <w:rPr>
+          <w:rFonts w:ascii="Arial" w:hAnsi="Arial" w:cs="Arial"/>
           <w:color w:val="auto"/>
         </w:rPr>
         <w:fldChar w:fldCharType="separate"/>
       </w:r>
       <w:r>
         <w:rPr>
+          <w:rFonts w:ascii="Arial" w:hAnsi="Arial" w:cs="Arial"/>
           <w:noProof/>
           <w:color w:val="auto"/>
         </w:rPr>
-        <w:t>9</w:t>
-      </w:r>
-      <w:r>
-        <w:rPr>
+        <w:t>7</w:t>
+      </w:r>
+      <w:r>
+        <w:rPr>
+          <w:rFonts w:ascii="Arial" w:hAnsi="Arial" w:cs="Arial"/>
           <w:color w:val="auto"/>
         </w:rPr>
         <w:fldChar w:fldCharType="end"/>
       </w:r>
       <w:r>
         <w:rPr>
+          <w:rFonts w:ascii="Arial" w:hAnsi="Arial" w:cs="Arial"/>
           <w:color w:val="auto"/>
         </w:rPr>
         <w:t>:</w:t>
       </w:r>
       <w:r>
         <w:rPr>
-          <w:color w:val="auto"/>
-        </w:rPr>
-        <w:t xml:space="preserve"> Max Verstappen, </w:t>
-      </w:r>
-      <w:proofErr w:type="spellStart"/>
-      <w:r>
-        <w:rPr>
-          <w:color w:val="auto"/>
-        </w:rPr>
-        <w:t>Valtreri</w:t>
-      </w:r>
-      <w:proofErr w:type="spellEnd"/>
-      <w:r>
-        <w:rPr>
-          <w:color w:val="auto"/>
-        </w:rPr>
-        <w:t xml:space="preserve"> Bottas, Lewis Hamilton LOESS-Blended Coefficients/Rating</w:t>
-      </w:r>
-      <w:r>
-        <w:rPr>
-          <w:color w:val="auto"/>
-        </w:rPr>
-        <w:t xml:space="preserve">. Verstappen has a higher coefficient than Bottas in the 2017 to 2020 seasons despite Bottas scoring more Formula 1 points in that time frame, suggesting that </w:t>
-      </w:r>
-      <w:proofErr w:type="gramStart"/>
-      <w:r>
-        <w:rPr>
-          <w:color w:val="auto"/>
-        </w:rPr>
-        <w:t>the Bottas</w:t>
-      </w:r>
-      <w:proofErr w:type="gramEnd"/>
-      <w:r>
-        <w:rPr>
-          <w:color w:val="auto"/>
-        </w:rPr>
-        <w:t>’ performance was booster by the strength of the Mercedes</w:t>
-      </w:r>
-      <w:r>
-        <w:rPr>
+          <w:rFonts w:ascii="Arial" w:hAnsi="Arial" w:cs="Arial"/>
+          <w:color w:val="auto"/>
+        </w:rPr>
+        <w:t xml:space="preserve"> Max Verstappen, Valtreri Bottas, Lewis Hamilton LOESS-Blended Coefficients/Rating</w:t>
+      </w:r>
+      <w:r>
+        <w:rPr>
+          <w:rFonts w:ascii="Arial" w:hAnsi="Arial" w:cs="Arial"/>
+          <w:color w:val="auto"/>
+        </w:rPr>
+        <w:t>. Verstappen has a higher coefficient than Bottas in the 2017 to 2020 seasons despite Bottas scoring more Formula 1 points in that time frame, suggesting that the Bottas’ performance was booster by the strength of the Mercedes</w:t>
+      </w:r>
+      <w:r>
+        <w:rPr>
+          <w:rFonts w:ascii="Arial" w:hAnsi="Arial" w:cs="Arial"/>
           <w:color w:val="auto"/>
         </w:rPr>
         <w:t>.</w:t>
       </w:r>
       <w:r>
         <w:rPr>
+          <w:rFonts w:ascii="Arial" w:hAnsi="Arial" w:cs="Arial"/>
           <w:color w:val="auto"/>
         </w:rPr>
         <w:t xml:space="preserve"> </w:t>
       </w:r>
       <w:r>
         <w:rPr>
+          <w:rFonts w:ascii="Arial" w:hAnsi="Arial" w:cs="Arial"/>
           <w:color w:val="auto"/>
         </w:rPr>
         <w:t>Shaded area represents a 95% confidence interval.</w:t>
@@ -9634,6 +9452,7 @@
       </w:pPr>
       <w:bookmarkStart w:id="15" w:name="_Toc172717671"/>
       <w:r>
+        <w:lastRenderedPageBreak/>
         <w:t>Discussion</w:t>
       </w:r>
       <w:bookmarkEnd w:id="15"/>
@@ -9670,20 +9489,11 @@
         <w:t xml:space="preserve">along with </w:t>
       </w:r>
       <w:r>
-        <w:t xml:space="preserve">model metrics for qualification and logistic regression models, highlights the significant impact of constructors on driver finishing positions. The </w:t>
-      </w:r>
-      <w:r>
-        <w:lastRenderedPageBreak/>
-        <w:t>logistic model</w:t>
-      </w:r>
-      <w:proofErr w:type="gramStart"/>
-      <w:r>
-        <w:t xml:space="preserve">, in particular, </w:t>
+        <w:t xml:space="preserve">model metrics for qualification and logistic regression models, highlights the significant impact of constructors on driver finishing positions. The logistic model, in particular, </w:t>
       </w:r>
       <w:r>
         <w:t>highlights</w:t>
       </w:r>
-      <w:proofErr w:type="gramEnd"/>
       <w:r>
         <w:t xml:space="preserve"> the crucial role of constructors in determining cohort placements. Conversely, the qualification models emphasize the relative importance of drivers, suggesting potential value in incorporating qualification-informed models.</w:t>
       </w:r>
@@ -9777,19 +9587,92 @@
     <w:p/>
     <w:p>
       <w:pPr>
+        <w:pStyle w:val="Caption"/>
+        <w:jc w:val="center"/>
+        <w:rPr>
+          <w:rFonts w:ascii="Arial" w:hAnsi="Arial" w:cs="Arial"/>
+          <w:color w:val="auto"/>
+        </w:rPr>
+      </w:pPr>
+      <w:r>
+        <w:rPr>
+          <w:rFonts w:ascii="Arial" w:hAnsi="Arial" w:cs="Arial"/>
+          <w:color w:val="auto"/>
+        </w:rPr>
+        <w:t xml:space="preserve">Table </w:t>
+      </w:r>
+      <w:r>
+        <w:rPr>
+          <w:rFonts w:ascii="Arial" w:hAnsi="Arial" w:cs="Arial"/>
+          <w:color w:val="auto"/>
+        </w:rPr>
+        <w:fldChar w:fldCharType="begin"/>
+      </w:r>
+      <w:r>
+        <w:rPr>
+          <w:rFonts w:ascii="Arial" w:hAnsi="Arial" w:cs="Arial"/>
+          <w:color w:val="auto"/>
+        </w:rPr>
+        <w:instrText xml:space="preserve"> SEQ Table \* ARABIC </w:instrText>
+      </w:r>
+      <w:r>
+        <w:rPr>
+          <w:rFonts w:ascii="Arial" w:hAnsi="Arial" w:cs="Arial"/>
+          <w:color w:val="auto"/>
+        </w:rPr>
+        <w:fldChar w:fldCharType="separate"/>
+      </w:r>
+      <w:r>
+        <w:rPr>
+          <w:rFonts w:ascii="Arial" w:hAnsi="Arial" w:cs="Arial"/>
+          <w:noProof/>
+          <w:color w:val="auto"/>
+        </w:rPr>
+        <w:t>3</w:t>
+      </w:r>
+      <w:r>
+        <w:rPr>
+          <w:rFonts w:ascii="Arial" w:hAnsi="Arial" w:cs="Arial"/>
+          <w:color w:val="auto"/>
+        </w:rPr>
+        <w:fldChar w:fldCharType="end"/>
+      </w:r>
+      <w:r>
+        <w:rPr>
+          <w:rFonts w:ascii="Arial" w:hAnsi="Arial" w:cs="Arial"/>
+          <w:color w:val="auto"/>
+        </w:rPr>
+        <w:t xml:space="preserve">: </w:t>
+      </w:r>
+      <w:r>
+        <w:rPr>
+          <w:rFonts w:ascii="Arial" w:hAnsi="Arial" w:cs="Arial"/>
+          <w:color w:val="auto"/>
+        </w:rPr>
+        <w:t>Top 10 Constructor/Driver composite rankings as of the end of the 2023 F1 Season. Composite ranking is defined as driver rating plus constructor rating. ± values represent a 95% confidence interval. Driver and constructor independence is assumed for the overall confidence interval</w:t>
+      </w:r>
+    </w:p>
+    <w:p>
+      <w:pPr>
+        <w:pStyle w:val="Caption"/>
         <w:keepNext/>
         <w:jc w:val="center"/>
       </w:pPr>
+    </w:p>
+    <w:p>
+      <w:pPr>
+        <w:keepNext/>
+        <w:jc w:val="center"/>
+      </w:pPr>
       <w:r>
         <w:rPr>
           <w:noProof/>
         </w:rPr>
-        <w:lastRenderedPageBreak/>
         <w:drawing>
-          <wp:inline distT="0" distB="0" distL="0" distR="0" wp14:anchorId="2E41A168" wp14:editId="51A635FA">
-            <wp:extent cx="5943600" cy="5668010"/>
-            <wp:effectExtent l="0" t="0" r="0" b="8890"/>
-            <wp:docPr id="1506329886" name="Picture 3" descr="A screenshot of a computer screen&#10;&#10;Description automatically generated"/>
+          <wp:inline distT="0" distB="0" distL="0" distR="0" wp14:anchorId="2E41A168" wp14:editId="39E3E6A7">
+            <wp:extent cx="5943600" cy="5754930"/>
+            <wp:effectExtent l="0" t="0" r="0" b="0"/>
+            <wp:docPr id="1506329886" name="Picture 3"/>
             <wp:cNvGraphicFramePr>
               <a:graphicFrameLocks xmlns:a="http://schemas.openxmlformats.org/drawingml/2006/main" noChangeAspect="1"/>
             </wp:cNvGraphicFramePr>
@@ -9797,28 +9680,26 @@
               <a:graphicData uri="http://schemas.openxmlformats.org/drawingml/2006/picture">
                 <pic:pic xmlns:pic="http://schemas.openxmlformats.org/drawingml/2006/picture">
                   <pic:nvPicPr>
-                    <pic:cNvPr id="1506329886" name="Picture 3" descr="A screenshot of a computer screen&#10;&#10;Description automatically generated"/>
+                    <pic:cNvPr id="1506329886" name="Picture 3"/>
                     <pic:cNvPicPr>
                       <a:picLocks noChangeAspect="1" noChangeArrowheads="1"/>
                     </pic:cNvPicPr>
                   </pic:nvPicPr>
-                  <pic:blipFill>
-                    <a:blip r:embed="rId23">
+                  <pic:blipFill rotWithShape="1">
+                    <a:blip r:embed="rId22" cstate="print">
                       <a:extLst>
                         <a:ext uri="{28A0092B-C50C-407E-A947-70E740481C1C}">
                           <a14:useLocalDpi xmlns:a14="http://schemas.microsoft.com/office/drawing/2010/main" val="0"/>
                         </a:ext>
                       </a:extLst>
                     </a:blip>
-                    <a:srcRect/>
-                    <a:stretch>
-                      <a:fillRect/>
-                    </a:stretch>
+                    <a:srcRect l="17524" r="17511"/>
+                    <a:stretch/>
                   </pic:blipFill>
                   <pic:spPr bwMode="auto">
                     <a:xfrm>
                       <a:off x="0" y="0"/>
-                      <a:ext cx="5943600" cy="5668010"/>
+                      <a:ext cx="5943600" cy="5754930"/>
                     </a:xfrm>
                     <a:prstGeom prst="rect">
                       <a:avLst/>
@@ -9827,6 +9708,11 @@
                     <a:ln>
                       <a:noFill/>
                     </a:ln>
+                    <a:extLst>
+                      <a:ext uri="{53640926-AAD7-44D8-BBD7-CCE9431645EC}">
+                        <a14:shadowObscured xmlns:a14="http://schemas.microsoft.com/office/drawing/2010/main"/>
+                      </a:ext>
+                    </a:extLst>
                   </pic:spPr>
                 </pic:pic>
               </a:graphicData>
@@ -9836,112 +9722,20 @@
       </w:r>
     </w:p>
     <w:p>
-      <w:pPr>
-        <w:pStyle w:val="Caption"/>
-        <w:jc w:val="center"/>
-        <w:rPr>
-          <w:color w:val="auto"/>
-        </w:rPr>
-      </w:pPr>
-      <w:r>
-        <w:rPr>
-          <w:color w:val="auto"/>
-        </w:rPr>
-        <w:t xml:space="preserve">Figure </w:t>
-      </w:r>
-      <w:r>
-        <w:rPr>
-          <w:color w:val="auto"/>
-        </w:rPr>
-        <w:fldChar w:fldCharType="begin"/>
-      </w:r>
-      <w:r>
-        <w:rPr>
-          <w:color w:val="auto"/>
-        </w:rPr>
-        <w:instrText xml:space="preserve"> SEQ Figure \* ARABIC </w:instrText>
-      </w:r>
-      <w:r>
-        <w:rPr>
-          <w:color w:val="auto"/>
-        </w:rPr>
-        <w:fldChar w:fldCharType="separate"/>
-      </w:r>
-      <w:r>
-        <w:rPr>
-          <w:noProof/>
-          <w:color w:val="auto"/>
-        </w:rPr>
-        <w:t>10</w:t>
-      </w:r>
-      <w:r>
-        <w:rPr>
-          <w:color w:val="auto"/>
-        </w:rPr>
-        <w:fldChar w:fldCharType="end"/>
-      </w:r>
-      <w:r>
-        <w:rPr>
-          <w:color w:val="auto"/>
-        </w:rPr>
-        <w:t>:</w:t>
-      </w:r>
-      <w:r>
-        <w:rPr>
-          <w:color w:val="auto"/>
-        </w:rPr>
-        <w:t xml:space="preserve"> Top 10 Constructor/Driver composite rankings as of the end of the 2023 F1 Season</w:t>
-      </w:r>
-      <w:r>
-        <w:rPr>
-          <w:color w:val="auto"/>
-        </w:rPr>
-        <w:t xml:space="preserve">. Composite ranking is defined as driver rating plus constructor rating. </w:t>
-      </w:r>
-      <w:r>
-        <w:rPr>
-          <w:color w:val="auto"/>
-        </w:rPr>
-        <w:t>±</w:t>
-      </w:r>
-      <w:r>
-        <w:rPr>
-          <w:color w:val="auto"/>
-        </w:rPr>
-        <w:t xml:space="preserve"> values represent a 95% confidence interval. Driver and constructor independence is assumed for the overall confidence interval</w:t>
-      </w:r>
-    </w:p>
-    <w:p>
-      <w:pPr>
-        <w:jc w:val="center"/>
-      </w:pPr>
+      <w:r>
+        <w:t xml:space="preserve">As mentioned in the </w:t>
+      </w:r>
+      <w:r>
+        <w:t xml:space="preserve">Results section, the main applicability of the model is to discern driver impact amongst drivers on different teams. </w:t>
+      </w:r>
+      <w:r>
+        <w:t>Additionally,</w:t>
+      </w:r>
       <w:r>
         <w:t xml:space="preserve"> </w:t>
       </w:r>
-    </w:p>
-    <w:p>
-      <w:r>
-        <w:t xml:space="preserve">As mentioned in the </w:t>
-      </w:r>
-      <w:r>
-        <w:t xml:space="preserve">Results section, the main applicability of the model is to discern driver impact amongst drivers on different teams. </w:t>
-      </w:r>
-      <w:r>
-        <w:t>Additionally,</w:t>
-      </w:r>
-      <w:r>
-        <w:t xml:space="preserve"> </w:t>
-      </w:r>
-      <w:r>
-        <w:t xml:space="preserve">we </w:t>
-      </w:r>
-      <w:proofErr w:type="gramStart"/>
-      <w:r>
-        <w:t>are able to</w:t>
-      </w:r>
-      <w:proofErr w:type="gramEnd"/>
-      <w:r>
-        <w:t xml:space="preserve"> capture point-time ratings for constructor/driver combinations </w:t>
+      <w:r>
+        <w:t xml:space="preserve">we are able to capture point-time ratings for constructor/driver combinations </w:t>
       </w:r>
       <w:r>
         <w:t xml:space="preserve">to predict race outcomes as highlighted in the table above. </w:t>
@@ -9949,11 +9743,11 @@
     </w:p>
     <w:p>
       <w:r>
-        <w:t xml:space="preserve">In conclusion, this study provides a nuanced understanding of the respective impacts of drivers and constructors on Formula 1 race outcomes. By leveraging a robust ridge regression model with LOESS smoothing and assessing predictive performance through Kendall’s coefficient, we offer valuable insights into inter-constructor driver comparisons and the overall influence of constructors. The findings underscore the substantial role of constructors in determining race results, particularly in the context of </w:t>
+        <w:t xml:space="preserve">In conclusion, this study provides a nuanced understanding of the respective impacts of drivers and constructors on Formula 1 race outcomes. By leveraging a robust ridge regression model with LOESS smoothing and assessing predictive performance through Kendall’s coefficient, we offer valuable insights into inter-constructor driver comparisons and the overall influence of constructors. The findings underscore the substantial role of constructors in determining race results, particularly in the context of modern Formula 1. The proposed methodology and findings pave the way for future research that can refine and extend these models, incorporating additional features and expanding to different eras in the </w:t>
       </w:r>
       <w:r>
         <w:lastRenderedPageBreak/>
-        <w:t>modern Formula 1. The proposed methodology and findings pave the way for future research that can refine and extend these models, incorporating additional features and expanding to different eras in the sport. Such advancements hold promise for enhancing both predictive accuracy and practical applications, such as sports betting and strategic decision-making within Formula 1 teams.</w:t>
+        <w:t>sport. Such advancements hold promise for enhancing both predictive accuracy and practical applications, such as sports betting and strategic decision-making within Formula 1 teams.</w:t>
       </w:r>
     </w:p>
     <w:p/>
@@ -10004,13 +9798,8 @@
       </w:r>
     </w:p>
     <w:p>
-      <w:proofErr w:type="spellStart"/>
-      <w:r>
-        <w:t>Croiseau</w:t>
-      </w:r>
-      <w:proofErr w:type="spellEnd"/>
-      <w:r>
-        <w:t>, P. and Cordell, H.J., 2009, December. Analysis of North American Rheumatoid Arthritis Consortium data using a penalized logistic regression approach. In BMC proceedings (Vol. 3, pp. 1-5). BioMed Central.</w:t>
+      <w:r>
+        <w:t>Croiseau, P. and Cordell, H.J., 2009, December. Analysis of North American Rheumatoid Arthritis Consortium data using a penalized logistic regression approach. In BMC proceedings (Vol. 3, pp. 1-5). BioMed Central.</w:t>
       </w:r>
     </w:p>
     <w:p>
@@ -10019,21 +9808,8 @@
       </w:r>
     </w:p>
     <w:p>
-      <w:proofErr w:type="spellStart"/>
-      <w:r>
-        <w:t>Ergast</w:t>
-      </w:r>
-      <w:proofErr w:type="spellEnd"/>
-      <w:r>
-        <w:t xml:space="preserve">. (n.d.). </w:t>
-      </w:r>
-      <w:proofErr w:type="spellStart"/>
-      <w:r>
-        <w:t>Ergast</w:t>
-      </w:r>
-      <w:proofErr w:type="spellEnd"/>
-      <w:r>
-        <w:t xml:space="preserve"> Developer API. Available at: https://ergast.com/mrd/methods/sprint/ (Accessed: 17 July 2024).</w:t>
+      <w:r>
+        <w:t>Ergast. (n.d.). Ergast Developer API. Available at: https://ergast.com/mrd/methods/sprint/ (Accessed: 17 July 2024).</w:t>
       </w:r>
     </w:p>
     <w:p>
@@ -10048,15 +9824,7 @@
     </w:p>
     <w:p>
       <w:r>
-        <w:t xml:space="preserve">Fry, J., Brighton, T. and </w:t>
-      </w:r>
-      <w:proofErr w:type="spellStart"/>
-      <w:r>
-        <w:t>Fanzon</w:t>
-      </w:r>
-      <w:proofErr w:type="spellEnd"/>
-      <w:r>
-        <w:t>, S. (2024) Faster identification of faster Formula 1 drivers via time-rank duality. Economics Letters, 237, p.111671.</w:t>
+        <w:t>Fry, J., Brighton, T. and Fanzon, S. (2024) Faster identification of faster Formula 1 drivers via time-rank duality. Economics Letters, 237, p.111671.</w:t>
       </w:r>
     </w:p>
     <w:p>
@@ -10071,25 +9839,12 @@
     </w:p>
     <w:p>
       <w:r>
-        <w:t xml:space="preserve">Jacoby, W.G., 2000. </w:t>
-      </w:r>
-      <w:proofErr w:type="gramStart"/>
-      <w:r>
-        <w:t>Loess::</w:t>
-      </w:r>
-      <w:proofErr w:type="gramEnd"/>
-      <w:r>
-        <w:t xml:space="preserve"> a nonparametric, graphical tool for depicting relationships between variables. Electoral studies, 19(4), pp.577-613.</w:t>
-      </w:r>
-    </w:p>
-    <w:p>
-      <w:proofErr w:type="spellStart"/>
-      <w:r>
-        <w:t>Medvedovsky</w:t>
-      </w:r>
-      <w:proofErr w:type="spellEnd"/>
-      <w:r>
-        <w:t>, K. and Patton, A. (2022) Daily adjusted and regressed Kalman optimized projections| DARKO. Accessed on, 17.</w:t>
+        <w:t>Jacoby, W.G., 2000. Loess:: a nonparametric, graphical tool for depicting relationships between variables. Electoral studies, 19(4), pp.577-613.</w:t>
+      </w:r>
+    </w:p>
+    <w:p>
+      <w:r>
+        <w:t>Medvedovsky, K. and Patton, A. (2022) Daily adjusted and regressed Kalman optimized projections| DARKO. Accessed on, 17.</w:t>
       </w:r>
     </w:p>
     <w:p>
@@ -10104,21 +9859,8 @@
       </w:r>
     </w:p>
     <w:p>
-      <w:proofErr w:type="spellStart"/>
-      <w:r>
-        <w:t>Rockerbie</w:t>
-      </w:r>
-      <w:proofErr w:type="spellEnd"/>
-      <w:r>
-        <w:t xml:space="preserve">, D. W. and Easton, S. T. (2022) ‘Race to the podium: separating and conjoining the car and driver in F1 racing’, Applied Economics, 54(54), pp. 6272–6285. </w:t>
-      </w:r>
-      <w:proofErr w:type="spellStart"/>
-      <w:r>
-        <w:t>doi</w:t>
-      </w:r>
-      <w:proofErr w:type="spellEnd"/>
-      <w:r>
-        <w:t>: 10.1080/00036846.2022.2083068.</w:t>
+      <w:r>
+        <w:t>Rockerbie, D. W. and Easton, S. T. (2022) ‘Race to the podium: separating and conjoining the car and driver in F1 racing’, Applied Economics, 54(54), pp. 6272–6285. doi: 10.1080/00036846.2022.2083068.</w:t>
       </w:r>
     </w:p>
     <w:p>
@@ -10131,7 +9873,6 @@
         <w:t>Spurgeon, B. (2009) Age Old Question of Whether it is the Car or the Driver that Counts. Formula 1, 101.</w:t>
       </w:r>
     </w:p>
-    <w:p/>
     <w:p>
       <w:pPr>
         <w:rPr>
@@ -10140,17 +9881,9 @@
         </w:rPr>
       </w:pPr>
       <w:r>
-        <w:t xml:space="preserve">van </w:t>
-      </w:r>
-      <w:proofErr w:type="spellStart"/>
-      <w:r>
-        <w:t>Kesteren</w:t>
-      </w:r>
-      <w:proofErr w:type="spellEnd"/>
-      <w:r>
-        <w:t xml:space="preserve">, E. and Bergkamp, T. (2023) Bayesian analysis of Formula One race results: disentangling driver skill and constructor advantage. Journal of Quantitative Analysis in Sports, Vol. 19 (Issue 4), pp. 273-293. </w:t>
-      </w:r>
-      <w:hyperlink r:id="rId24" w:history="1">
+        <w:t xml:space="preserve">van Kesteren, E. and Bergkamp, T. (2023) Bayesian analysis of Formula One race results: disentangling driver skill and constructor advantage. Journal of Quantitative Analysis in Sports, Vol. 19 (Issue 4), pp. 273-293. </w:t>
+      </w:r>
+      <w:hyperlink r:id="rId23" w:history="1">
         <w:r>
           <w:rPr>
             <w:rStyle w:val="Hyperlink"/>
@@ -10195,18 +9928,79 @@
     </w:p>
     <w:p>
       <w:pPr>
+        <w:pStyle w:val="Caption"/>
         <w:keepNext/>
         <w:jc w:val="center"/>
-      </w:pPr>
-      <w:r>
-        <w:rPr>
+        <w:rPr>
+          <w:rFonts w:ascii="Arial" w:hAnsi="Arial" w:cs="Arial"/>
+          <w:color w:val="auto"/>
+        </w:rPr>
+      </w:pPr>
+      <w:r>
+        <w:rPr>
+          <w:rFonts w:ascii="Arial" w:hAnsi="Arial" w:cs="Arial"/>
+          <w:color w:val="auto"/>
+        </w:rPr>
+        <w:t xml:space="preserve">Table </w:t>
+      </w:r>
+      <w:r>
+        <w:rPr>
+          <w:rFonts w:ascii="Arial" w:hAnsi="Arial" w:cs="Arial"/>
+          <w:color w:val="auto"/>
+        </w:rPr>
+        <w:fldChar w:fldCharType="begin"/>
+      </w:r>
+      <w:r>
+        <w:rPr>
+          <w:rFonts w:ascii="Arial" w:hAnsi="Arial" w:cs="Arial"/>
+          <w:color w:val="auto"/>
+        </w:rPr>
+        <w:instrText xml:space="preserve"> SEQ Table \* ARABIC </w:instrText>
+      </w:r>
+      <w:r>
+        <w:rPr>
+          <w:rFonts w:ascii="Arial" w:hAnsi="Arial" w:cs="Arial"/>
+          <w:color w:val="auto"/>
+        </w:rPr>
+        <w:fldChar w:fldCharType="separate"/>
+      </w:r>
+      <w:r>
+        <w:rPr>
+          <w:rFonts w:ascii="Arial" w:hAnsi="Arial" w:cs="Arial"/>
           <w:noProof/>
+          <w:color w:val="auto"/>
+        </w:rPr>
+        <w:t>4</w:t>
+      </w:r>
+      <w:r>
+        <w:rPr>
+          <w:rFonts w:ascii="Arial" w:hAnsi="Arial" w:cs="Arial"/>
+          <w:color w:val="auto"/>
+        </w:rPr>
+        <w:fldChar w:fldCharType="end"/>
+      </w:r>
+      <w:r>
+        <w:rPr>
+          <w:rFonts w:ascii="Arial" w:hAnsi="Arial" w:cs="Arial"/>
+          <w:color w:val="auto"/>
+        </w:rPr>
+        <w:t>: Mean Absolute Error (MAE) by Driver Type. Driver predictions in seasons after they have switched teams are less robust than predictions when the team has stayed the same.</w:t>
+      </w:r>
+    </w:p>
+    <w:p>
+      <w:pPr>
+        <w:keepNext/>
+        <w:jc w:val="center"/>
+      </w:pPr>
+      <w:r>
+        <w:rPr>
+          <w:noProof/>
         </w:rPr>
         <w:drawing>
-          <wp:inline distT="0" distB="0" distL="0" distR="0" wp14:anchorId="4DBD23A4" wp14:editId="5FBDF79E">
-            <wp:extent cx="3200400" cy="1444967"/>
-            <wp:effectExtent l="0" t="0" r="0" b="3175"/>
-            <wp:docPr id="111138984" name="Picture 22" descr="A screenshot of a computer&#10;&#10;Description automatically generated"/>
+          <wp:inline distT="0" distB="0" distL="0" distR="0" wp14:anchorId="4DBD23A4" wp14:editId="660CFFEC">
+            <wp:extent cx="2971800" cy="1626250"/>
+            <wp:effectExtent l="0" t="0" r="0" b="0"/>
+            <wp:docPr id="111138984" name="Picture 22"/>
             <wp:cNvGraphicFramePr>
               <a:graphicFrameLocks xmlns:a="http://schemas.openxmlformats.org/drawingml/2006/main" noChangeAspect="1"/>
             </wp:cNvGraphicFramePr>
@@ -10214,28 +10008,26 @@
               <a:graphicData uri="http://schemas.openxmlformats.org/drawingml/2006/picture">
                 <pic:pic xmlns:pic="http://schemas.openxmlformats.org/drawingml/2006/picture">
                   <pic:nvPicPr>
-                    <pic:cNvPr id="111138984" name="Picture 22" descr="A screenshot of a computer&#10;&#10;Description automatically generated"/>
+                    <pic:cNvPr id="111138984" name="Picture 22"/>
                     <pic:cNvPicPr>
                       <a:picLocks noChangeAspect="1" noChangeArrowheads="1"/>
                     </pic:cNvPicPr>
                   </pic:nvPicPr>
-                  <pic:blipFill>
-                    <a:blip r:embed="rId25" cstate="print">
+                  <pic:blipFill rotWithShape="1">
+                    <a:blip r:embed="rId24" cstate="print">
                       <a:extLst>
                         <a:ext uri="{28A0092B-C50C-407E-A947-70E740481C1C}">
                           <a14:useLocalDpi xmlns:a14="http://schemas.microsoft.com/office/drawing/2010/main" val="0"/>
                         </a:ext>
                       </a:extLst>
                     </a:blip>
-                    <a:srcRect/>
-                    <a:stretch>
-                      <a:fillRect/>
-                    </a:stretch>
+                    <a:srcRect l="30172" r="30407"/>
+                    <a:stretch/>
                   </pic:blipFill>
                   <pic:spPr bwMode="auto">
                     <a:xfrm>
                       <a:off x="0" y="0"/>
-                      <a:ext cx="3200400" cy="1444967"/>
+                      <a:ext cx="2971800" cy="1626250"/>
                     </a:xfrm>
                     <a:prstGeom prst="rect">
                       <a:avLst/>
@@ -10244,6 +10036,11 @@
                     <a:ln>
                       <a:noFill/>
                     </a:ln>
+                    <a:extLst>
+                      <a:ext uri="{53640926-AAD7-44D8-BBD7-CCE9431645EC}">
+                        <a14:shadowObscured xmlns:a14="http://schemas.microsoft.com/office/drawing/2010/main"/>
+                      </a:ext>
+                    </a:extLst>
                   </pic:spPr>
                 </pic:pic>
               </a:graphicData>
@@ -10253,77 +10050,14 @@
       </w:r>
     </w:p>
     <w:p>
-      <w:pPr>
-        <w:pStyle w:val="Caption"/>
-        <w:jc w:val="center"/>
-        <w:rPr>
-          <w:color w:val="auto"/>
-        </w:rPr>
-      </w:pPr>
-      <w:r>
-        <w:rPr>
-          <w:color w:val="auto"/>
-        </w:rPr>
-        <w:t xml:space="preserve">Figure </w:t>
-      </w:r>
-      <w:r>
-        <w:rPr>
-          <w:color w:val="auto"/>
-        </w:rPr>
-        <w:fldChar w:fldCharType="begin"/>
-      </w:r>
-      <w:r>
-        <w:rPr>
-          <w:color w:val="auto"/>
-        </w:rPr>
-        <w:instrText xml:space="preserve"> SEQ Figure \* ARABIC </w:instrText>
-      </w:r>
-      <w:r>
-        <w:rPr>
-          <w:color w:val="auto"/>
-        </w:rPr>
-        <w:fldChar w:fldCharType="separate"/>
-      </w:r>
-      <w:r>
-        <w:rPr>
-          <w:noProof/>
-          <w:color w:val="auto"/>
-        </w:rPr>
-        <w:t>11</w:t>
-      </w:r>
-      <w:r>
-        <w:rPr>
-          <w:color w:val="auto"/>
-        </w:rPr>
-        <w:fldChar w:fldCharType="end"/>
-      </w:r>
-      <w:r>
-        <w:rPr>
-          <w:color w:val="auto"/>
-        </w:rPr>
-        <w:t>: Mean Absolute Error (MAE) by Driver Type</w:t>
-      </w:r>
-      <w:r>
-        <w:rPr>
-          <w:color w:val="auto"/>
-        </w:rPr>
-        <w:t>. Driver predictions in seasons after they have switched teams are less robust than predictions when the team has stayed the same.</w:t>
-      </w:r>
-    </w:p>
-    <w:p>
       <w:r>
         <w:t xml:space="preserve">When stratifying </w:t>
       </w:r>
       <w:r>
         <w:t xml:space="preserve">driver-seasons by whether </w:t>
       </w:r>
-      <w:proofErr w:type="spellStart"/>
-      <w:r>
-        <w:t>the</w:t>
-      </w:r>
-      <w:proofErr w:type="spellEnd"/>
-      <w:r>
-        <w:t xml:space="preserve"> are</w:t>
+      <w:r>
+        <w:t>the are</w:t>
       </w:r>
       <w:r>
         <w:t xml:space="preserve"> a new driver</w:t>
@@ -10344,15 +10078,7 @@
         <w:t>better than the other categories.</w:t>
       </w:r>
       <w:r>
-        <w:t xml:space="preserve"> The lower error amongst that cohort can potentially by explained by the nature of the </w:t>
-      </w:r>
-      <w:proofErr w:type="gramStart"/>
-      <w:r>
-        <w:t>constructors</w:t>
-      </w:r>
-      <w:proofErr w:type="gramEnd"/>
-      <w:r>
-        <w:t xml:space="preserve"> new drivers go to. New drivers are </w:t>
+        <w:t xml:space="preserve"> The lower error amongst that cohort can potentially by explained by the nature of the constructors new drivers go to. New drivers are </w:t>
       </w:r>
       <w:r>
         <w:t xml:space="preserve">often going to </w:t>
@@ -10424,10 +10150,10 @@
           <w:noProof/>
         </w:rPr>
         <w:drawing>
-          <wp:inline distT="0" distB="0" distL="0" distR="0" wp14:anchorId="636BB93A" wp14:editId="5298EDED">
-            <wp:extent cx="3657600" cy="2484902"/>
+          <wp:inline distT="0" distB="0" distL="0" distR="0" wp14:anchorId="636BB93A" wp14:editId="23294AFE">
+            <wp:extent cx="3391367" cy="2484902"/>
             <wp:effectExtent l="0" t="0" r="0" b="0"/>
-            <wp:docPr id="16" name="Picture 15" descr="A screenshot of a formula one race car&#10;&#10;Description automatically generated">
+            <wp:docPr id="16" name="Picture 15">
               <a:extLst xmlns:a="http://schemas.openxmlformats.org/drawingml/2006/main">
                 <a:ext uri="{FF2B5EF4-FFF2-40B4-BE49-F238E27FC236}">
                   <a16:creationId xmlns:a16="http://schemas.microsoft.com/office/drawing/2014/main" id="{0D685101-227C-A728-3DD6-A9C867D3761C}"/>
@@ -10441,7 +10167,7 @@
               <a:graphicData uri="http://schemas.openxmlformats.org/drawingml/2006/picture">
                 <pic:pic xmlns:pic="http://schemas.openxmlformats.org/drawingml/2006/picture">
                   <pic:nvPicPr>
-                    <pic:cNvPr id="16" name="Picture 15" descr="A screenshot of a formula one race car&#10;&#10;Description automatically generated">
+                    <pic:cNvPr id="16" name="Picture 15">
                       <a:extLst>
                         <a:ext uri="{FF2B5EF4-FFF2-40B4-BE49-F238E27FC236}">
                           <a16:creationId xmlns:a16="http://schemas.microsoft.com/office/drawing/2014/main" id="{0D685101-227C-A728-3DD6-A9C867D3761C}"/>
@@ -10453,7 +10179,13 @@
                     </pic:cNvPicPr>
                   </pic:nvPicPr>
                   <pic:blipFill>
-                    <a:blip r:embed="rId26"/>
+                    <a:blip r:embed="rId25" cstate="print">
+                      <a:extLst>
+                        <a:ext uri="{28A0092B-C50C-407E-A947-70E740481C1C}">
+                          <a14:useLocalDpi xmlns:a14="http://schemas.microsoft.com/office/drawing/2010/main" val="0"/>
+                        </a:ext>
+                      </a:extLst>
+                    </a:blip>
                     <a:stretch>
                       <a:fillRect/>
                     </a:stretch>
@@ -10461,7 +10193,7 @@
                   <pic:spPr>
                     <a:xfrm>
                       <a:off x="0" y="0"/>
-                      <a:ext cx="3657600" cy="2484902"/>
+                      <a:ext cx="3391367" cy="2484902"/>
                     </a:xfrm>
                     <a:prstGeom prst="rect">
                       <a:avLst/>
@@ -10479,48 +10211,56 @@
         <w:pStyle w:val="Caption"/>
         <w:jc w:val="center"/>
         <w:rPr>
-          <w:color w:val="auto"/>
-        </w:rPr>
-      </w:pPr>
-      <w:r>
-        <w:rPr>
+          <w:rFonts w:ascii="Arial" w:hAnsi="Arial" w:cs="Arial"/>
+          <w:color w:val="auto"/>
+        </w:rPr>
+      </w:pPr>
+      <w:r>
+        <w:rPr>
+          <w:rFonts w:ascii="Arial" w:hAnsi="Arial" w:cs="Arial"/>
           <w:color w:val="auto"/>
         </w:rPr>
         <w:t xml:space="preserve">Figure </w:t>
       </w:r>
       <w:r>
         <w:rPr>
+          <w:rFonts w:ascii="Arial" w:hAnsi="Arial" w:cs="Arial"/>
           <w:color w:val="auto"/>
         </w:rPr>
         <w:fldChar w:fldCharType="begin"/>
       </w:r>
       <w:r>
         <w:rPr>
+          <w:rFonts w:ascii="Arial" w:hAnsi="Arial" w:cs="Arial"/>
           <w:color w:val="auto"/>
         </w:rPr>
         <w:instrText xml:space="preserve"> SEQ Figure \* ARABIC </w:instrText>
       </w:r>
       <w:r>
         <w:rPr>
+          <w:rFonts w:ascii="Arial" w:hAnsi="Arial" w:cs="Arial"/>
           <w:color w:val="auto"/>
         </w:rPr>
         <w:fldChar w:fldCharType="separate"/>
       </w:r>
       <w:r>
         <w:rPr>
+          <w:rFonts w:ascii="Arial" w:hAnsi="Arial" w:cs="Arial"/>
           <w:noProof/>
           <w:color w:val="auto"/>
         </w:rPr>
-        <w:t>12</w:t>
-      </w:r>
-      <w:r>
-        <w:rPr>
+        <w:t>8</w:t>
+      </w:r>
+      <w:r>
+        <w:rPr>
+          <w:rFonts w:ascii="Arial" w:hAnsi="Arial" w:cs="Arial"/>
           <w:color w:val="auto"/>
         </w:rPr>
         <w:fldChar w:fldCharType="end"/>
       </w:r>
       <w:r>
         <w:rPr>
+          <w:rFonts w:ascii="Arial" w:hAnsi="Arial" w:cs="Arial"/>
           <w:color w:val="auto"/>
         </w:rPr>
         <w:t>: Mapping between parent constructors and constructors. Mapping allows coefficient consistency when team names change</w:t>
@@ -10559,18 +10299,79 @@
     <w:p/>
     <w:p>
       <w:pPr>
+        <w:pStyle w:val="Caption"/>
         <w:keepNext/>
         <w:jc w:val="center"/>
-      </w:pPr>
-      <w:r>
-        <w:rPr>
+        <w:rPr>
+          <w:rFonts w:ascii="Arial" w:hAnsi="Arial" w:cs="Arial"/>
+          <w:color w:val="auto"/>
+        </w:rPr>
+      </w:pPr>
+      <w:r>
+        <w:rPr>
+          <w:rFonts w:ascii="Arial" w:hAnsi="Arial" w:cs="Arial"/>
+          <w:color w:val="auto"/>
+        </w:rPr>
+        <w:t xml:space="preserve">Table </w:t>
+      </w:r>
+      <w:r>
+        <w:rPr>
+          <w:rFonts w:ascii="Arial" w:hAnsi="Arial" w:cs="Arial"/>
+          <w:color w:val="auto"/>
+        </w:rPr>
+        <w:fldChar w:fldCharType="begin"/>
+      </w:r>
+      <w:r>
+        <w:rPr>
+          <w:rFonts w:ascii="Arial" w:hAnsi="Arial" w:cs="Arial"/>
+          <w:color w:val="auto"/>
+        </w:rPr>
+        <w:instrText xml:space="preserve"> SEQ Table \* ARABIC </w:instrText>
+      </w:r>
+      <w:r>
+        <w:rPr>
+          <w:rFonts w:ascii="Arial" w:hAnsi="Arial" w:cs="Arial"/>
+          <w:color w:val="auto"/>
+        </w:rPr>
+        <w:fldChar w:fldCharType="separate"/>
+      </w:r>
+      <w:r>
+        <w:rPr>
+          <w:rFonts w:ascii="Arial" w:hAnsi="Arial" w:cs="Arial"/>
           <w:noProof/>
+          <w:color w:val="auto"/>
+        </w:rPr>
+        <w:t>5</w:t>
+      </w:r>
+      <w:r>
+        <w:rPr>
+          <w:rFonts w:ascii="Arial" w:hAnsi="Arial" w:cs="Arial"/>
+          <w:color w:val="auto"/>
+        </w:rPr>
+        <w:fldChar w:fldCharType="end"/>
+      </w:r>
+      <w:r>
+        <w:rPr>
+          <w:rFonts w:ascii="Arial" w:hAnsi="Arial" w:cs="Arial"/>
+          <w:color w:val="auto"/>
+        </w:rPr>
+        <w:t>: Driver/Constructor Composite Rankings as of the 2024 British GP. ± values represent a 95% confidence interval. Driver and constructor independence is assumed for the overall confidence interval</w:t>
+      </w:r>
+    </w:p>
+    <w:p>
+      <w:pPr>
+        <w:keepNext/>
+        <w:jc w:val="center"/>
+      </w:pPr>
+      <w:r>
+        <w:rPr>
+          <w:noProof/>
         </w:rPr>
         <w:drawing>
-          <wp:inline distT="0" distB="0" distL="0" distR="0" wp14:anchorId="6799AD91" wp14:editId="6C500E86">
+          <wp:inline distT="0" distB="0" distL="0" distR="0" wp14:anchorId="6799AD91" wp14:editId="2F82A010">
             <wp:extent cx="5943600" cy="2722245"/>
             <wp:effectExtent l="0" t="0" r="0" b="1905"/>
-            <wp:docPr id="1957599217" name="Picture 7" descr="A screenshot of a computer&#10;&#10;Description automatically generated">
+            <wp:docPr id="1957599217" name="Picture 7">
               <a:extLst xmlns:a="http://schemas.openxmlformats.org/drawingml/2006/main">
                 <a:ext uri="{FF2B5EF4-FFF2-40B4-BE49-F238E27FC236}">
                   <a16:creationId xmlns:a16="http://schemas.microsoft.com/office/drawing/2014/main" id="{F8A3AE88-3B44-E1EF-23FC-F98E505F15DB}"/>
@@ -10584,7 +10385,7 @@
               <a:graphicData uri="http://schemas.openxmlformats.org/drawingml/2006/picture">
                 <pic:pic xmlns:pic="http://schemas.openxmlformats.org/drawingml/2006/picture">
                   <pic:nvPicPr>
-                    <pic:cNvPr id="1957599217" name="Picture 7" descr="A screenshot of a computer&#10;&#10;Description automatically generated">
+                    <pic:cNvPr id="1957599217" name="Picture 7">
                       <a:extLst>
                         <a:ext uri="{FF2B5EF4-FFF2-40B4-BE49-F238E27FC236}">
                           <a16:creationId xmlns:a16="http://schemas.microsoft.com/office/drawing/2014/main" id="{F8A3AE88-3B44-E1EF-23FC-F98E505F15DB}"/>
@@ -10595,10 +10396,18 @@
                       <a:picLocks noChangeAspect="1"/>
                     </pic:cNvPicPr>
                   </pic:nvPicPr>
-                  <pic:blipFill rotWithShape="1">
-                    <a:blip r:embed="rId27"/>
-                    <a:srcRect t="3330"/>
-                    <a:stretch/>
+                  <pic:blipFill>
+                    <a:blip r:embed="rId26" cstate="print">
+                      <a:extLst>
+                        <a:ext uri="{28A0092B-C50C-407E-A947-70E740481C1C}">
+                          <a14:useLocalDpi xmlns:a14="http://schemas.microsoft.com/office/drawing/2010/main" val="0"/>
+                        </a:ext>
+                      </a:extLst>
+                    </a:blip>
+                    <a:srcRect t="463" b="463"/>
+                    <a:stretch>
+                      <a:fillRect/>
+                    </a:stretch>
                   </pic:blipFill>
                   <pic:spPr>
                     <a:xfrm>
@@ -10616,92 +10425,83 @@
         </w:drawing>
       </w:r>
     </w:p>
+    <w:p/>
     <w:p>
       <w:pPr>
         <w:pStyle w:val="Caption"/>
-        <w:jc w:val="center"/>
-        <w:rPr>
-          <w:color w:val="auto"/>
-        </w:rPr>
-      </w:pPr>
-      <w:r>
-        <w:rPr>
-          <w:color w:val="auto"/>
-        </w:rPr>
-        <w:t xml:space="preserve">Figure </w:t>
-      </w:r>
-      <w:r>
-        <w:rPr>
-          <w:color w:val="auto"/>
-        </w:rPr>
-        <w:fldChar w:fldCharType="begin"/>
-      </w:r>
-      <w:r>
-        <w:rPr>
-          <w:color w:val="auto"/>
-        </w:rPr>
-        <w:instrText xml:space="preserve"> SEQ Figure \* ARABIC </w:instrText>
-      </w:r>
-      <w:r>
-        <w:rPr>
-          <w:color w:val="auto"/>
-        </w:rPr>
-        <w:fldChar w:fldCharType="separate"/>
-      </w:r>
-      <w:r>
-        <w:rPr>
-          <w:noProof/>
-          <w:color w:val="auto"/>
-        </w:rPr>
-        <w:t>13</w:t>
-      </w:r>
-      <w:r>
-        <w:rPr>
-          <w:color w:val="auto"/>
-        </w:rPr>
-        <w:fldChar w:fldCharType="end"/>
-      </w:r>
-      <w:r>
-        <w:rPr>
-          <w:color w:val="auto"/>
-        </w:rPr>
-        <w:t>: Driver/Constructor Composite Rankings as of the 2024 British GP</w:t>
-      </w:r>
-      <w:r>
-        <w:rPr>
-          <w:color w:val="auto"/>
-        </w:rPr>
-        <w:t xml:space="preserve">. </w:t>
-      </w:r>
-      <w:r>
-        <w:rPr>
-          <w:color w:val="auto"/>
-        </w:rPr>
-        <w:t>±</w:t>
-      </w:r>
-      <w:r>
-        <w:rPr>
-          <w:color w:val="auto"/>
-        </w:rPr>
-        <w:t xml:space="preserve"> values represent a 95% confidence interval. Driver and constructor independence is assumed for the overall confidence interval</w:t>
-      </w:r>
-    </w:p>
-    <w:p/>
-    <w:p>
-      <w:pPr>
         <w:keepNext/>
         <w:jc w:val="center"/>
-      </w:pPr>
-      <w:r>
-        <w:rPr>
+        <w:rPr>
+          <w:rFonts w:ascii="Arial" w:hAnsi="Arial" w:cs="Arial"/>
+          <w:color w:val="auto"/>
+        </w:rPr>
+      </w:pPr>
+      <w:r>
+        <w:rPr>
+          <w:rFonts w:ascii="Arial" w:hAnsi="Arial" w:cs="Arial"/>
+          <w:color w:val="auto"/>
+        </w:rPr>
+        <w:lastRenderedPageBreak/>
+        <w:t xml:space="preserve">Table </w:t>
+      </w:r>
+      <w:r>
+        <w:rPr>
+          <w:rFonts w:ascii="Arial" w:hAnsi="Arial" w:cs="Arial"/>
+          <w:color w:val="auto"/>
+        </w:rPr>
+        <w:fldChar w:fldCharType="begin"/>
+      </w:r>
+      <w:r>
+        <w:rPr>
+          <w:rFonts w:ascii="Arial" w:hAnsi="Arial" w:cs="Arial"/>
+          <w:color w:val="auto"/>
+        </w:rPr>
+        <w:instrText xml:space="preserve"> SEQ Table \* ARABIC </w:instrText>
+      </w:r>
+      <w:r>
+        <w:rPr>
+          <w:rFonts w:ascii="Arial" w:hAnsi="Arial" w:cs="Arial"/>
+          <w:color w:val="auto"/>
+        </w:rPr>
+        <w:fldChar w:fldCharType="separate"/>
+      </w:r>
+      <w:r>
+        <w:rPr>
+          <w:rFonts w:ascii="Arial" w:hAnsi="Arial" w:cs="Arial"/>
           <w:noProof/>
-        </w:rPr>
-        <w:lastRenderedPageBreak/>
+          <w:color w:val="auto"/>
+        </w:rPr>
+        <w:t>6</w:t>
+      </w:r>
+      <w:r>
+        <w:rPr>
+          <w:rFonts w:ascii="Arial" w:hAnsi="Arial" w:cs="Arial"/>
+          <w:color w:val="auto"/>
+        </w:rPr>
+        <w:fldChar w:fldCharType="end"/>
+      </w:r>
+      <w:r>
+        <w:rPr>
+          <w:rFonts w:ascii="Arial" w:hAnsi="Arial" w:cs="Arial"/>
+          <w:color w:val="auto"/>
+        </w:rPr>
+        <w:t>: Driver Rankings as of the 2024 British GP. ± values represent a 95% confidence interval</w:t>
+      </w:r>
+    </w:p>
+    <w:p>
+      <w:pPr>
+        <w:keepNext/>
+        <w:jc w:val="center"/>
+      </w:pPr>
+      <w:r>
+        <w:rPr>
+          <w:noProof/>
+        </w:rPr>
         <w:drawing>
-          <wp:inline distT="0" distB="0" distL="0" distR="0" wp14:anchorId="2837F3D7" wp14:editId="6A9D5414">
+          <wp:inline distT="0" distB="0" distL="0" distR="0" wp14:anchorId="2837F3D7" wp14:editId="38FAD6EF">
             <wp:extent cx="5943600" cy="4921250"/>
             <wp:effectExtent l="0" t="0" r="0" b="0"/>
-            <wp:docPr id="10" name="Picture 9" descr="A screenshot of a computer screen&#10;&#10;Description automatically generated">
+            <wp:docPr id="10" name="Picture 9">
               <a:extLst xmlns:a="http://schemas.openxmlformats.org/drawingml/2006/main">
                 <a:ext uri="{FF2B5EF4-FFF2-40B4-BE49-F238E27FC236}">
                   <a16:creationId xmlns:a16="http://schemas.microsoft.com/office/drawing/2014/main" id="{7440D112-B4D8-214B-359D-001079311C85}"/>
@@ -10715,7 +10515,7 @@
               <a:graphicData uri="http://schemas.openxmlformats.org/drawingml/2006/picture">
                 <pic:pic xmlns:pic="http://schemas.openxmlformats.org/drawingml/2006/picture">
                   <pic:nvPicPr>
-                    <pic:cNvPr id="10" name="Picture 9" descr="A screenshot of a computer screen&#10;&#10;Description automatically generated">
+                    <pic:cNvPr id="10" name="Picture 9">
                       <a:extLst>
                         <a:ext uri="{FF2B5EF4-FFF2-40B4-BE49-F238E27FC236}">
                           <a16:creationId xmlns:a16="http://schemas.microsoft.com/office/drawing/2014/main" id="{7440D112-B4D8-214B-359D-001079311C85}"/>
@@ -10726,10 +10526,18 @@
                       <a:picLocks noChangeAspect="1"/>
                     </pic:cNvPicPr>
                   </pic:nvPicPr>
-                  <pic:blipFill rotWithShape="1">
-                    <a:blip r:embed="rId28"/>
-                    <a:srcRect t="1322"/>
-                    <a:stretch/>
+                  <pic:blipFill>
+                    <a:blip r:embed="rId27" cstate="print">
+                      <a:extLst>
+                        <a:ext uri="{28A0092B-C50C-407E-A947-70E740481C1C}">
+                          <a14:useLocalDpi xmlns:a14="http://schemas.microsoft.com/office/drawing/2010/main" val="0"/>
+                        </a:ext>
+                      </a:extLst>
+                    </a:blip>
+                    <a:srcRect l="12011" r="12011"/>
+                    <a:stretch>
+                      <a:fillRect/>
+                    </a:stretch>
                   </pic:blipFill>
                   <pic:spPr>
                     <a:xfrm>
@@ -10747,94 +10555,84 @@
         </w:drawing>
       </w:r>
     </w:p>
-    <w:p>
-      <w:pPr>
-        <w:pStyle w:val="Caption"/>
-        <w:jc w:val="center"/>
-        <w:rPr>
-          <w:color w:val="auto"/>
-        </w:rPr>
-      </w:pPr>
-      <w:r>
-        <w:rPr>
-          <w:color w:val="auto"/>
-        </w:rPr>
-        <w:t xml:space="preserve">Figure </w:t>
-      </w:r>
-      <w:r>
-        <w:rPr>
-          <w:color w:val="auto"/>
-        </w:rPr>
-        <w:fldChar w:fldCharType="begin"/>
-      </w:r>
-      <w:r>
-        <w:rPr>
-          <w:color w:val="auto"/>
-        </w:rPr>
-        <w:instrText xml:space="preserve"> SEQ Figure \* ARABIC </w:instrText>
-      </w:r>
-      <w:r>
-        <w:rPr>
-          <w:color w:val="auto"/>
-        </w:rPr>
-        <w:fldChar w:fldCharType="separate"/>
-      </w:r>
-      <w:r>
-        <w:rPr>
-          <w:noProof/>
-          <w:color w:val="auto"/>
-        </w:rPr>
-        <w:t>14</w:t>
-      </w:r>
-      <w:r>
-        <w:rPr>
-          <w:color w:val="auto"/>
-        </w:rPr>
-        <w:fldChar w:fldCharType="end"/>
-      </w:r>
-      <w:r>
-        <w:rPr>
-          <w:color w:val="auto"/>
-        </w:rPr>
-        <w:t>: Driver Rankings as of the 2024 British GP</w:t>
-      </w:r>
-      <w:r>
-        <w:rPr>
-          <w:color w:val="auto"/>
-        </w:rPr>
-        <w:t xml:space="preserve">. </w:t>
-      </w:r>
-      <w:r>
-        <w:rPr>
-          <w:color w:val="auto"/>
-        </w:rPr>
-        <w:t>±</w:t>
-      </w:r>
-      <w:r>
-        <w:rPr>
-          <w:color w:val="auto"/>
-        </w:rPr>
-        <w:t xml:space="preserve"> values represent a 95% confidence interval</w:t>
-      </w:r>
-    </w:p>
     <w:p/>
     <w:p/>
-    <w:p/>
-    <w:p>
-      <w:pPr>
+    <w:p>
+      <w:pPr>
+        <w:pStyle w:val="Caption"/>
         <w:keepNext/>
         <w:jc w:val="center"/>
-      </w:pPr>
-      <w:r>
-        <w:rPr>
+        <w:rPr>
+          <w:rFonts w:ascii="Arial" w:hAnsi="Arial" w:cs="Arial"/>
+          <w:color w:val="auto"/>
+        </w:rPr>
+      </w:pPr>
+      <w:r>
+        <w:rPr>
+          <w:rFonts w:ascii="Arial" w:hAnsi="Arial" w:cs="Arial"/>
+          <w:color w:val="auto"/>
+        </w:rPr>
+        <w:lastRenderedPageBreak/>
+        <w:t xml:space="preserve">Table </w:t>
+      </w:r>
+      <w:r>
+        <w:rPr>
+          <w:rFonts w:ascii="Arial" w:hAnsi="Arial" w:cs="Arial"/>
+          <w:color w:val="auto"/>
+        </w:rPr>
+        <w:fldChar w:fldCharType="begin"/>
+      </w:r>
+      <w:r>
+        <w:rPr>
+          <w:rFonts w:ascii="Arial" w:hAnsi="Arial" w:cs="Arial"/>
+          <w:color w:val="auto"/>
+        </w:rPr>
+        <w:instrText xml:space="preserve"> SEQ Table \* ARABIC </w:instrText>
+      </w:r>
+      <w:r>
+        <w:rPr>
+          <w:rFonts w:ascii="Arial" w:hAnsi="Arial" w:cs="Arial"/>
+          <w:color w:val="auto"/>
+        </w:rPr>
+        <w:fldChar w:fldCharType="separate"/>
+      </w:r>
+      <w:r>
+        <w:rPr>
+          <w:rFonts w:ascii="Arial" w:hAnsi="Arial" w:cs="Arial"/>
           <w:noProof/>
-        </w:rPr>
-        <w:lastRenderedPageBreak/>
+          <w:color w:val="auto"/>
+        </w:rPr>
+        <w:t>7</w:t>
+      </w:r>
+      <w:r>
+        <w:rPr>
+          <w:rFonts w:ascii="Arial" w:hAnsi="Arial" w:cs="Arial"/>
+          <w:color w:val="auto"/>
+        </w:rPr>
+        <w:fldChar w:fldCharType="end"/>
+      </w:r>
+      <w:r>
+        <w:rPr>
+          <w:rFonts w:ascii="Arial" w:hAnsi="Arial" w:cs="Arial"/>
+          <w:color w:val="auto"/>
+        </w:rPr>
+        <w:t>: Constructor Rankings as of the 2024 British GP. ± values represent a 95% confidence interval.</w:t>
+      </w:r>
+    </w:p>
+    <w:p>
+      <w:pPr>
+        <w:keepNext/>
+        <w:jc w:val="center"/>
+      </w:pPr>
+      <w:r>
+        <w:rPr>
+          <w:noProof/>
+        </w:rPr>
         <w:drawing>
-          <wp:inline distT="0" distB="0" distL="0" distR="0" wp14:anchorId="463C4C90" wp14:editId="277A49F1">
-            <wp:extent cx="5943600" cy="4469130"/>
-            <wp:effectExtent l="0" t="0" r="0" b="7620"/>
-            <wp:docPr id="7" name="Picture 6" descr="A screenshot of a screenshot of a formula one car&#10;&#10;Description automatically generated">
+          <wp:inline distT="0" distB="0" distL="0" distR="0" wp14:anchorId="463C4C90" wp14:editId="15ED966A">
+            <wp:extent cx="5783738" cy="4469130"/>
+            <wp:effectExtent l="0" t="0" r="7620" b="7620"/>
+            <wp:docPr id="7" name="Picture 6">
               <a:extLst xmlns:a="http://schemas.openxmlformats.org/drawingml/2006/main">
                 <a:ext uri="{FF2B5EF4-FFF2-40B4-BE49-F238E27FC236}">
                   <a16:creationId xmlns:a16="http://schemas.microsoft.com/office/drawing/2014/main" id="{530FD26D-DD47-7468-AB01-64E27F12B251}"/>
@@ -10848,7 +10646,7 @@
               <a:graphicData uri="http://schemas.openxmlformats.org/drawingml/2006/picture">
                 <pic:pic xmlns:pic="http://schemas.openxmlformats.org/drawingml/2006/picture">
                   <pic:nvPicPr>
-                    <pic:cNvPr id="7" name="Picture 6" descr="A screenshot of a screenshot of a formula one car&#10;&#10;Description automatically generated">
+                    <pic:cNvPr id="7" name="Picture 6">
                       <a:extLst>
                         <a:ext uri="{FF2B5EF4-FFF2-40B4-BE49-F238E27FC236}">
                           <a16:creationId xmlns:a16="http://schemas.microsoft.com/office/drawing/2014/main" id="{530FD26D-DD47-7468-AB01-64E27F12B251}"/>
@@ -10860,7 +10658,13 @@
                     </pic:cNvPicPr>
                   </pic:nvPicPr>
                   <pic:blipFill>
-                    <a:blip r:embed="rId29"/>
+                    <a:blip r:embed="rId28" cstate="print">
+                      <a:extLst>
+                        <a:ext uri="{28A0092B-C50C-407E-A947-70E740481C1C}">
+                          <a14:useLocalDpi xmlns:a14="http://schemas.microsoft.com/office/drawing/2010/main" val="0"/>
+                        </a:ext>
+                      </a:extLst>
+                    </a:blip>
                     <a:stretch>
                       <a:fillRect/>
                     </a:stretch>
@@ -10868,7 +10672,7 @@
                   <pic:spPr>
                     <a:xfrm>
                       <a:off x="0" y="0"/>
-                      <a:ext cx="5943600" cy="4469130"/>
+                      <a:ext cx="5783738" cy="4469130"/>
                     </a:xfrm>
                     <a:prstGeom prst="rect">
                       <a:avLst/>
@@ -10881,81 +10685,7 @@
         </w:drawing>
       </w:r>
     </w:p>
-    <w:p>
-      <w:pPr>
-        <w:pStyle w:val="Caption"/>
-        <w:jc w:val="center"/>
-        <w:rPr>
-          <w:color w:val="auto"/>
-        </w:rPr>
-      </w:pPr>
-      <w:r>
-        <w:rPr>
-          <w:color w:val="auto"/>
-        </w:rPr>
-        <w:t xml:space="preserve">Figure </w:t>
-      </w:r>
-      <w:r>
-        <w:rPr>
-          <w:color w:val="auto"/>
-        </w:rPr>
-        <w:fldChar w:fldCharType="begin"/>
-      </w:r>
-      <w:r>
-        <w:rPr>
-          <w:color w:val="auto"/>
-        </w:rPr>
-        <w:instrText xml:space="preserve"> SEQ Figure \* ARABIC </w:instrText>
-      </w:r>
-      <w:r>
-        <w:rPr>
-          <w:color w:val="auto"/>
-        </w:rPr>
-        <w:fldChar w:fldCharType="separate"/>
-      </w:r>
-      <w:r>
-        <w:rPr>
-          <w:noProof/>
-          <w:color w:val="auto"/>
-        </w:rPr>
-        <w:t>15</w:t>
-      </w:r>
-      <w:r>
-        <w:rPr>
-          <w:color w:val="auto"/>
-        </w:rPr>
-        <w:fldChar w:fldCharType="end"/>
-      </w:r>
-      <w:r>
-        <w:rPr>
-          <w:color w:val="auto"/>
-        </w:rPr>
-        <w:t>: Constructor Rankings as of the 2024 British G</w:t>
-      </w:r>
-      <w:r>
-        <w:rPr>
-          <w:color w:val="auto"/>
-        </w:rPr>
-        <w:t xml:space="preserve">P. </w:t>
-      </w:r>
-      <w:r>
-        <w:rPr>
-          <w:color w:val="auto"/>
-        </w:rPr>
-        <w:t>±</w:t>
-      </w:r>
-      <w:r>
-        <w:rPr>
-          <w:color w:val="auto"/>
-        </w:rPr>
-        <w:t xml:space="preserve"> values represent a 95% confidence interval. </w:t>
-      </w:r>
-    </w:p>
-    <w:p>
-      <w:pPr>
-        <w:jc w:val="center"/>
-      </w:pPr>
-    </w:p>
+    <w:p/>
     <w:p>
       <w:pPr>
         <w:jc w:val="center"/>
@@ -11046,12 +10776,11 @@
         <w:rPr>
           <w:noProof/>
         </w:rPr>
-        <w:lastRenderedPageBreak/>
         <w:drawing>
-          <wp:inline distT="0" distB="0" distL="0" distR="0" wp14:anchorId="55CB02C9" wp14:editId="01EF7DDD">
-            <wp:extent cx="5943600" cy="7386320"/>
-            <wp:effectExtent l="0" t="0" r="0" b="5080"/>
-            <wp:docPr id="44" name="Picture 43" descr="A screenshot of a graph&#10;&#10;Description automatically generated">
+          <wp:inline distT="0" distB="0" distL="0" distR="0" wp14:anchorId="55CB02C9" wp14:editId="0EF62909">
+            <wp:extent cx="5943600" cy="6884169"/>
+            <wp:effectExtent l="0" t="0" r="0" b="0"/>
+            <wp:docPr id="44" name="Picture 43">
               <a:extLst xmlns:a="http://schemas.openxmlformats.org/drawingml/2006/main">
                 <a:ext uri="{FF2B5EF4-FFF2-40B4-BE49-F238E27FC236}">
                   <a16:creationId xmlns:a16="http://schemas.microsoft.com/office/drawing/2014/main" id="{AF9A5643-9B3B-CF7D-4575-1F9987016E8F}"/>
@@ -11065,7 +10794,7 @@
               <a:graphicData uri="http://schemas.openxmlformats.org/drawingml/2006/picture">
                 <pic:pic xmlns:pic="http://schemas.openxmlformats.org/drawingml/2006/picture">
                   <pic:nvPicPr>
-                    <pic:cNvPr id="44" name="Picture 43" descr="A screenshot of a graph&#10;&#10;Description automatically generated">
+                    <pic:cNvPr id="44" name="Picture 43">
                       <a:extLst>
                         <a:ext uri="{FF2B5EF4-FFF2-40B4-BE49-F238E27FC236}">
                           <a16:creationId xmlns:a16="http://schemas.microsoft.com/office/drawing/2014/main" id="{AF9A5643-9B3B-CF7D-4575-1F9987016E8F}"/>
@@ -11077,7 +10806,13 @@
                     </pic:cNvPicPr>
                   </pic:nvPicPr>
                   <pic:blipFill>
-                    <a:blip r:embed="rId30"/>
+                    <a:blip r:embed="rId29" cstate="print">
+                      <a:extLst>
+                        <a:ext uri="{28A0092B-C50C-407E-A947-70E740481C1C}">
+                          <a14:useLocalDpi xmlns:a14="http://schemas.microsoft.com/office/drawing/2010/main" val="0"/>
+                        </a:ext>
+                      </a:extLst>
+                    </a:blip>
                     <a:stretch>
                       <a:fillRect/>
                     </a:stretch>
@@ -11085,7 +10820,7 @@
                   <pic:spPr>
                     <a:xfrm>
                       <a:off x="0" y="0"/>
-                      <a:ext cx="5943600" cy="7386320"/>
+                      <a:ext cx="5943600" cy="6884169"/>
                     </a:xfrm>
                     <a:prstGeom prst="rect">
                       <a:avLst/>
@@ -11104,65 +10839,60 @@
     <w:p>
       <w:pPr>
         <w:pStyle w:val="Caption"/>
-        <w:jc w:val="center"/>
-        <w:rPr>
-          <w:color w:val="auto"/>
-        </w:rPr>
-      </w:pPr>
-      <w:r>
-        <w:rPr>
+        <w:rPr>
+          <w:rFonts w:ascii="Arial" w:hAnsi="Arial" w:cs="Arial"/>
+          <w:color w:val="auto"/>
+        </w:rPr>
+      </w:pPr>
+      <w:r>
+        <w:rPr>
+          <w:rFonts w:ascii="Arial" w:hAnsi="Arial" w:cs="Arial"/>
           <w:color w:val="auto"/>
         </w:rPr>
         <w:t xml:space="preserve">Figure </w:t>
       </w:r>
       <w:r>
         <w:rPr>
+          <w:rFonts w:ascii="Arial" w:hAnsi="Arial" w:cs="Arial"/>
           <w:color w:val="auto"/>
         </w:rPr>
         <w:fldChar w:fldCharType="begin"/>
       </w:r>
       <w:r>
         <w:rPr>
+          <w:rFonts w:ascii="Arial" w:hAnsi="Arial" w:cs="Arial"/>
           <w:color w:val="auto"/>
         </w:rPr>
         <w:instrText xml:space="preserve"> SEQ Figure \* ARABIC </w:instrText>
       </w:r>
       <w:r>
         <w:rPr>
+          <w:rFonts w:ascii="Arial" w:hAnsi="Arial" w:cs="Arial"/>
           <w:color w:val="auto"/>
         </w:rPr>
         <w:fldChar w:fldCharType="separate"/>
       </w:r>
       <w:r>
         <w:rPr>
+          <w:rFonts w:ascii="Arial" w:hAnsi="Arial" w:cs="Arial"/>
           <w:noProof/>
           <w:color w:val="auto"/>
         </w:rPr>
-        <w:t>16</w:t>
-      </w:r>
-      <w:r>
-        <w:rPr>
+        <w:t>9</w:t>
+      </w:r>
+      <w:r>
+        <w:rPr>
+          <w:rFonts w:ascii="Arial" w:hAnsi="Arial" w:cs="Arial"/>
           <w:color w:val="auto"/>
         </w:rPr>
         <w:fldChar w:fldCharType="end"/>
       </w:r>
       <w:r>
         <w:rPr>
-          <w:color w:val="auto"/>
-        </w:rPr>
-        <w:t>: Driver Ranking/Coefficient Trend 2014 - 2024 British GP</w:t>
-      </w:r>
-      <w:r>
-        <w:rPr>
-          <w:color w:val="auto"/>
-        </w:rPr>
-        <w:t xml:space="preserve">. </w:t>
-      </w:r>
-      <w:r>
-        <w:rPr>
-          <w:color w:val="auto"/>
-        </w:rPr>
-        <w:t>Shaded area represents a 95% confidence interval.</w:t>
+          <w:rFonts w:ascii="Arial" w:hAnsi="Arial" w:cs="Arial"/>
+          <w:color w:val="auto"/>
+        </w:rPr>
+        <w:t>: Driver Ranking/Coefficient Trend 2014 - 2024 British GP. Shaded area represents a 95% confidence interval.</w:t>
       </w:r>
     </w:p>
     <w:p>
@@ -11175,10 +10905,10 @@
         </w:rPr>
         <w:lastRenderedPageBreak/>
         <w:drawing>
-          <wp:inline distT="0" distB="0" distL="0" distR="0" wp14:anchorId="0E5ABABC" wp14:editId="7D3F99E8">
-            <wp:extent cx="5943600" cy="7873365"/>
-            <wp:effectExtent l="0" t="0" r="0" b="0"/>
-            <wp:docPr id="26" name="Picture 25" descr="A screenshot of a graph&#10;&#10;Description automatically generated">
+          <wp:inline distT="0" distB="0" distL="0" distR="0" wp14:anchorId="0E5ABABC" wp14:editId="19C7218F">
+            <wp:extent cx="5943600" cy="7425899"/>
+            <wp:effectExtent l="0" t="0" r="0" b="3810"/>
+            <wp:docPr id="26" name="Picture 25">
               <a:extLst xmlns:a="http://schemas.openxmlformats.org/drawingml/2006/main">
                 <a:ext uri="{FF2B5EF4-FFF2-40B4-BE49-F238E27FC236}">
                   <a16:creationId xmlns:a16="http://schemas.microsoft.com/office/drawing/2014/main" id="{4F43E52B-7B1E-4E4F-C179-5AF1795BDA7A}"/>
@@ -11192,7 +10922,7 @@
               <a:graphicData uri="http://schemas.openxmlformats.org/drawingml/2006/picture">
                 <pic:pic xmlns:pic="http://schemas.openxmlformats.org/drawingml/2006/picture">
                   <pic:nvPicPr>
-                    <pic:cNvPr id="26" name="Picture 25" descr="A screenshot of a graph&#10;&#10;Description automatically generated">
+                    <pic:cNvPr id="26" name="Picture 25">
                       <a:extLst>
                         <a:ext uri="{FF2B5EF4-FFF2-40B4-BE49-F238E27FC236}">
                           <a16:creationId xmlns:a16="http://schemas.microsoft.com/office/drawing/2014/main" id="{4F43E52B-7B1E-4E4F-C179-5AF1795BDA7A}"/>
@@ -11204,7 +10934,13 @@
                     </pic:cNvPicPr>
                   </pic:nvPicPr>
                   <pic:blipFill>
-                    <a:blip r:embed="rId31"/>
+                    <a:blip r:embed="rId30" cstate="print">
+                      <a:extLst>
+                        <a:ext uri="{28A0092B-C50C-407E-A947-70E740481C1C}">
+                          <a14:useLocalDpi xmlns:a14="http://schemas.microsoft.com/office/drawing/2010/main" val="0"/>
+                        </a:ext>
+                      </a:extLst>
+                    </a:blip>
                     <a:stretch>
                       <a:fillRect/>
                     </a:stretch>
@@ -11212,7 +10948,7 @@
                   <pic:spPr>
                     <a:xfrm>
                       <a:off x="0" y="0"/>
-                      <a:ext cx="5943600" cy="7873365"/>
+                      <a:ext cx="5943600" cy="7425899"/>
                     </a:xfrm>
                     <a:prstGeom prst="rect">
                       <a:avLst/>
@@ -11233,67 +10969,63 @@
         <w:pStyle w:val="Caption"/>
         <w:jc w:val="center"/>
         <w:rPr>
-          <w:color w:val="auto"/>
-        </w:rPr>
-      </w:pPr>
-      <w:r>
-        <w:rPr>
+          <w:rFonts w:ascii="Arial" w:hAnsi="Arial" w:cs="Arial"/>
+          <w:color w:val="auto"/>
+        </w:rPr>
+      </w:pPr>
+      <w:r>
+        <w:rPr>
+          <w:rFonts w:ascii="Arial" w:hAnsi="Arial" w:cs="Arial"/>
           <w:color w:val="auto"/>
         </w:rPr>
         <w:t xml:space="preserve">Figure </w:t>
       </w:r>
       <w:r>
         <w:rPr>
+          <w:rFonts w:ascii="Arial" w:hAnsi="Arial" w:cs="Arial"/>
           <w:color w:val="auto"/>
         </w:rPr>
         <w:fldChar w:fldCharType="begin"/>
       </w:r>
       <w:r>
         <w:rPr>
+          <w:rFonts w:ascii="Arial" w:hAnsi="Arial" w:cs="Arial"/>
           <w:color w:val="auto"/>
         </w:rPr>
         <w:instrText xml:space="preserve"> SEQ Figure \* ARABIC </w:instrText>
       </w:r>
       <w:r>
         <w:rPr>
+          <w:rFonts w:ascii="Arial" w:hAnsi="Arial" w:cs="Arial"/>
           <w:color w:val="auto"/>
         </w:rPr>
         <w:fldChar w:fldCharType="separate"/>
       </w:r>
       <w:r>
         <w:rPr>
+          <w:rFonts w:ascii="Arial" w:hAnsi="Arial" w:cs="Arial"/>
           <w:noProof/>
           <w:color w:val="auto"/>
         </w:rPr>
-        <w:t>17</w:t>
-      </w:r>
-      <w:r>
-        <w:rPr>
+        <w:t>10</w:t>
+      </w:r>
+      <w:r>
+        <w:rPr>
+          <w:rFonts w:ascii="Arial" w:hAnsi="Arial" w:cs="Arial"/>
           <w:color w:val="auto"/>
         </w:rPr>
         <w:fldChar w:fldCharType="end"/>
       </w:r>
       <w:r>
         <w:rPr>
-          <w:color w:val="auto"/>
-        </w:rPr>
-        <w:t>: Constructor Ranking/Coefficient Trend 2014 - 2024 British GP</w:t>
-      </w:r>
-      <w:r>
-        <w:rPr>
-          <w:color w:val="auto"/>
-        </w:rPr>
-        <w:t xml:space="preserve">. </w:t>
-      </w:r>
-      <w:r>
-        <w:rPr>
-          <w:color w:val="auto"/>
-        </w:rPr>
-        <w:t>Shaded area represents a 95% confidence interval.</w:t>
+          <w:rFonts w:ascii="Arial" w:hAnsi="Arial" w:cs="Arial"/>
+          <w:color w:val="auto"/>
+        </w:rPr>
+        <w:t>: Constructor Ranking/Coefficient Trend 2014 - 2024 British GP. Shaded area represents a 95% confidence interval.</w:t>
       </w:r>
     </w:p>
     <w:sectPr>
-      <w:footerReference w:type="default" r:id="rId32"/>
+      <w:footerReference w:type="default" r:id="rId31"/>
       <w:pgSz w:w="12240" w:h="15840"/>
       <w:pgMar w:top="1440" w:right="1440" w:bottom="1440" w:left="1440" w:header="720" w:footer="720" w:gutter="0"/>
       <w:cols w:space="720"/>

</xml_diff>

<commit_message>
Update for paper publish
</commit_message>
<xml_diff>
--- a/Documents/Predicting Formula 1 Race Outcomes.docx
+++ b/Documents/Predicting Formula 1 Race Outcomes.docx
@@ -1,6 +1,6 @@
 
 <file path=word/document.xml><?xml version="1.0" encoding="utf-8"?>
-<w:document xmlns:wpc="http://schemas.microsoft.com/office/word/2010/wordprocessingCanvas" xmlns:cx="http://schemas.microsoft.com/office/drawing/2014/chartex" xmlns:cx1="http://schemas.microsoft.com/office/drawing/2015/9/8/chartex" xmlns:cx2="http://schemas.microsoft.com/office/drawing/2015/10/21/chartex" xmlns:cx3="http://schemas.microsoft.com/office/drawing/2016/5/9/chartex" xmlns:cx4="http://schemas.microsoft.com/office/drawing/2016/5/10/chartex" xmlns:cx5="http://schemas.microsoft.com/office/drawing/2016/5/11/chartex" xmlns:cx6="http://schemas.microsoft.com/office/drawing/2016/5/12/chartex" xmlns:cx7="http://schemas.microsoft.com/office/drawing/2016/5/13/chartex" xmlns:cx8="http://schemas.microsoft.com/office/drawing/2016/5/14/chartex" xmlns:mc="http://schemas.openxmlformats.org/markup-compatibility/2006" xmlns:aink="http://schemas.microsoft.com/office/drawing/2016/ink" xmlns:am3d="http://schemas.microsoft.com/office/drawing/2017/model3d" xmlns:o="urn:schemas-microsoft-com:office:office" xmlns:oel="http://schemas.microsoft.com/office/2019/extlst" xmlns:r="http://schemas.openxmlformats.org/officeDocument/2006/relationships" xmlns:m="http://schemas.openxmlformats.org/officeDocument/2006/math" xmlns:v="urn:schemas-microsoft-com:vml" xmlns:wp14="http://schemas.microsoft.com/office/word/2010/wordprocessingDrawing" xmlns:wp="http://schemas.openxmlformats.org/drawingml/2006/wordprocessingDrawing" xmlns:w10="urn:schemas-microsoft-com:office:word" xmlns:w="http://schemas.openxmlformats.org/wordprocessingml/2006/main" xmlns:w14="http://schemas.microsoft.com/office/word/2010/wordml" xmlns:w15="http://schemas.microsoft.com/office/word/2012/wordml" xmlns:w16cex="http://schemas.microsoft.com/office/word/2018/wordml/cex" xmlns:w16cid="http://schemas.microsoft.com/office/word/2016/wordml/cid" xmlns:w16="http://schemas.microsoft.com/office/word/2018/wordml" xmlns:w16du="http://schemas.microsoft.com/office/word/2023/wordml/word16du" xmlns:w16sdtdh="http://schemas.microsoft.com/office/word/2020/wordml/sdtdatahash" xmlns:w16se="http://schemas.microsoft.com/office/word/2015/wordml/symex" xmlns:wpg="http://schemas.microsoft.com/office/word/2010/wordprocessingGroup" xmlns:wpi="http://schemas.microsoft.com/office/word/2010/wordprocessingInk" xmlns:wne="http://schemas.microsoft.com/office/word/2006/wordml" xmlns:wps="http://schemas.microsoft.com/office/word/2010/wordprocessingShape" mc:Ignorable="w14 w15 w16se w16cid w16 w16cex w16sdtdh w16du wp14">
+<w:document xmlns:wpc="http://schemas.microsoft.com/office/word/2010/wordprocessingCanvas" xmlns:cx="http://schemas.microsoft.com/office/drawing/2014/chartex" xmlns:cx1="http://schemas.microsoft.com/office/drawing/2015/9/8/chartex" xmlns:cx2="http://schemas.microsoft.com/office/drawing/2015/10/21/chartex" xmlns:cx3="http://schemas.microsoft.com/office/drawing/2016/5/9/chartex" xmlns:cx4="http://schemas.microsoft.com/office/drawing/2016/5/10/chartex" xmlns:cx5="http://schemas.microsoft.com/office/drawing/2016/5/11/chartex" xmlns:cx6="http://schemas.microsoft.com/office/drawing/2016/5/12/chartex" xmlns:cx7="http://schemas.microsoft.com/office/drawing/2016/5/13/chartex" xmlns:cx8="http://schemas.microsoft.com/office/drawing/2016/5/14/chartex" xmlns:mc="http://schemas.openxmlformats.org/markup-compatibility/2006" xmlns:aink="http://schemas.microsoft.com/office/drawing/2016/ink" xmlns:am3d="http://schemas.microsoft.com/office/drawing/2017/model3d" xmlns:o="urn:schemas-microsoft-com:office:office" xmlns:oel="http://schemas.microsoft.com/office/2019/extlst" xmlns:r="http://schemas.openxmlformats.org/officeDocument/2006/relationships" xmlns:m="http://schemas.openxmlformats.org/officeDocument/2006/math" xmlns:v="urn:schemas-microsoft-com:vml" xmlns:wp14="http://schemas.microsoft.com/office/word/2010/wordprocessingDrawing" xmlns:wp="http://schemas.openxmlformats.org/drawingml/2006/wordprocessingDrawing" xmlns:w10="urn:schemas-microsoft-com:office:word" xmlns:w="http://schemas.openxmlformats.org/wordprocessingml/2006/main" xmlns:w14="http://schemas.microsoft.com/office/word/2010/wordml" xmlns:w15="http://schemas.microsoft.com/office/word/2012/wordml" xmlns:w16cex="http://schemas.microsoft.com/office/word/2018/wordml/cex" xmlns:w16cid="http://schemas.microsoft.com/office/word/2016/wordml/cid" xmlns:w16="http://schemas.microsoft.com/office/word/2018/wordml" xmlns:w16du="http://schemas.microsoft.com/office/word/2023/wordml/word16du" xmlns:w16sdtdh="http://schemas.microsoft.com/office/word/2020/wordml/sdtdatahash" xmlns:w16sdtfl="http://schemas.microsoft.com/office/word/2024/wordml/sdtformatlock" xmlns:w16se="http://schemas.microsoft.com/office/word/2015/wordml/symex" xmlns:wpg="http://schemas.microsoft.com/office/word/2010/wordprocessingGroup" xmlns:wpi="http://schemas.microsoft.com/office/word/2010/wordprocessingInk" xmlns:wne="http://schemas.microsoft.com/office/word/2006/wordml" xmlns:wps="http://schemas.microsoft.com/office/word/2010/wordprocessingShape" mc:Ignorable="w14 w15 w16se w16cid w16 w16cex w16sdtdh w16sdtfl w16du wp14">
   <w:body>
     <w:p>
       <w:pPr>
@@ -10,7 +10,7 @@
       <w:r>
         <w:t xml:space="preserve"> </w:t>
       </w:r>
-      <w:bookmarkStart w:id="0" w:name="_Toc172717656"/>
+      <w:bookmarkStart w:id="0" w:name="_Toc203403157"/>
       <w:r>
         <w:t xml:space="preserve">Predicting Formula 1 Race Outcomes: </w:t>
       </w:r>
@@ -113,7 +113,7 @@
           <w:r>
             <w:fldChar w:fldCharType="separate"/>
           </w:r>
-          <w:hyperlink w:anchor="_Toc172717656" w:history="1">
+          <w:hyperlink w:anchor="_Toc203403157" w:history="1">
             <w:r>
               <w:rPr>
                 <w:rStyle w:val="Hyperlink"/>
@@ -140,7 +140,7 @@
                 <w:noProof/>
                 <w:webHidden/>
               </w:rPr>
-              <w:instrText xml:space="preserve"> PAGEREF _Toc172717656 \h </w:instrText>
+              <w:instrText xml:space="preserve"> PAGEREF _Toc203403157 \h </w:instrText>
             </w:r>
             <w:r>
               <w:rPr>
@@ -184,7 +184,7 @@
               <w:szCs w:val="24"/>
             </w:rPr>
           </w:pPr>
-          <w:hyperlink w:anchor="_Toc172717657" w:history="1">
+          <w:hyperlink w:anchor="_Toc203403158" w:history="1">
             <w:r>
               <w:rPr>
                 <w:rStyle w:val="Hyperlink"/>
@@ -211,7 +211,7 @@
                 <w:noProof/>
                 <w:webHidden/>
               </w:rPr>
-              <w:instrText xml:space="preserve"> PAGEREF _Toc172717657 \h </w:instrText>
+              <w:instrText xml:space="preserve"> PAGEREF _Toc203403158 \h </w:instrText>
             </w:r>
             <w:r>
               <w:rPr>
@@ -256,7 +256,7 @@
               <w:szCs w:val="24"/>
             </w:rPr>
           </w:pPr>
-          <w:hyperlink w:anchor="_Toc172717658" w:history="1">
+          <w:hyperlink w:anchor="_Toc203403159" w:history="1">
             <w:r>
               <w:rPr>
                 <w:rStyle w:val="Hyperlink"/>
@@ -299,7 +299,7 @@
                 <w:noProof/>
                 <w:webHidden/>
               </w:rPr>
-              <w:instrText xml:space="preserve"> PAGEREF _Toc172717658 \h </w:instrText>
+              <w:instrText xml:space="preserve"> PAGEREF _Toc203403159 \h </w:instrText>
             </w:r>
             <w:r>
               <w:rPr>
@@ -344,7 +344,7 @@
               <w:szCs w:val="24"/>
             </w:rPr>
           </w:pPr>
-          <w:hyperlink w:anchor="_Toc172717659" w:history="1">
+          <w:hyperlink w:anchor="_Toc203403160" w:history="1">
             <w:r>
               <w:rPr>
                 <w:rStyle w:val="Hyperlink"/>
@@ -387,7 +387,7 @@
                 <w:noProof/>
                 <w:webHidden/>
               </w:rPr>
-              <w:instrText xml:space="preserve"> PAGEREF _Toc172717659 \h </w:instrText>
+              <w:instrText xml:space="preserve"> PAGEREF _Toc203403160 \h </w:instrText>
             </w:r>
             <w:r>
               <w:rPr>
@@ -432,7 +432,7 @@
               <w:szCs w:val="24"/>
             </w:rPr>
           </w:pPr>
-          <w:hyperlink w:anchor="_Toc172717660" w:history="1">
+          <w:hyperlink w:anchor="_Toc203403161" w:history="1">
             <w:r>
               <w:rPr>
                 <w:rStyle w:val="Hyperlink"/>
@@ -475,7 +475,7 @@
                 <w:noProof/>
                 <w:webHidden/>
               </w:rPr>
-              <w:instrText xml:space="preserve"> PAGEREF _Toc172717660 \h </w:instrText>
+              <w:instrText xml:space="preserve"> PAGEREF _Toc203403161 \h </w:instrText>
             </w:r>
             <w:r>
               <w:rPr>
@@ -520,7 +520,7 @@
               <w:szCs w:val="24"/>
             </w:rPr>
           </w:pPr>
-          <w:hyperlink w:anchor="_Toc172717661" w:history="1">
+          <w:hyperlink w:anchor="_Toc203403162" w:history="1">
             <w:r>
               <w:rPr>
                 <w:rStyle w:val="Hyperlink"/>
@@ -563,7 +563,7 @@
                 <w:noProof/>
                 <w:webHidden/>
               </w:rPr>
-              <w:instrText xml:space="preserve"> PAGEREF _Toc172717661 \h </w:instrText>
+              <w:instrText xml:space="preserve"> PAGEREF _Toc203403162 \h </w:instrText>
             </w:r>
             <w:r>
               <w:rPr>
@@ -608,7 +608,7 @@
               <w:szCs w:val="24"/>
             </w:rPr>
           </w:pPr>
-          <w:hyperlink w:anchor="_Toc172717662" w:history="1">
+          <w:hyperlink w:anchor="_Toc203403163" w:history="1">
             <w:r>
               <w:rPr>
                 <w:rStyle w:val="Hyperlink"/>
@@ -651,7 +651,7 @@
                 <w:noProof/>
                 <w:webHidden/>
               </w:rPr>
-              <w:instrText xml:space="preserve"> PAGEREF _Toc172717662 \h </w:instrText>
+              <w:instrText xml:space="preserve"> PAGEREF _Toc203403163 \h </w:instrText>
             </w:r>
             <w:r>
               <w:rPr>
@@ -696,7 +696,7 @@
               <w:szCs w:val="24"/>
             </w:rPr>
           </w:pPr>
-          <w:hyperlink w:anchor="_Toc172717663" w:history="1">
+          <w:hyperlink w:anchor="_Toc203403164" w:history="1">
             <w:r>
               <w:rPr>
                 <w:rStyle w:val="Hyperlink"/>
@@ -739,7 +739,7 @@
                 <w:noProof/>
                 <w:webHidden/>
               </w:rPr>
-              <w:instrText xml:space="preserve"> PAGEREF _Toc172717663 \h </w:instrText>
+              <w:instrText xml:space="preserve"> PAGEREF _Toc203403164 \h </w:instrText>
             </w:r>
             <w:r>
               <w:rPr>
@@ -784,7 +784,7 @@
               <w:szCs w:val="24"/>
             </w:rPr>
           </w:pPr>
-          <w:hyperlink w:anchor="_Toc172717664" w:history="1">
+          <w:hyperlink w:anchor="_Toc203403165" w:history="1">
             <w:r>
               <w:rPr>
                 <w:rStyle w:val="Hyperlink"/>
@@ -827,7 +827,7 @@
                 <w:noProof/>
                 <w:webHidden/>
               </w:rPr>
-              <w:instrText xml:space="preserve"> PAGEREF _Toc172717664 \h </w:instrText>
+              <w:instrText xml:space="preserve"> PAGEREF _Toc203403165 \h </w:instrText>
             </w:r>
             <w:r>
               <w:rPr>
@@ -847,7 +847,7 @@
                 <w:noProof/>
                 <w:webHidden/>
               </w:rPr>
-              <w:t>6</w:t>
+              <w:t>7</w:t>
             </w:r>
             <w:r>
               <w:rPr>
@@ -872,7 +872,7 @@
               <w:szCs w:val="24"/>
             </w:rPr>
           </w:pPr>
-          <w:hyperlink w:anchor="_Toc172717665" w:history="1">
+          <w:hyperlink w:anchor="_Toc203403166" w:history="1">
             <w:r>
               <w:rPr>
                 <w:rStyle w:val="Hyperlink"/>
@@ -915,7 +915,7 @@
                 <w:noProof/>
                 <w:webHidden/>
               </w:rPr>
-              <w:instrText xml:space="preserve"> PAGEREF _Toc172717665 \h </w:instrText>
+              <w:instrText xml:space="preserve"> PAGEREF _Toc203403166 \h </w:instrText>
             </w:r>
             <w:r>
               <w:rPr>
@@ -935,7 +935,7 @@
                 <w:noProof/>
                 <w:webHidden/>
               </w:rPr>
-              <w:t>6</w:t>
+              <w:t>7</w:t>
             </w:r>
             <w:r>
               <w:rPr>
@@ -960,7 +960,7 @@
               <w:szCs w:val="24"/>
             </w:rPr>
           </w:pPr>
-          <w:hyperlink w:anchor="_Toc172717666" w:history="1">
+          <w:hyperlink w:anchor="_Toc203403167" w:history="1">
             <w:r>
               <w:rPr>
                 <w:rStyle w:val="Hyperlink"/>
@@ -1003,7 +1003,7 @@
                 <w:noProof/>
                 <w:webHidden/>
               </w:rPr>
-              <w:instrText xml:space="preserve"> PAGEREF _Toc172717666 \h </w:instrText>
+              <w:instrText xml:space="preserve"> PAGEREF _Toc203403167 \h </w:instrText>
             </w:r>
             <w:r>
               <w:rPr>
@@ -1048,7 +1048,7 @@
               <w:szCs w:val="24"/>
             </w:rPr>
           </w:pPr>
-          <w:hyperlink w:anchor="_Toc172717667" w:history="1">
+          <w:hyperlink w:anchor="_Toc203403168" w:history="1">
             <w:r>
               <w:rPr>
                 <w:rStyle w:val="Hyperlink"/>
@@ -1091,7 +1091,7 @@
                 <w:noProof/>
                 <w:webHidden/>
               </w:rPr>
-              <w:instrText xml:space="preserve"> PAGEREF _Toc172717667 \h </w:instrText>
+              <w:instrText xml:space="preserve"> PAGEREF _Toc203403168 \h </w:instrText>
             </w:r>
             <w:r>
               <w:rPr>
@@ -1111,7 +1111,7 @@
                 <w:noProof/>
                 <w:webHidden/>
               </w:rPr>
-              <w:t>8</w:t>
+              <w:t>9</w:t>
             </w:r>
             <w:r>
               <w:rPr>
@@ -1136,7 +1136,7 @@
               <w:szCs w:val="24"/>
             </w:rPr>
           </w:pPr>
-          <w:hyperlink w:anchor="_Toc172717668" w:history="1">
+          <w:hyperlink w:anchor="_Toc203403169" w:history="1">
             <w:r>
               <w:rPr>
                 <w:rStyle w:val="Hyperlink"/>
@@ -1179,7 +1179,7 @@
                 <w:noProof/>
                 <w:webHidden/>
               </w:rPr>
-              <w:instrText xml:space="preserve"> PAGEREF _Toc172717668 \h </w:instrText>
+              <w:instrText xml:space="preserve"> PAGEREF _Toc203403169 \h </w:instrText>
             </w:r>
             <w:r>
               <w:rPr>
@@ -1199,7 +1199,7 @@
                 <w:noProof/>
                 <w:webHidden/>
               </w:rPr>
-              <w:t>8</w:t>
+              <w:t>9</w:t>
             </w:r>
             <w:r>
               <w:rPr>
@@ -1224,7 +1224,7 @@
               <w:szCs w:val="24"/>
             </w:rPr>
           </w:pPr>
-          <w:hyperlink w:anchor="_Toc172717669" w:history="1">
+          <w:hyperlink w:anchor="_Toc203403170" w:history="1">
             <w:r>
               <w:rPr>
                 <w:rStyle w:val="Hyperlink"/>
@@ -1267,7 +1267,7 @@
                 <w:noProof/>
                 <w:webHidden/>
               </w:rPr>
-              <w:instrText xml:space="preserve"> PAGEREF _Toc172717669 \h </w:instrText>
+              <w:instrText xml:space="preserve"> PAGEREF _Toc203403170 \h </w:instrText>
             </w:r>
             <w:r>
               <w:rPr>
@@ -1287,7 +1287,7 @@
                 <w:noProof/>
                 <w:webHidden/>
               </w:rPr>
-              <w:t>10</w:t>
+              <w:t>11</w:t>
             </w:r>
             <w:r>
               <w:rPr>
@@ -1312,7 +1312,7 @@
               <w:szCs w:val="24"/>
             </w:rPr>
           </w:pPr>
-          <w:hyperlink w:anchor="_Toc172717670" w:history="1">
+          <w:hyperlink w:anchor="_Toc203403171" w:history="1">
             <w:r>
               <w:rPr>
                 <w:rStyle w:val="Hyperlink"/>
@@ -1355,7 +1355,7 @@
                 <w:noProof/>
                 <w:webHidden/>
               </w:rPr>
-              <w:instrText xml:space="preserve"> PAGEREF _Toc172717670 \h </w:instrText>
+              <w:instrText xml:space="preserve"> PAGEREF _Toc203403171 \h </w:instrText>
             </w:r>
             <w:r>
               <w:rPr>
@@ -1375,7 +1375,95 @@
                 <w:noProof/>
                 <w:webHidden/>
               </w:rPr>
-              <w:t>11</w:t>
+              <w:t>12</w:t>
+            </w:r>
+            <w:r>
+              <w:rPr>
+                <w:noProof/>
+                <w:webHidden/>
+              </w:rPr>
+              <w:fldChar w:fldCharType="end"/>
+            </w:r>
+          </w:hyperlink>
+        </w:p>
+        <w:p>
+          <w:pPr>
+            <w:pStyle w:val="TOC3"/>
+            <w:tabs>
+              <w:tab w:val="left" w:pos="1200"/>
+              <w:tab w:val="right" w:leader="dot" w:pos="9350"/>
+            </w:tabs>
+            <w:rPr>
+              <w:rFonts w:asciiTheme="minorHAnsi" w:eastAsiaTheme="minorEastAsia" w:hAnsiTheme="minorHAnsi" w:cstheme="minorBidi"/>
+              <w:noProof/>
+              <w:sz w:val="24"/>
+              <w:szCs w:val="24"/>
+            </w:rPr>
+          </w:pPr>
+          <w:hyperlink w:anchor="_Toc203403172" w:history="1">
+            <w:r>
+              <w:rPr>
+                <w:rStyle w:val="Hyperlink"/>
+                <w:noProof/>
+              </w:rPr>
+              <w:t>4.4.</w:t>
+            </w:r>
+            <w:r>
+              <w:rPr>
+                <w:rFonts w:asciiTheme="minorHAnsi" w:eastAsiaTheme="minorEastAsia" w:hAnsiTheme="minorHAnsi" w:cstheme="minorBidi"/>
+                <w:noProof/>
+                <w:sz w:val="24"/>
+                <w:szCs w:val="24"/>
+              </w:rPr>
+              <w:tab/>
+            </w:r>
+            <w:r>
+              <w:rPr>
+                <w:rStyle w:val="Hyperlink"/>
+                <w:noProof/>
+              </w:rPr>
+              <w:t>Alternate Methods</w:t>
+            </w:r>
+            <w:r>
+              <w:rPr>
+                <w:noProof/>
+                <w:webHidden/>
+              </w:rPr>
+              <w:tab/>
+            </w:r>
+            <w:r>
+              <w:rPr>
+                <w:noProof/>
+                <w:webHidden/>
+              </w:rPr>
+              <w:fldChar w:fldCharType="begin"/>
+            </w:r>
+            <w:r>
+              <w:rPr>
+                <w:noProof/>
+                <w:webHidden/>
+              </w:rPr>
+              <w:instrText xml:space="preserve"> PAGEREF _Toc203403172 \h </w:instrText>
+            </w:r>
+            <w:r>
+              <w:rPr>
+                <w:noProof/>
+                <w:webHidden/>
+              </w:rPr>
+            </w:r>
+            <w:r>
+              <w:rPr>
+                <w:noProof/>
+                <w:webHidden/>
+              </w:rPr>
+              <w:fldChar w:fldCharType="separate"/>
+            </w:r>
+            <w:r>
+              <w:rPr>
+                <w:noProof/>
+                <w:webHidden/>
+              </w:rPr>
+              <w:t>14</w:t>
             </w:r>
             <w:r>
               <w:rPr>
@@ -1400,7 +1488,7 @@
               <w:szCs w:val="24"/>
             </w:rPr>
           </w:pPr>
-          <w:hyperlink w:anchor="_Toc172717671" w:history="1">
+          <w:hyperlink w:anchor="_Toc203403173" w:history="1">
             <w:r>
               <w:rPr>
                 <w:rStyle w:val="Hyperlink"/>
@@ -1443,7 +1531,7 @@
                 <w:noProof/>
                 <w:webHidden/>
               </w:rPr>
-              <w:instrText xml:space="preserve"> PAGEREF _Toc172717671 \h </w:instrText>
+              <w:instrText xml:space="preserve"> PAGEREF _Toc203403173 \h </w:instrText>
             </w:r>
             <w:r>
               <w:rPr>
@@ -1463,7 +1551,7 @@
                 <w:noProof/>
                 <w:webHidden/>
               </w:rPr>
-              <w:t>13</w:t>
+              <w:t>14</w:t>
             </w:r>
             <w:r>
               <w:rPr>
@@ -1488,7 +1576,7 @@
               <w:szCs w:val="24"/>
             </w:rPr>
           </w:pPr>
-          <w:hyperlink w:anchor="_Toc172717672" w:history="1">
+          <w:hyperlink w:anchor="_Toc203403174" w:history="1">
             <w:r>
               <w:rPr>
                 <w:rStyle w:val="Hyperlink"/>
@@ -1531,7 +1619,7 @@
                 <w:noProof/>
                 <w:webHidden/>
               </w:rPr>
-              <w:instrText xml:space="preserve"> PAGEREF _Toc172717672 \h </w:instrText>
+              <w:instrText xml:space="preserve"> PAGEREF _Toc203403174 \h </w:instrText>
             </w:r>
             <w:r>
               <w:rPr>
@@ -1551,7 +1639,7 @@
                 <w:noProof/>
                 <w:webHidden/>
               </w:rPr>
-              <w:t>13</w:t>
+              <w:t>14</w:t>
             </w:r>
             <w:r>
               <w:rPr>
@@ -1576,7 +1664,7 @@
               <w:szCs w:val="24"/>
             </w:rPr>
           </w:pPr>
-          <w:hyperlink w:anchor="_Toc172717673" w:history="1">
+          <w:hyperlink w:anchor="_Toc203403175" w:history="1">
             <w:r>
               <w:rPr>
                 <w:rStyle w:val="Hyperlink"/>
@@ -1619,7 +1707,7 @@
                 <w:noProof/>
                 <w:webHidden/>
               </w:rPr>
-              <w:instrText xml:space="preserve"> PAGEREF _Toc172717673 \h </w:instrText>
+              <w:instrText xml:space="preserve"> PAGEREF _Toc203403175 \h </w:instrText>
             </w:r>
             <w:r>
               <w:rPr>
@@ -1639,7 +1727,7 @@
                 <w:noProof/>
                 <w:webHidden/>
               </w:rPr>
-              <w:t>13</w:t>
+              <w:t>14</w:t>
             </w:r>
             <w:r>
               <w:rPr>
@@ -1664,7 +1752,7 @@
               <w:szCs w:val="24"/>
             </w:rPr>
           </w:pPr>
-          <w:hyperlink w:anchor="_Toc172717674" w:history="1">
+          <w:hyperlink w:anchor="_Toc203403176" w:history="1">
             <w:r>
               <w:rPr>
                 <w:rStyle w:val="Hyperlink"/>
@@ -1707,7 +1795,7 @@
                 <w:noProof/>
                 <w:webHidden/>
               </w:rPr>
-              <w:instrText xml:space="preserve"> PAGEREF _Toc172717674 \h </w:instrText>
+              <w:instrText xml:space="preserve"> PAGEREF _Toc203403176 \h </w:instrText>
             </w:r>
             <w:r>
               <w:rPr>
@@ -1727,7 +1815,7 @@
                 <w:noProof/>
                 <w:webHidden/>
               </w:rPr>
-              <w:t>13</w:t>
+              <w:t>15</w:t>
             </w:r>
             <w:r>
               <w:rPr>
@@ -1751,7 +1839,7 @@
               <w:szCs w:val="24"/>
             </w:rPr>
           </w:pPr>
-          <w:hyperlink w:anchor="_Toc172717675" w:history="1">
+          <w:hyperlink w:anchor="_Toc203403177" w:history="1">
             <w:r>
               <w:rPr>
                 <w:rStyle w:val="Hyperlink"/>
@@ -1778,7 +1866,7 @@
                 <w:noProof/>
                 <w:webHidden/>
               </w:rPr>
-              <w:instrText xml:space="preserve"> PAGEREF _Toc172717675 \h </w:instrText>
+              <w:instrText xml:space="preserve"> PAGEREF _Toc203403177 \h </w:instrText>
             </w:r>
             <w:r>
               <w:rPr>
@@ -1798,7 +1886,7 @@
                 <w:noProof/>
                 <w:webHidden/>
               </w:rPr>
-              <w:t>15</w:t>
+              <w:t>16</w:t>
             </w:r>
             <w:r>
               <w:rPr>
@@ -1822,7 +1910,7 @@
               <w:szCs w:val="24"/>
             </w:rPr>
           </w:pPr>
-          <w:hyperlink w:anchor="_Toc172717676" w:history="1">
+          <w:hyperlink w:anchor="_Toc203403178" w:history="1">
             <w:r>
               <w:rPr>
                 <w:rStyle w:val="Hyperlink"/>
@@ -1849,7 +1937,7 @@
                 <w:noProof/>
                 <w:webHidden/>
               </w:rPr>
-              <w:instrText xml:space="preserve"> PAGEREF _Toc172717676 \h </w:instrText>
+              <w:instrText xml:space="preserve"> PAGEREF _Toc203403178 \h </w:instrText>
             </w:r>
             <w:r>
               <w:rPr>
@@ -1869,7 +1957,7 @@
                 <w:noProof/>
                 <w:webHidden/>
               </w:rPr>
-              <w:t>15</w:t>
+              <w:t>16</w:t>
             </w:r>
             <w:r>
               <w:rPr>
@@ -1893,7 +1981,7 @@
               <w:szCs w:val="24"/>
             </w:rPr>
           </w:pPr>
-          <w:hyperlink w:anchor="_Toc172717677" w:history="1">
+          <w:hyperlink w:anchor="_Toc203403179" w:history="1">
             <w:r>
               <w:rPr>
                 <w:rStyle w:val="Hyperlink"/>
@@ -1920,7 +2008,7 @@
                 <w:noProof/>
                 <w:webHidden/>
               </w:rPr>
-              <w:instrText xml:space="preserve"> PAGEREF _Toc172717677 \h </w:instrText>
+              <w:instrText xml:space="preserve"> PAGEREF _Toc203403179 \h </w:instrText>
             </w:r>
             <w:r>
               <w:rPr>
@@ -1940,7 +2028,7 @@
                 <w:noProof/>
                 <w:webHidden/>
               </w:rPr>
-              <w:t>16</w:t>
+              <w:t>17</w:t>
             </w:r>
             <w:r>
               <w:rPr>
@@ -1964,13 +2052,13 @@
               <w:szCs w:val="24"/>
             </w:rPr>
           </w:pPr>
-          <w:hyperlink w:anchor="_Toc172717678" w:history="1">
+          <w:hyperlink w:anchor="_Toc203403180" w:history="1">
             <w:r>
               <w:rPr>
                 <w:rStyle w:val="Hyperlink"/>
                 <w:noProof/>
               </w:rPr>
-              <w:t>A1. Metrics by Driver-Season Type</w:t>
+              <w:t>A1. Time Decay Selection</w:t>
             </w:r>
             <w:r>
               <w:rPr>
@@ -1991,7 +2079,7 @@
                 <w:noProof/>
                 <w:webHidden/>
               </w:rPr>
-              <w:instrText xml:space="preserve"> PAGEREF _Toc172717678 \h </w:instrText>
+              <w:instrText xml:space="preserve"> PAGEREF _Toc203403180 \h </w:instrText>
             </w:r>
             <w:r>
               <w:rPr>
@@ -2011,7 +2099,7 @@
                 <w:noProof/>
                 <w:webHidden/>
               </w:rPr>
-              <w:t>16</w:t>
+              <w:t>17</w:t>
             </w:r>
             <w:r>
               <w:rPr>
@@ -2035,13 +2123,13 @@
               <w:szCs w:val="24"/>
             </w:rPr>
           </w:pPr>
-          <w:hyperlink w:anchor="_Toc172717679" w:history="1">
+          <w:hyperlink w:anchor="_Toc203403181" w:history="1">
             <w:r>
               <w:rPr>
                 <w:rStyle w:val="Hyperlink"/>
                 <w:noProof/>
               </w:rPr>
-              <w:t>A2. Parent Constructor Mapping</w:t>
+              <w:t>A2. Metrics by Driver-Season Type</w:t>
             </w:r>
             <w:r>
               <w:rPr>
@@ -2062,7 +2150,7 @@
                 <w:noProof/>
                 <w:webHidden/>
               </w:rPr>
-              <w:instrText xml:space="preserve"> PAGEREF _Toc172717679 \h </w:instrText>
+              <w:instrText xml:space="preserve"> PAGEREF _Toc203403181 \h </w:instrText>
             </w:r>
             <w:r>
               <w:rPr>
@@ -2082,7 +2170,7 @@
                 <w:noProof/>
                 <w:webHidden/>
               </w:rPr>
-              <w:t>17</w:t>
+              <w:t>18</w:t>
             </w:r>
             <w:r>
               <w:rPr>
@@ -2106,13 +2194,13 @@
               <w:szCs w:val="24"/>
             </w:rPr>
           </w:pPr>
-          <w:hyperlink w:anchor="_Toc172717680" w:history="1">
+          <w:hyperlink w:anchor="_Toc203403182" w:history="1">
             <w:r>
               <w:rPr>
                 <w:rStyle w:val="Hyperlink"/>
                 <w:noProof/>
               </w:rPr>
-              <w:t>A3. Driver/Constructor Ratings as of 2024 British GP</w:t>
+              <w:t>A3. Parent Constructor Mapping</w:t>
             </w:r>
             <w:r>
               <w:rPr>
@@ -2133,7 +2221,7 @@
                 <w:noProof/>
                 <w:webHidden/>
               </w:rPr>
-              <w:instrText xml:space="preserve"> PAGEREF _Toc172717680 \h </w:instrText>
+              <w:instrText xml:space="preserve"> PAGEREF _Toc203403182 \h </w:instrText>
             </w:r>
             <w:r>
               <w:rPr>
@@ -2153,7 +2241,7 @@
                 <w:noProof/>
                 <w:webHidden/>
               </w:rPr>
-              <w:t>17</w:t>
+              <w:t>19</w:t>
             </w:r>
             <w:r>
               <w:rPr>
@@ -2177,13 +2265,13 @@
               <w:szCs w:val="24"/>
             </w:rPr>
           </w:pPr>
-          <w:hyperlink w:anchor="_Toc172717681" w:history="1">
+          <w:hyperlink w:anchor="_Toc203403183" w:history="1">
             <w:r>
               <w:rPr>
                 <w:rStyle w:val="Hyperlink"/>
                 <w:noProof/>
               </w:rPr>
-              <w:t>A4. Driver/Constructor Coefficient/Ratings Trends 2014 - 2024 British GP</w:t>
+              <w:t>A4. Driver/Constructor Ratings as of 2024 British GP</w:t>
             </w:r>
             <w:r>
               <w:rPr>
@@ -2204,7 +2292,7 @@
                 <w:noProof/>
                 <w:webHidden/>
               </w:rPr>
-              <w:instrText xml:space="preserve"> PAGEREF _Toc172717681 \h </w:instrText>
+              <w:instrText xml:space="preserve"> PAGEREF _Toc203403183 \h </w:instrText>
             </w:r>
             <w:r>
               <w:rPr>
@@ -2224,7 +2312,78 @@
                 <w:noProof/>
                 <w:webHidden/>
               </w:rPr>
-              <w:t>20</w:t>
+              <w:t>19</w:t>
+            </w:r>
+            <w:r>
+              <w:rPr>
+                <w:noProof/>
+                <w:webHidden/>
+              </w:rPr>
+              <w:fldChar w:fldCharType="end"/>
+            </w:r>
+          </w:hyperlink>
+        </w:p>
+        <w:p>
+          <w:pPr>
+            <w:pStyle w:val="TOC3"/>
+            <w:tabs>
+              <w:tab w:val="right" w:leader="dot" w:pos="9350"/>
+            </w:tabs>
+            <w:rPr>
+              <w:rFonts w:asciiTheme="minorHAnsi" w:eastAsiaTheme="minorEastAsia" w:hAnsiTheme="minorHAnsi" w:cstheme="minorBidi"/>
+              <w:noProof/>
+              <w:sz w:val="24"/>
+              <w:szCs w:val="24"/>
+            </w:rPr>
+          </w:pPr>
+          <w:hyperlink w:anchor="_Toc203403184" w:history="1">
+            <w:r>
+              <w:rPr>
+                <w:rStyle w:val="Hyperlink"/>
+                <w:noProof/>
+              </w:rPr>
+              <w:t>A5. Driver/Constructor Coefficient/Ratings Trends 2014 - 2024 British GP</w:t>
+            </w:r>
+            <w:r>
+              <w:rPr>
+                <w:noProof/>
+                <w:webHidden/>
+              </w:rPr>
+              <w:tab/>
+            </w:r>
+            <w:r>
+              <w:rPr>
+                <w:noProof/>
+                <w:webHidden/>
+              </w:rPr>
+              <w:fldChar w:fldCharType="begin"/>
+            </w:r>
+            <w:r>
+              <w:rPr>
+                <w:noProof/>
+                <w:webHidden/>
+              </w:rPr>
+              <w:instrText xml:space="preserve"> PAGEREF _Toc203403184 \h </w:instrText>
+            </w:r>
+            <w:r>
+              <w:rPr>
+                <w:noProof/>
+                <w:webHidden/>
+              </w:rPr>
+            </w:r>
+            <w:r>
+              <w:rPr>
+                <w:noProof/>
+                <w:webHidden/>
+              </w:rPr>
+              <w:fldChar w:fldCharType="separate"/>
+            </w:r>
+            <w:r>
+              <w:rPr>
+                <w:noProof/>
+                <w:webHidden/>
+              </w:rPr>
+              <w:t>21</w:t>
             </w:r>
             <w:r>
               <w:rPr>
@@ -2242,7 +2401,6 @@
               <w:bCs/>
               <w:noProof/>
             </w:rPr>
-            <w:lastRenderedPageBreak/>
             <w:fldChar w:fldCharType="end"/>
           </w:r>
         </w:p>
@@ -2257,7 +2415,7 @@
         </w:numPr>
         <w:ind w:left="360"/>
       </w:pPr>
-      <w:bookmarkStart w:id="1" w:name="_Toc172717657"/>
+      <w:bookmarkStart w:id="1" w:name="_Toc203403158"/>
       <w:r>
         <w:t>Abstract</w:t>
       </w:r>
@@ -2285,7 +2443,13 @@
         <w:t xml:space="preserve"> (Sill 2010)</w:t>
       </w:r>
       <w:r>
-        <w:t>, commonly used in basketball and hockey, to identify individual driver and constructor impact. It employs a time-decayed ridge regression with LOESS</w:t>
+        <w:t xml:space="preserve">, commonly used in basketball and hockey, to </w:t>
+      </w:r>
+      <w:r>
+        <w:t>parse out</w:t>
+      </w:r>
+      <w:r>
+        <w:t xml:space="preserve"> individual driver and constructor impact. It employs a time-decayed ridge regression with LOESS</w:t>
       </w:r>
       <w:r>
         <w:t xml:space="preserve"> (Jacoby 2000)</w:t>
@@ -2300,7 +2464,7 @@
         <w:t xml:space="preserve"> </w:t>
       </w:r>
       <w:r>
-        <w:t>Present</w:t>
+        <w:t>2024</w:t>
       </w:r>
       <w:r>
         <w:t>). By mapping the constructor and driver coefficients over time, we measure the relative impact of these individuals throughout the period.</w:t>
@@ -2310,14 +2474,25 @@
       <w:r>
         <w:t xml:space="preserve">Results show that constructors explain </w:t>
       </w:r>
-      <w:r>
-        <w:t>67</w:t>
-      </w:r>
-      <w:r>
-        <w:t>.1</w:t>
-      </w:r>
-      <w:r>
-        <w:t xml:space="preserve">% of the variance in race outcomes, compared to ~88% in previous studies. Additionally, constructors have increased importance in benchmarked rank-agnostic cohorts (e.g., Top 10 points finishers) and decreased importance in qualifying. </w:t>
+      <w:commentRangeStart w:id="2"/>
+      <w:r>
+        <w:t>6</w:t>
+      </w:r>
+      <w:r>
+        <w:t>4.0</w:t>
+      </w:r>
+      <w:r>
+        <w:t xml:space="preserve">% </w:t>
+      </w:r>
+      <w:commentRangeEnd w:id="2"/>
+      <w:r>
+        <w:rPr>
+          <w:rStyle w:val="CommentReference"/>
+        </w:rPr>
+        <w:commentReference w:id="2"/>
+      </w:r>
+      <w:r>
+        <w:t xml:space="preserve">of the variance in race outcomes, compared to ~88% in previous studies. Additionally, constructors have increased importance in benchmarked rank-agnostic cohorts (e.g., Top 10 points finishers) and decreased importance in qualifying. </w:t>
       </w:r>
     </w:p>
     <w:p>
@@ -2333,11 +2508,22 @@
       <w:pPr>
         <w:pStyle w:val="Heading2"/>
       </w:pPr>
-      <w:bookmarkStart w:id="2" w:name="_Toc172717658"/>
+      <w:bookmarkStart w:id="3" w:name="_Toc203403159"/>
+      <w:commentRangeStart w:id="4"/>
       <w:r>
         <w:t>Introduction</w:t>
       </w:r>
-      <w:bookmarkEnd w:id="2"/>
+      <w:commentRangeEnd w:id="4"/>
+      <w:r>
+        <w:rPr>
+          <w:rStyle w:val="CommentReference"/>
+          <w:rFonts w:eastAsiaTheme="minorHAnsi"/>
+          <w:b w:val="0"/>
+          <w:bCs w:val="0"/>
+        </w:rPr>
+        <w:commentReference w:id="4"/>
+      </w:r>
+      <w:bookmarkEnd w:id="3"/>
     </w:p>
     <w:p>
       <w:r>
@@ -2349,7 +2535,10 @@
         <w:t>The significance of the car's role is evident in the historical data. Since 2000, the World Constructors’ Champion has only differed</w:t>
       </w:r>
       <w:r>
-        <w:t xml:space="preserve"> twice</w:t>
+        <w:t xml:space="preserve"> </w:t>
+      </w:r>
+      <w:r>
+        <w:t>thrice</w:t>
       </w:r>
       <w:r>
         <w:t xml:space="preserve"> from the team of the World Drivers’ Champion</w:t>
@@ -2358,7 +2547,13 @@
         <w:t xml:space="preserve"> (Formula 1)</w:t>
       </w:r>
       <w:r>
-        <w:t>. Moreover, in the ten completed seasons of the Hybrid era, the World Drivers’ Champion and runner-up have hailed from the same team on six occasions.</w:t>
+        <w:t xml:space="preserve">. Moreover, in the </w:t>
+      </w:r>
+      <w:r>
+        <w:t>eleven</w:t>
+      </w:r>
+      <w:r>
+        <w:t xml:space="preserve"> completed seasons of the Hybrid era, the World Drivers’ Champion and runner-up have hailed from the same team on six occasions.</w:t>
       </w:r>
     </w:p>
     <w:p>
@@ -2382,23 +2577,23 @@
     </w:p>
     <w:p>
       <w:r>
+        <w:lastRenderedPageBreak/>
         <w:t xml:space="preserve">Moreover, our approach differs from the existing literature. Bell (2016) and </w:t>
       </w:r>
       <w:r>
         <w:t>Kesteren</w:t>
       </w:r>
       <w:r>
-        <w:t xml:space="preserve"> (2023) have produced the most prominent and similar work in the field. Bell's methodology treats a driver's entire career as a single entity, while </w:t>
+        <w:t xml:space="preserve"> (2023) have produced the most similar work in the field. Bell's methodology treats a driver's entire career as a single entity, while </w:t>
       </w:r>
       <w:r>
         <w:t>Kesteren</w:t>
       </w:r>
       <w:r>
-        <w:t xml:space="preserve">'s analysis is conducted at the season level. In contrast, our model </w:t>
-      </w:r>
-      <w:r>
-        <w:lastRenderedPageBreak/>
-        <w:t>evaluates driver and constructor ratings at a race-level granularity. This finer level of detail allows for a more responsive assessment of driver and constructor performance.</w:t>
+        <w:t>'s analysis is conducted at the season level. In contrast, our model evaluates driver and constructor ratings at a race-level granularity. This finer level of detail allows for a more responsive assessment of driver and constructor performance</w:t>
+      </w:r>
+      <w:r>
+        <w:t>, but increased sensitivity introduces greater variance and results in a more volatile trajectory of ratings.</w:t>
       </w:r>
     </w:p>
     <w:p>
@@ -2411,18 +2606,38 @@
       <w:pPr>
         <w:pStyle w:val="Heading2"/>
       </w:pPr>
-      <w:bookmarkStart w:id="3" w:name="_Toc172717659"/>
+      <w:bookmarkStart w:id="5" w:name="_Toc203403160"/>
       <w:r>
         <w:t>Data Processing</w:t>
       </w:r>
-      <w:bookmarkEnd w:id="3"/>
+      <w:bookmarkEnd w:id="5"/>
     </w:p>
     <w:p>
       <w:r>
         <w:t>W</w:t>
       </w:r>
       <w:r>
-        <w:t>e collect data from all Formula 1 races through the Ergast API via the f1dataR R package</w:t>
+        <w:t xml:space="preserve">e collect data from all Formula 1 races through the </w:t>
+      </w:r>
+      <w:proofErr w:type="spellStart"/>
+      <w:r>
+        <w:t>Ergast</w:t>
+      </w:r>
+      <w:proofErr w:type="spellEnd"/>
+      <w:r>
+        <w:t xml:space="preserve"> API</w:t>
+      </w:r>
+      <w:r>
+        <w:t xml:space="preserve"> &amp; </w:t>
+      </w:r>
+      <w:r>
+        <w:t>Jolpica-F1</w:t>
+      </w:r>
+      <w:r>
+        <w:t>project</w:t>
+      </w:r>
+      <w:r>
+        <w:t xml:space="preserve"> via the f1dataR R package</w:t>
       </w:r>
       <w:r>
         <w:t xml:space="preserve"> (Ergast, f1dataR)</w:t>
@@ -2432,14 +2647,156 @@
       </w:r>
     </w:p>
     <w:p>
-      <w:r>
-        <w:t xml:space="preserve">For our primary model, we exclude non-finishers (DNF) to avoid the additional noise and complexity they introduce to the outcome of interest, as similarly noted by </w:t>
+      <w:commentRangeStart w:id="6"/>
+      <w:r>
+        <w:t xml:space="preserve">For </w:t>
+      </w:r>
+      <w:commentRangeEnd w:id="6"/>
+      <w:r>
+        <w:rPr>
+          <w:rStyle w:val="CommentReference"/>
+        </w:rPr>
+        <w:commentReference w:id="6"/>
+      </w:r>
+      <w:r>
+        <w:t xml:space="preserve">our primary model, we exclude non-finishers (DNF) to avoid the additional noise and complexity they introduce to the outcome of interest, as similarly noted by </w:t>
       </w:r>
       <w:r>
         <w:t>Kesteren</w:t>
       </w:r>
       <w:r>
-        <w:t xml:space="preserve"> (2023). Assigning the root cause of certain DNFs, particularly driver-driver collisions, can be challenging. Given the time-decay and point-in-time nature of our study, indexing on DNFs may disproportionately add negative noise to a driver or constructor coefficient. However, we also test model variants that include DNFs wholly and another that partially assigns DNF cause to either driver or constructor based on the type of DNF. DNFs categorized as Collision, Accident, or Spun-Off are attributed to driver fault, while other causes are attributed to constructor fault.</w:t>
+        <w:t xml:space="preserve"> (2023). </w:t>
+      </w:r>
+    </w:p>
+    <w:p>
+      <w:pPr>
+        <w:keepNext/>
+      </w:pPr>
+      <w:r>
+        <w:rPr>
+          <w:noProof/>
+        </w:rPr>
+        <w:drawing>
+          <wp:inline distT="0" distB="0" distL="0" distR="0" wp14:anchorId="2B3ECA8E" wp14:editId="34BD3BB6">
+            <wp:extent cx="5943600" cy="2971800"/>
+            <wp:effectExtent l="0" t="0" r="0" b="0"/>
+            <wp:docPr id="38088905" name="Picture 1" descr="A screen shot of a graph&#10;&#10;AI-generated content may be incorrect."/>
+            <wp:cNvGraphicFramePr>
+              <a:graphicFrameLocks xmlns:a="http://schemas.openxmlformats.org/drawingml/2006/main" noChangeAspect="1"/>
+            </wp:cNvGraphicFramePr>
+            <a:graphic xmlns:a="http://schemas.openxmlformats.org/drawingml/2006/main">
+              <a:graphicData uri="http://schemas.openxmlformats.org/drawingml/2006/picture">
+                <pic:pic xmlns:pic="http://schemas.openxmlformats.org/drawingml/2006/picture">
+                  <pic:nvPicPr>
+                    <pic:cNvPr id="38088905" name="Picture 1" descr="A screen shot of a graph&#10;&#10;AI-generated content may be incorrect."/>
+                    <pic:cNvPicPr/>
+                  </pic:nvPicPr>
+                  <pic:blipFill>
+                    <a:blip r:embed="rId17" cstate="print">
+                      <a:extLst>
+                        <a:ext uri="{28A0092B-C50C-407E-A947-70E740481C1C}">
+                          <a14:useLocalDpi xmlns:a14="http://schemas.microsoft.com/office/drawing/2010/main" val="0"/>
+                        </a:ext>
+                      </a:extLst>
+                    </a:blip>
+                    <a:stretch>
+                      <a:fillRect/>
+                    </a:stretch>
+                  </pic:blipFill>
+                  <pic:spPr>
+                    <a:xfrm>
+                      <a:off x="0" y="0"/>
+                      <a:ext cx="5943600" cy="2971800"/>
+                    </a:xfrm>
+                    <a:prstGeom prst="rect">
+                      <a:avLst/>
+                    </a:prstGeom>
+                  </pic:spPr>
+                </pic:pic>
+              </a:graphicData>
+            </a:graphic>
+          </wp:inline>
+        </w:drawing>
+      </w:r>
+    </w:p>
+    <w:p>
+      <w:pPr>
+        <w:pStyle w:val="Caption"/>
+      </w:pPr>
+      <w:r>
+        <w:t xml:space="preserve">Figure </w:t>
+      </w:r>
+      <w:fldSimple w:instr=" SEQ Figure \* ARABIC ">
+        <w:r>
+          <w:rPr>
+            <w:noProof/>
+          </w:rPr>
+          <w:t>1</w:t>
+        </w:r>
+      </w:fldSimple>
+      <w:r>
+        <w:t xml:space="preserve"> Top DNF reasons from 2014 to 2024. DNFs are initially attributed to drivers, </w:t>
+      </w:r>
+      <w:proofErr w:type="spellStart"/>
+      <w:r>
+        <w:t>construcotrs</w:t>
+      </w:r>
+      <w:proofErr w:type="spellEnd"/>
+      <w:r>
+        <w:t>, or neither based on author discretion</w:t>
+      </w:r>
+    </w:p>
+    <w:p>
+      <w:r>
+        <w:t>As seen in Figure 1, there’s a myriad of DNF reasons, with the plurality coming from accident or collisions. However, a</w:t>
+      </w:r>
+      <w:r>
+        <w:t xml:space="preserve">ssigning the root cause of certain DNFs, particularly driver-driver collisions, can be challenging. </w:t>
+      </w:r>
+      <w:r>
+        <w:t xml:space="preserve">For example, in </w:t>
+      </w:r>
+      <w:proofErr w:type="gramStart"/>
+      <w:r>
+        <w:t>the  2024</w:t>
+      </w:r>
+      <w:proofErr w:type="gramEnd"/>
+      <w:r>
+        <w:t xml:space="preserve">Canada GP, both Albon and Sainz had their </w:t>
+      </w:r>
+      <w:r>
+        <w:t xml:space="preserve">DNFs classified as </w:t>
+      </w:r>
+      <w:r>
+        <w:rPr>
+          <w:i/>
+          <w:iCs/>
+        </w:rPr>
+        <w:t>Collision</w:t>
+      </w:r>
+      <w:r>
+        <w:t xml:space="preserve">. This would result in both drivers and constructors being penalized in the proposed rating system despite the collision being driven by Sainz and Ferrari. </w:t>
+      </w:r>
+      <w:r>
+        <w:t>Additionally g</w:t>
+      </w:r>
+      <w:r>
+        <w:t>iven the time-decay and point-in-time nature of our study, indexing on DNFs may disproportionately add negative noise to a driver or constructor coefficient.</w:t>
+      </w:r>
+    </w:p>
+    <w:p/>
+    <w:p/>
+    <w:p>
+      <w:r>
+        <w:t xml:space="preserve">However, we also test model variants that include DNFs wholly and another that partially assigns DNF cause to either driver or constructor based on the type of DNF. DNFs categorized as Collision, Accident, or </w:t>
+      </w:r>
+      <w:proofErr w:type="gramStart"/>
+      <w:r>
+        <w:t>Spun-Off</w:t>
+      </w:r>
+      <w:proofErr w:type="gramEnd"/>
+      <w:r>
+        <w:t xml:space="preserve"> are attributed to driver fault, while other causes are attributed to constructor fault.</w:t>
       </w:r>
     </w:p>
     <w:p>
@@ -2449,13 +2806,32 @@
     </w:p>
     <w:p>
       <w:r>
-        <w:t>The response variable is the rank finish of the driver-constructor pair in a given race. Points-scoring positions (ranks 1 to 10) are weighted equally, as drivers are expected to compete equally for these positions. Positions beyond 10 are weighted on a linear decay until the last position, reflecting the expectation that the effort expended for lower places is probably less than that for the top places (Henderson, 2021).</w:t>
-      </w:r>
-      <w:r>
-        <w:t xml:space="preserve"> The </w:t>
+        <w:t xml:space="preserve">The response variable is the rank finish of the driver-constructor pair </w:t>
+      </w:r>
+      <w:proofErr w:type="gramStart"/>
+      <w:r>
+        <w:t>in a given</w:t>
+      </w:r>
+      <w:proofErr w:type="gramEnd"/>
+      <w:r>
+        <w:t xml:space="preserve"> race. Points-scoring positions (ranks 1 to 10) are weighted equally, as drivers are expected to compete equally for these positions. Positions beyond 10 are weighted on a linear decay until the last position, reflecting the expectation that the effort expended for lower places is probably less than that for the top places (Henderson, 2021).</w:t>
+      </w:r>
+      <w:r>
+        <w:t xml:space="preserve"> </w:t>
+      </w:r>
+      <w:commentRangeStart w:id="7"/>
+      <w:r>
+        <w:t xml:space="preserve">The </w:t>
       </w:r>
       <w:r>
         <w:t xml:space="preserve">calculation of rank finishing weights is seen below in (1). </w:t>
+      </w:r>
+      <w:commentRangeEnd w:id="7"/>
+      <w:r>
+        <w:rPr>
+          <w:rStyle w:val="CommentReference"/>
+        </w:rPr>
+        <w:commentReference w:id="7"/>
       </w:r>
     </w:p>
     <w:p/>
@@ -2769,12 +3145,11 @@
       <w:pPr>
         <w:pStyle w:val="Heading2"/>
       </w:pPr>
-      <w:bookmarkStart w:id="4" w:name="_Toc172717660"/>
-      <w:r>
-        <w:lastRenderedPageBreak/>
+      <w:bookmarkStart w:id="8" w:name="_Toc203403161"/>
+      <w:r>
         <w:t>Methods</w:t>
       </w:r>
-      <w:bookmarkEnd w:id="4"/>
+      <w:bookmarkEnd w:id="8"/>
     </w:p>
     <w:p>
       <w:pPr>
@@ -2783,11 +3158,19 @@
       <w:r>
         <w:t xml:space="preserve"> </w:t>
       </w:r>
-      <w:bookmarkStart w:id="5" w:name="_Toc172717661"/>
-      <w:r>
-        <w:t>Linear Model With Ridge Regression</w:t>
-      </w:r>
-      <w:bookmarkEnd w:id="5"/>
+      <w:bookmarkStart w:id="9" w:name="_Toc203403162"/>
+      <w:r>
+        <w:t xml:space="preserve">Linear Model </w:t>
+      </w:r>
+      <w:proofErr w:type="gramStart"/>
+      <w:r>
+        <w:t>With</w:t>
+      </w:r>
+      <w:proofErr w:type="gramEnd"/>
+      <w:r>
+        <w:t xml:space="preserve"> Ridge Regression</w:t>
+      </w:r>
+      <w:bookmarkEnd w:id="9"/>
     </w:p>
     <w:p>
       <w:pPr>
@@ -2887,6 +3270,7 @@
           <m:t>β</m:t>
         </m:r>
       </m:oMath>
+      <w:proofErr w:type="gramStart"/>
       <w:r>
         <w:rPr>
           <w:rFonts w:ascii="Cambria Math" w:eastAsiaTheme="minorEastAsia" w:hAnsi="Cambria Math"/>
@@ -2901,7 +3285,16 @@
           <w:i/>
           <w:iCs/>
         </w:rPr>
-        <w:t>Matrix of individual driver and constructor coefficients</w:t>
+        <w:t>Matrix</w:t>
+      </w:r>
+      <w:proofErr w:type="gramEnd"/>
+      <w:r>
+        <w:rPr>
+          <w:rFonts w:ascii="Cambria Math" w:eastAsiaTheme="minorEastAsia" w:hAnsi="Cambria Math"/>
+          <w:i/>
+          <w:iCs/>
+        </w:rPr>
+        <w:t xml:space="preserve"> of individual driver and constructor coefficients</w:t>
       </w:r>
     </w:p>
     <w:p>
@@ -4255,7 +4648,13 @@
         <w:t>the equations highlighted in (3)</w:t>
       </w:r>
       <w:r>
-        <w:t>, where constants are optimized against mean absolute error (MAE). This exponential decay approach is borrowed from similar NBA player impact ratings</w:t>
+        <w:t>, where constants are optimized against mean absolute error (MAE)</w:t>
+      </w:r>
+      <w:r>
+        <w:t xml:space="preserve"> – see Appendix A1 for hyperparameter selection detail</w:t>
+      </w:r>
+      <w:r>
+        <w:t>. This exponential decay approach is borrowed from similar NBA player impact ratings</w:t>
       </w:r>
       <w:r>
         <w:t xml:space="preserve">, </w:t>
@@ -4538,17 +4937,31 @@
     <w:p>
       <w:pPr>
         <w:jc w:val="right"/>
-      </w:pPr>
-      <w:r>
         <w:rPr>
           <w:rFonts w:eastAsiaTheme="minorEastAsia"/>
         </w:rPr>
+      </w:pPr>
+      <w:r>
+        <w:rPr>
+          <w:rFonts w:eastAsiaTheme="minorEastAsia"/>
+        </w:rPr>
         <w:t>(3)</w:t>
       </w:r>
     </w:p>
     <w:p>
-      <w:r>
-        <w:t>We combine the time-decay weights with the rank position weights described in section 2 as shown in (4).</w:t>
+      <w:commentRangeStart w:id="10"/>
+      <w:r>
+        <w:t xml:space="preserve">We </w:t>
+      </w:r>
+      <w:commentRangeEnd w:id="10"/>
+      <w:r>
+        <w:rPr>
+          <w:rStyle w:val="CommentReference"/>
+        </w:rPr>
+        <w:commentReference w:id="10"/>
+      </w:r>
+      <w:r>
+        <w:t>combine the time-decay weights with the rank position weights described in section 2 as shown in (4).</w:t>
       </w:r>
     </w:p>
     <w:p>
@@ -4681,7 +5094,6 @@
         <w:rPr>
           <w:rFonts w:eastAsiaTheme="minorEastAsia"/>
         </w:rPr>
-        <w:lastRenderedPageBreak/>
         <w:t>(4)</w:t>
       </w:r>
     </w:p>
@@ -4710,14 +5122,14 @@
           <w:rFonts w:eastAsiaTheme="minorEastAsia"/>
         </w:rPr>
       </w:pPr>
-      <w:bookmarkStart w:id="6" w:name="_Toc172717662"/>
+      <w:bookmarkStart w:id="11" w:name="_Toc203403163"/>
       <w:r>
         <w:rPr>
           <w:rFonts w:eastAsiaTheme="minorEastAsia"/>
         </w:rPr>
         <w:t>Features</w:t>
       </w:r>
-      <w:bookmarkEnd w:id="6"/>
+      <w:bookmarkEnd w:id="11"/>
     </w:p>
     <w:p>
       <w:r>
@@ -4743,14 +5155,14 @@
           <w:rFonts w:eastAsiaTheme="minorEastAsia"/>
         </w:rPr>
       </w:pPr>
-      <w:bookmarkStart w:id="7" w:name="_Toc172717663"/>
+      <w:bookmarkStart w:id="12" w:name="_Toc203403164"/>
       <w:r>
         <w:rPr>
           <w:rFonts w:eastAsiaTheme="minorEastAsia"/>
         </w:rPr>
         <w:t>Coefficient Smoothing</w:t>
       </w:r>
-      <w:bookmarkEnd w:id="7"/>
+      <w:bookmarkEnd w:id="12"/>
       <w:r>
         <w:rPr>
           <w:rFonts w:eastAsiaTheme="minorEastAsia"/>
@@ -4781,8 +5193,9 @@
         <w:rPr>
           <w:noProof/>
         </w:rPr>
+        <w:lastRenderedPageBreak/>
         <w:drawing>
-          <wp:inline distT="0" distB="0" distL="0" distR="0" wp14:anchorId="3179FCA6" wp14:editId="60854878">
+          <wp:inline distT="0" distB="0" distL="0" distR="0" wp14:anchorId="3179FCA6" wp14:editId="2B10FFA9">
             <wp:extent cx="5486400" cy="2743200"/>
             <wp:effectExtent l="0" t="0" r="0" b="0"/>
             <wp:docPr id="1792358666" name="Picture 1"/>
@@ -4799,7 +5212,7 @@
                     </pic:cNvPicPr>
                   </pic:nvPicPr>
                   <pic:blipFill>
-                    <a:blip r:embed="rId13" cstate="print">
+                    <a:blip r:embed="rId18" cstate="print">
                       <a:extLst>
                         <a:ext uri="{28A0092B-C50C-407E-A947-70E740481C1C}">
                           <a14:useLocalDpi xmlns:a14="http://schemas.microsoft.com/office/drawing/2010/main" val="0"/>
@@ -4873,7 +5286,7 @@
           <w:noProof/>
           <w:color w:val="auto"/>
         </w:rPr>
-        <w:t>1</w:t>
+        <w:t>2</w:t>
       </w:r>
       <w:r>
         <w:rPr>
@@ -5310,7 +5723,6 @@
         <w:jc w:val="right"/>
       </w:pPr>
       <w:r>
-        <w:lastRenderedPageBreak/>
         <w:t>(5)</w:t>
       </w:r>
     </w:p>
@@ -5331,8 +5743,9 @@
         <w:rPr>
           <w:noProof/>
         </w:rPr>
+        <w:lastRenderedPageBreak/>
         <w:drawing>
-          <wp:inline distT="0" distB="0" distL="0" distR="0" wp14:anchorId="5EB38752" wp14:editId="7B4D5365">
+          <wp:inline distT="0" distB="0" distL="0" distR="0" wp14:anchorId="5EB38752" wp14:editId="51865FAB">
             <wp:extent cx="5486400" cy="2743200"/>
             <wp:effectExtent l="0" t="0" r="0" b="0"/>
             <wp:docPr id="1158603833" name="Picture 2"/>
@@ -5349,7 +5762,7 @@
                     </pic:cNvPicPr>
                   </pic:nvPicPr>
                   <pic:blipFill>
-                    <a:blip r:embed="rId14" cstate="print">
+                    <a:blip r:embed="rId19" cstate="print">
                       <a:extLst>
                         <a:ext uri="{28A0092B-C50C-407E-A947-70E740481C1C}">
                           <a14:useLocalDpi xmlns:a14="http://schemas.microsoft.com/office/drawing/2010/main" val="0"/>
@@ -5423,7 +5836,7 @@
           <w:noProof/>
           <w:color w:val="auto"/>
         </w:rPr>
-        <w:t>2</w:t>
+        <w:t>3</w:t>
       </w:r>
       <w:r>
         <w:rPr>
@@ -5458,11 +5871,11 @@
       <w:pPr>
         <w:pStyle w:val="Heading3"/>
       </w:pPr>
-      <w:bookmarkStart w:id="8" w:name="_Toc172717664"/>
+      <w:bookmarkStart w:id="13" w:name="_Toc203403165"/>
       <w:r>
         <w:t>Bootstrapping</w:t>
       </w:r>
-      <w:bookmarkEnd w:id="8"/>
+      <w:bookmarkEnd w:id="13"/>
     </w:p>
     <w:p>
       <w:pPr>
@@ -5486,18 +5899,26 @@
         <w:t>Croiseau</w:t>
       </w:r>
       <w:r>
-        <w:t xml:space="preserve"> 2009). As such, the confidence intervals provided have limited value for sensitivity analysis, but provide directional indicators to the variability of coefficients relatively to each other. </w:t>
+        <w:t xml:space="preserve"> 2009). As such, the confidence intervals provided have limited value for sensitivity </w:t>
+      </w:r>
+      <w:proofErr w:type="gramStart"/>
+      <w:r>
+        <w:t>analysis, but</w:t>
+      </w:r>
+      <w:proofErr w:type="gramEnd"/>
+      <w:r>
+        <w:t xml:space="preserve"> provide directional indicators to the variability of coefficients relatively to each other. </w:t>
       </w:r>
     </w:p>
     <w:p>
       <w:pPr>
         <w:pStyle w:val="Heading3"/>
       </w:pPr>
-      <w:bookmarkStart w:id="9" w:name="_Toc172717665"/>
+      <w:bookmarkStart w:id="14" w:name="_Toc203403166"/>
       <w:r>
         <w:t>Testing</w:t>
       </w:r>
-      <w:bookmarkEnd w:id="9"/>
+      <w:bookmarkEnd w:id="14"/>
     </w:p>
     <w:p>
       <w:r>
@@ -5510,7 +5931,38 @@
         <w:t>𝜏</w:t>
       </w:r>
       <w:r>
-        <w:t xml:space="preserve"> coefficient as our test metric due to its interpretability and robustness to outliers (versus Spearman Rho). Robustness to outliers is particularly important in DNF-inclusive models.</w:t>
+        <w:t xml:space="preserve"> coefficient as our test metric due to its interpretability and robustness to outliers (versus Spearman Rho). </w:t>
+      </w:r>
+      <w:commentRangeStart w:id="15"/>
+      <w:r>
+        <w:t>Robustness to outliers is particularly important in DNF-inclusive models.</w:t>
+      </w:r>
+      <w:commentRangeEnd w:id="15"/>
+      <w:r>
+        <w:rPr>
+          <w:rStyle w:val="CommentReference"/>
+        </w:rPr>
+        <w:commentReference w:id="15"/>
+      </w:r>
+      <w:r>
+        <w:t xml:space="preserve"> </w:t>
+      </w:r>
+      <w:r>
+        <w:t>Alternatively, normalized discounted cumulative gain (</w:t>
+      </w:r>
+      <w:proofErr w:type="spellStart"/>
+      <w:r>
+        <w:t>nDCG</w:t>
+      </w:r>
+      <w:proofErr w:type="spellEnd"/>
+      <w:r>
+        <w:t xml:space="preserve">) was considered due to its emphasis at the top of the ranking, however the inability to decompose driver and constructor impact would limit its </w:t>
+      </w:r>
+      <w:r>
+        <w:t>interpretability</w:t>
+      </w:r>
+      <w:r>
+        <w:t xml:space="preserve">. </w:t>
       </w:r>
     </w:p>
     <w:p>
@@ -5518,7 +5970,6 @@
         <w:pStyle w:val="Heading4"/>
       </w:pPr>
       <w:r>
-        <w:lastRenderedPageBreak/>
         <w:t>Test Data</w:t>
       </w:r>
     </w:p>
@@ -5549,43 +6000,72 @@
           <w:sz w:val="22"/>
           <w:szCs w:val="22"/>
         </w:rPr>
-        <w:t>we look at the 2014 to 2023 Formula 1 seasons. 2012 and 20</w:t>
+        <w:t xml:space="preserve">we look at the 2014 to </w:t>
       </w:r>
       <w:r>
         <w:rPr>
           <w:sz w:val="22"/>
           <w:szCs w:val="22"/>
         </w:rPr>
-        <w:t>13 seasons serve as a warm start for the model</w:t>
+        <w:t>2024</w:t>
       </w:r>
       <w:r>
         <w:rPr>
           <w:sz w:val="22"/>
           <w:szCs w:val="22"/>
         </w:rPr>
-        <w:t xml:space="preserve">, </w:t>
+        <w:t xml:space="preserve"> Formula 1 seasons. 2012 and 20</w:t>
       </w:r>
       <w:r>
         <w:rPr>
           <w:sz w:val="22"/>
           <w:szCs w:val="22"/>
         </w:rPr>
-        <w:t xml:space="preserve">while 2023 was the last completed Formula 1 season at the time of this analysis. </w:t>
-      </w:r>
-    </w:p>
-    <w:p>
-      <w:pPr>
-        <w:pStyle w:val="NormalWeb"/>
+        <w:t>13 seasons serve as a warm start for the model</w:t>
+      </w:r>
+      <w:r>
         <w:rPr>
           <w:sz w:val="22"/>
           <w:szCs w:val="22"/>
         </w:rPr>
-      </w:pPr>
+        <w:t xml:space="preserve">, </w:t>
+      </w:r>
       <w:r>
         <w:rPr>
           <w:sz w:val="22"/>
           <w:szCs w:val="22"/>
         </w:rPr>
+        <w:t xml:space="preserve">while </w:t>
+      </w:r>
+      <w:r>
+        <w:rPr>
+          <w:sz w:val="22"/>
+          <w:szCs w:val="22"/>
+        </w:rPr>
+        <w:t>2024</w:t>
+      </w:r>
+      <w:r>
+        <w:rPr>
+          <w:sz w:val="22"/>
+          <w:szCs w:val="22"/>
+        </w:rPr>
+        <w:t xml:space="preserve"> was the last completed Formula 1 season at the time of this analysis. </w:t>
+      </w:r>
+    </w:p>
+    <w:p>
+      <w:pPr>
+        <w:pStyle w:val="NormalWeb"/>
+        <w:rPr>
+          <w:sz w:val="22"/>
+          <w:szCs w:val="22"/>
+        </w:rPr>
+      </w:pPr>
+      <w:r>
+        <w:rPr>
+          <w:sz w:val="22"/>
+          <w:szCs w:val="22"/>
+        </w:rPr>
+        <w:lastRenderedPageBreak/>
         <w:t xml:space="preserve">The test data is the immediate next race following the current race </w:t>
       </w:r>
       <w:r>
@@ -5633,14 +6113,31 @@
           <w:szCs w:val="22"/>
           <w:vertAlign w:val="subscript"/>
         </w:rPr>
-        <w:t xml:space="preserve">2016, Round 5 </w:t>
-      </w:r>
+        <w:t xml:space="preserve">2016, Round </w:t>
+      </w:r>
+      <w:proofErr w:type="gramStart"/>
       <w:r>
         <w:rPr>
           <w:sz w:val="22"/>
           <w:szCs w:val="22"/>
-        </w:rPr>
-        <w:t xml:space="preserve">) predicts the outcomes for the 2016 Monaco Grand Prix (2016 season, round 6). The predictions from the model are linearly ranked and used as </w:t>
+          <w:vertAlign w:val="subscript"/>
+        </w:rPr>
+        <w:t xml:space="preserve">5 </w:t>
+      </w:r>
+      <w:r>
+        <w:rPr>
+          <w:sz w:val="22"/>
+          <w:szCs w:val="22"/>
+        </w:rPr>
+        <w:t>)</w:t>
+      </w:r>
+      <w:proofErr w:type="gramEnd"/>
+      <w:r>
+        <w:rPr>
+          <w:sz w:val="22"/>
+          <w:szCs w:val="22"/>
+        </w:rPr>
+        <w:t xml:space="preserve"> predicts the outcomes for the 2016 Monaco Grand Prix (2016 season, round 6). The predictions from the model are linearly ranked and used as </w:t>
       </w:r>
       <w:r>
         <w:rPr>
@@ -6816,7 +7313,27 @@
           <w:sz w:val="20"/>
           <w:szCs w:val="20"/>
         </w:rPr>
-        <w:t>the Kendall’s Tau between constructors-only predictions  and drivers-only predictions</w:t>
+        <w:t xml:space="preserve">the Kendall’s Tau between constructors-only </w:t>
+      </w:r>
+      <w:proofErr w:type="gramStart"/>
+      <w:r>
+        <w:rPr>
+          <w:rFonts w:eastAsiaTheme="minorEastAsia"/>
+          <w:iCs/>
+          <w:sz w:val="20"/>
+          <w:szCs w:val="20"/>
+        </w:rPr>
+        <w:t>predictions  and</w:t>
+      </w:r>
+      <w:proofErr w:type="gramEnd"/>
+      <w:r>
+        <w:rPr>
+          <w:rFonts w:eastAsiaTheme="minorEastAsia"/>
+          <w:iCs/>
+          <w:sz w:val="20"/>
+          <w:szCs w:val="20"/>
+        </w:rPr>
+        <w:t xml:space="preserve"> drivers-only predictions</w:t>
       </w:r>
     </w:p>
     <w:p>
@@ -6832,10 +7349,18 @@
         <w:t>From there, we</w:t>
       </w:r>
       <w:r>
-        <w:t xml:space="preserve"> are</w:t>
-      </w:r>
-      <w:r>
-        <w:t xml:space="preserve"> able to describe the proportion variance explained by drivers versus constructors.</w:t>
+        <w:t xml:space="preserve"> </w:t>
+      </w:r>
+      <w:proofErr w:type="gramStart"/>
+      <w:r>
+        <w:t>are</w:t>
+      </w:r>
+      <w:r>
+        <w:t xml:space="preserve"> able to</w:t>
+      </w:r>
+      <w:proofErr w:type="gramEnd"/>
+      <w:r>
+        <w:t xml:space="preserve"> describe the proportion variance explained by drivers versus constructors.</w:t>
       </w:r>
     </w:p>
     <w:p/>
@@ -6995,23 +7520,23 @@
         <w:rPr>
           <w:rFonts w:eastAsiaTheme="minorEastAsia"/>
         </w:rPr>
+        <w:t>(8)</w:t>
+      </w:r>
+    </w:p>
+    <w:p>
+      <w:pPr>
+        <w:pStyle w:val="Heading3"/>
+      </w:pPr>
+      <w:bookmarkStart w:id="16" w:name="_Toc203403167"/>
+      <w:r>
+        <w:t>Logistic Model</w:t>
+      </w:r>
+      <w:bookmarkEnd w:id="16"/>
+    </w:p>
+    <w:p/>
+    <w:p>
+      <w:r>
         <w:lastRenderedPageBreak/>
-        <w:t>(8)</w:t>
-      </w:r>
-    </w:p>
-    <w:p>
-      <w:pPr>
-        <w:pStyle w:val="Heading3"/>
-      </w:pPr>
-      <w:bookmarkStart w:id="10" w:name="_Toc172717666"/>
-      <w:r>
-        <w:t>Logistic Model</w:t>
-      </w:r>
-      <w:bookmarkEnd w:id="10"/>
-    </w:p>
-    <w:p/>
-    <w:p>
-      <w:r>
         <w:t>In addition to the linear ridge regression, we design</w:t>
       </w:r>
       <w:r>
@@ -7993,11 +8518,11 @@
       <w:pPr>
         <w:pStyle w:val="Heading2"/>
       </w:pPr>
-      <w:bookmarkStart w:id="11" w:name="_Toc172717667"/>
+      <w:bookmarkStart w:id="17" w:name="_Toc203403168"/>
       <w:r>
         <w:t>Results</w:t>
       </w:r>
-      <w:bookmarkEnd w:id="11"/>
+      <w:bookmarkEnd w:id="17"/>
     </w:p>
     <w:p>
       <w:pPr>
@@ -8006,14 +8531,14 @@
       <w:r>
         <w:t xml:space="preserve"> </w:t>
       </w:r>
-      <w:bookmarkStart w:id="12" w:name="_Toc172717668"/>
+      <w:bookmarkStart w:id="18" w:name="_Toc203403169"/>
       <w:r>
         <w:t xml:space="preserve">Linear Model </w:t>
       </w:r>
       <w:r>
         <w:t>Results</w:t>
       </w:r>
-      <w:bookmarkEnd w:id="12"/>
+      <w:bookmarkEnd w:id="18"/>
     </w:p>
     <w:p/>
     <w:p>
@@ -8088,9 +8613,9 @@
           <w:noProof/>
         </w:rPr>
         <w:drawing>
-          <wp:inline distT="0" distB="0" distL="0" distR="0" wp14:anchorId="3483145F" wp14:editId="6EB220DB">
-            <wp:extent cx="5486400" cy="1686847"/>
-            <wp:effectExtent l="0" t="0" r="0" b="8890"/>
+          <wp:inline distT="0" distB="0" distL="0" distR="0" wp14:anchorId="3483145F" wp14:editId="2AF938A6">
+            <wp:extent cx="5486400" cy="1535746"/>
+            <wp:effectExtent l="0" t="0" r="0" b="1270"/>
             <wp:docPr id="502443583" name="Picture 1"/>
             <wp:cNvGraphicFramePr>
               <a:graphicFrameLocks xmlns:a="http://schemas.openxmlformats.org/drawingml/2006/main" noChangeAspect="1"/>
@@ -8105,7 +8630,7 @@
                     </pic:cNvPicPr>
                   </pic:nvPicPr>
                   <pic:blipFill>
-                    <a:blip r:embed="rId15" cstate="print">
+                    <a:blip r:embed="rId20" cstate="print">
                       <a:extLst>
                         <a:ext uri="{28A0092B-C50C-407E-A947-70E740481C1C}">
                           <a14:useLocalDpi xmlns:a14="http://schemas.microsoft.com/office/drawing/2010/main" val="0"/>
@@ -8119,7 +8644,7 @@
                   <pic:spPr bwMode="auto">
                     <a:xfrm>
                       <a:off x="0" y="0"/>
-                      <a:ext cx="5486400" cy="1686847"/>
+                      <a:ext cx="5486400" cy="1535746"/>
                     </a:xfrm>
                     <a:prstGeom prst="rect">
                       <a:avLst/>
@@ -8170,7 +8695,10 @@
         <w:t xml:space="preserve">The </w:t>
       </w:r>
       <w:r>
-        <w:t>67.1</w:t>
+        <w:t>64</w:t>
+      </w:r>
+      <w:r>
+        <w:t>.1</w:t>
       </w:r>
       <w:r>
         <w:t xml:space="preserve">% variance explained by constructors in the DNF-excluded model contrasts with the 88% constructor-explained variance that </w:t>
@@ -8179,16 +8707,34 @@
         <w:t>Kesteren</w:t>
       </w:r>
       <w:r>
-        <w:t xml:space="preserve"> (2023) reported. The </w:t>
+        <w:t xml:space="preserve"> (2023) reported. </w:t>
+      </w:r>
+      <w:r>
+        <w:t>While the</w:t>
+      </w:r>
+      <w:r>
+        <w:t xml:space="preserve"> </w:t>
       </w:r>
       <w:r>
         <w:t>intuitive</w:t>
       </w:r>
       <w:r>
-        <w:t xml:space="preserve"> thought is that the large difference is explained by the two additional years the </w:t>
-      </w:r>
-      <w:r>
-        <w:t>linear regression model covers</w:t>
+        <w:t xml:space="preserve"> thought is that the large difference is explained by the </w:t>
+      </w:r>
+      <w:r>
+        <w:t>three</w:t>
+      </w:r>
+      <w:r>
+        <w:t xml:space="preserve"> additional years </w:t>
+      </w:r>
+      <w:r>
+        <w:t xml:space="preserve">the proposed methodology </w:t>
+      </w:r>
+      <w:r>
+        <w:t>covers</w:t>
+      </w:r>
+      <w:r>
+        <w:t>, results show that is unlikely</w:t>
       </w:r>
       <w:r>
         <w:t xml:space="preserve">. Furthermore, the 2014-2021 timeframe perfectly encapsulates the 8 consecutive championships Mercedes won; 5 of which had Mercedes drivers finishing 1st and 2nd. However, when testing the ridge regression model on the same 2014-2021 cohort, we found an implied constructor influence </w:t>
@@ -8203,7 +8749,24 @@
         <w:t>%</w:t>
       </w:r>
       <w:r>
-        <w:t>. Consequently, we find only a small portion of the difference is explained through a difference in model data. The other differences are explained through the difference in the model itself and the model testing.</w:t>
+        <w:t xml:space="preserve">. Consequently, we find only a small portion of the difference is explained through a difference in model data. The </w:t>
+      </w:r>
+      <w:r>
+        <w:t xml:space="preserve">difference </w:t>
+      </w:r>
+      <w:proofErr w:type="gramStart"/>
+      <w:r>
+        <w:t>are</w:t>
+      </w:r>
+      <w:proofErr w:type="gramEnd"/>
+      <w:r>
+        <w:t xml:space="preserve"> largely </w:t>
+      </w:r>
+      <w:r>
+        <w:t>explained through the difference in the model itself and the model testing</w:t>
+      </w:r>
+      <w:r>
+        <w:t xml:space="preserve">, potentially due to the difference in model granularity – race vs season level. </w:t>
       </w:r>
     </w:p>
     <w:p>
@@ -8214,10 +8777,16 @@
         </w:rPr>
       </w:pPr>
       <w:r>
-        <w:t>In the DNF-inclusive model, 7</w:t>
-      </w:r>
-      <w:r>
-        <w:t>9.6</w:t>
+        <w:t xml:space="preserve">In the DNF-inclusive model, </w:t>
+      </w:r>
+      <w:r>
+        <w:t>76</w:t>
+      </w:r>
+      <w:r>
+        <w:t>.</w:t>
+      </w:r>
+      <w:r>
+        <w:t>1</w:t>
       </w:r>
       <w:r>
         <w:t>% of the variance is explained by constructors, compared to 86% in Bell's DNF-inclusive model (Bell 2016). That difference can be likely explained through the wider time frame Bell uses (1979 - 2014). Classification percentage, a percentage of how many racers finished 90%+ of the race, has significantly increased over time</w:t>
@@ -8229,7 +8798,13 @@
         <w:t>Figure 3 below</w:t>
       </w:r>
       <w:r>
-        <w:t>. Consequently, constructor influence when looking at races before the V8 (2006 - 2013) era may be more of a measure of reliability than ability. We also observe a slight drop in classification percentage at the start of new engine regulations, suggesting our model may lose predictive power with the new regulations set for the 2026 season.</w:t>
+        <w:t xml:space="preserve">. Consequently, constructor influence when looking at races before the V8 (2006 - 2013) era may be more of a measure of reliability than ability. We also observe a slight drop in classification percentage at the start of new engine regulations, suggesting </w:t>
+      </w:r>
+      <w:r>
+        <w:t>the proposed</w:t>
+      </w:r>
+      <w:r>
+        <w:t xml:space="preserve"> model may lose predictive power with the new regulations set for the 2026 season.</w:t>
       </w:r>
     </w:p>
     <w:p>
@@ -8246,7 +8821,7 @@
         </w:rPr>
         <w:lastRenderedPageBreak/>
         <w:drawing>
-          <wp:inline distT="0" distB="0" distL="0" distR="0" wp14:anchorId="7693D91C" wp14:editId="55338806">
+          <wp:inline distT="0" distB="0" distL="0" distR="0" wp14:anchorId="7693D91C" wp14:editId="2F856179">
             <wp:extent cx="5486400" cy="2743200"/>
             <wp:effectExtent l="0" t="0" r="0" b="0"/>
             <wp:docPr id="374281055" name="Picture 2"/>
@@ -8263,7 +8838,7 @@
                     </pic:cNvPicPr>
                   </pic:nvPicPr>
                   <pic:blipFill>
-                    <a:blip r:embed="rId16" cstate="print">
+                    <a:blip r:embed="rId21" cstate="print">
                       <a:extLst>
                         <a:ext uri="{28A0092B-C50C-407E-A947-70E740481C1C}">
                           <a14:useLocalDpi xmlns:a14="http://schemas.microsoft.com/office/drawing/2010/main" val="0"/>
@@ -8337,7 +8912,7 @@
           <w:noProof/>
           <w:color w:val="auto"/>
         </w:rPr>
-        <w:t>3</w:t>
+        <w:t>4</w:t>
       </w:r>
       <w:r>
         <w:rPr>
@@ -8446,7 +9021,19 @@
         <w:t>t</w:t>
       </w:r>
       <w:r>
-        <w:t>he decreased relative importance of constructors (50.4%) in predicting qualifying is noteworthy. The increased driver importance during qualification makes intuitive sense, as factors like race strategy and pit stops are essentially non-existent in qualifying compared to races.</w:t>
+        <w:t>he decreased relative importance of constructors (</w:t>
+      </w:r>
+      <w:r>
+        <w:t>47</w:t>
+      </w:r>
+      <w:r>
+        <w:t>.</w:t>
+      </w:r>
+      <w:r>
+        <w:t>0</w:t>
+      </w:r>
+      <w:r>
+        <w:t>%) in predicting qualifying is noteworthy. The increased driver importance during qualification makes intuitive sense, as factors like race strategy and pit stops are essentially non-existent in qualifying compared to races.</w:t>
       </w:r>
     </w:p>
     <w:p/>
@@ -8454,11 +9041,11 @@
       <w:pPr>
         <w:pStyle w:val="Heading3"/>
       </w:pPr>
-      <w:bookmarkStart w:id="13" w:name="_Toc172717669"/>
+      <w:bookmarkStart w:id="19" w:name="_Toc203403170"/>
       <w:r>
         <w:t>Logistic Model Results</w:t>
       </w:r>
-      <w:bookmarkEnd w:id="13"/>
+      <w:bookmarkEnd w:id="19"/>
     </w:p>
     <w:p>
       <w:pPr>
@@ -8531,7 +9118,7 @@
           <w:noProof/>
         </w:rPr>
         <w:drawing>
-          <wp:inline distT="0" distB="0" distL="0" distR="0" wp14:anchorId="37220198" wp14:editId="5C6375FC">
+          <wp:inline distT="0" distB="0" distL="0" distR="0" wp14:anchorId="37220198" wp14:editId="6F306AFD">
             <wp:extent cx="5486400" cy="1978475"/>
             <wp:effectExtent l="0" t="0" r="0" b="3175"/>
             <wp:docPr id="20873651" name="Picture 17"/>
@@ -8547,16 +9134,18 @@
                       <a:picLocks noChangeAspect="1" noChangeArrowheads="1"/>
                     </pic:cNvPicPr>
                   </pic:nvPicPr>
-                  <pic:blipFill rotWithShape="1">
-                    <a:blip r:embed="rId17" cstate="print">
+                  <pic:blipFill>
+                    <a:blip r:embed="rId22" cstate="print">
                       <a:extLst>
                         <a:ext uri="{28A0092B-C50C-407E-A947-70E740481C1C}">
                           <a14:useLocalDpi xmlns:a14="http://schemas.microsoft.com/office/drawing/2010/main" val="0"/>
                         </a:ext>
                       </a:extLst>
                     </a:blip>
-                    <a:srcRect l="14785" r="15609"/>
-                    <a:stretch/>
+                    <a:srcRect l="15197" r="15197"/>
+                    <a:stretch>
+                      <a:fillRect/>
+                    </a:stretch>
                   </pic:blipFill>
                   <pic:spPr bwMode="auto">
                     <a:xfrm>
@@ -8608,9 +9197,9 @@
           <w:noProof/>
         </w:rPr>
         <w:drawing>
-          <wp:inline distT="0" distB="0" distL="0" distR="0" wp14:anchorId="18881AC7" wp14:editId="097804F9">
-            <wp:extent cx="5486400" cy="1393235"/>
-            <wp:effectExtent l="0" t="0" r="0" b="0"/>
+          <wp:inline distT="0" distB="0" distL="0" distR="0" wp14:anchorId="18881AC7" wp14:editId="59A40DD7">
+            <wp:extent cx="5943600" cy="1485899"/>
+            <wp:effectExtent l="0" t="0" r="0" b="635"/>
             <wp:docPr id="1321736302" name="Picture 14"/>
             <wp:cNvGraphicFramePr>
               <a:graphicFrameLocks xmlns:a="http://schemas.openxmlformats.org/drawingml/2006/main" noChangeAspect="1"/>
@@ -8625,7 +9214,7 @@
                     </pic:cNvPicPr>
                   </pic:nvPicPr>
                   <pic:blipFill>
-                    <a:blip r:embed="rId18" cstate="print">
+                    <a:blip r:embed="rId23" cstate="print">
                       <a:extLst>
                         <a:ext uri="{28A0092B-C50C-407E-A947-70E740481C1C}">
                           <a14:useLocalDpi xmlns:a14="http://schemas.microsoft.com/office/drawing/2010/main" val="0"/>
@@ -8639,7 +9228,7 @@
                   <pic:spPr bwMode="auto">
                     <a:xfrm>
                       <a:off x="0" y="0"/>
-                      <a:ext cx="5486400" cy="1393235"/>
+                      <a:ext cx="5943600" cy="1485899"/>
                     </a:xfrm>
                     <a:prstGeom prst="rect">
                       <a:avLst/>
@@ -8699,7 +9288,7 @@
           <w:noProof/>
           <w:color w:val="auto"/>
         </w:rPr>
-        <w:t>4</w:t>
+        <w:t>5</w:t>
       </w:r>
       <w:r>
         <w:rPr>
@@ -8713,7 +9302,117 @@
           <w:rFonts w:ascii="Arial" w:hAnsi="Arial" w:cs="Arial"/>
           <w:color w:val="auto"/>
         </w:rPr>
-        <w:t>: Model Metrics and Variance Explained for Top N Logistic Model. Model performance peaks at N = 5 before rapidly deteriorating for increasing N. The relative importance of constructors against drivers steadily increases for N greater than 6</w:t>
+        <w:t>: Model Metrics for Top N Logistic Model. Model performance peaks at N = 5 before rapidly deteriorating for increasing N. The relative importance of constructors against drivers steadily increases for N greater than 6</w:t>
+      </w:r>
+    </w:p>
+    <w:p>
+      <w:pPr>
+        <w:keepNext/>
+      </w:pPr>
+      <w:r>
+        <w:rPr>
+          <w:noProof/>
+        </w:rPr>
+        <w:drawing>
+          <wp:inline distT="0" distB="0" distL="0" distR="0" wp14:anchorId="09219CEF" wp14:editId="52F76046">
+            <wp:extent cx="5943600" cy="1485900"/>
+            <wp:effectExtent l="0" t="0" r="0" b="0"/>
+            <wp:docPr id="1705091950" name="Picture 2"/>
+            <wp:cNvGraphicFramePr>
+              <a:graphicFrameLocks xmlns:a="http://schemas.openxmlformats.org/drawingml/2006/main" noChangeAspect="1"/>
+            </wp:cNvGraphicFramePr>
+            <a:graphic xmlns:a="http://schemas.openxmlformats.org/drawingml/2006/main">
+              <a:graphicData uri="http://schemas.openxmlformats.org/drawingml/2006/picture">
+                <pic:pic xmlns:pic="http://schemas.openxmlformats.org/drawingml/2006/picture">
+                  <pic:nvPicPr>
+                    <pic:cNvPr id="1705091950" name="Picture 2"/>
+                    <pic:cNvPicPr/>
+                  </pic:nvPicPr>
+                  <pic:blipFill>
+                    <a:blip r:embed="rId24" cstate="print">
+                      <a:extLst>
+                        <a:ext uri="{28A0092B-C50C-407E-A947-70E740481C1C}">
+                          <a14:useLocalDpi xmlns:a14="http://schemas.microsoft.com/office/drawing/2010/main" val="0"/>
+                        </a:ext>
+                      </a:extLst>
+                    </a:blip>
+                    <a:stretch>
+                      <a:fillRect/>
+                    </a:stretch>
+                  </pic:blipFill>
+                  <pic:spPr>
+                    <a:xfrm>
+                      <a:off x="0" y="0"/>
+                      <a:ext cx="5943600" cy="1485900"/>
+                    </a:xfrm>
+                    <a:prstGeom prst="rect">
+                      <a:avLst/>
+                    </a:prstGeom>
+                  </pic:spPr>
+                </pic:pic>
+              </a:graphicData>
+            </a:graphic>
+          </wp:inline>
+        </w:drawing>
+      </w:r>
+    </w:p>
+    <w:p>
+      <w:pPr>
+        <w:pStyle w:val="Caption"/>
+        <w:rPr>
+          <w:rFonts w:ascii="Arial" w:hAnsi="Arial" w:cs="Arial"/>
+          <w:color w:val="000000" w:themeColor="text1"/>
+        </w:rPr>
+      </w:pPr>
+      <w:r>
+        <w:rPr>
+          <w:rFonts w:ascii="Arial" w:hAnsi="Arial" w:cs="Arial"/>
+          <w:color w:val="000000" w:themeColor="text1"/>
+        </w:rPr>
+        <w:t xml:space="preserve">Figure </w:t>
+      </w:r>
+      <w:r>
+        <w:rPr>
+          <w:rFonts w:ascii="Arial" w:hAnsi="Arial" w:cs="Arial"/>
+          <w:color w:val="000000" w:themeColor="text1"/>
+        </w:rPr>
+        <w:fldChar w:fldCharType="begin"/>
+      </w:r>
+      <w:r>
+        <w:rPr>
+          <w:rFonts w:ascii="Arial" w:hAnsi="Arial" w:cs="Arial"/>
+          <w:color w:val="000000" w:themeColor="text1"/>
+        </w:rPr>
+        <w:instrText xml:space="preserve"> SEQ Figure \* ARABIC </w:instrText>
+      </w:r>
+      <w:r>
+        <w:rPr>
+          <w:rFonts w:ascii="Arial" w:hAnsi="Arial" w:cs="Arial"/>
+          <w:color w:val="000000" w:themeColor="text1"/>
+        </w:rPr>
+        <w:fldChar w:fldCharType="separate"/>
+      </w:r>
+      <w:r>
+        <w:rPr>
+          <w:rFonts w:ascii="Arial" w:hAnsi="Arial" w:cs="Arial"/>
+          <w:noProof/>
+          <w:color w:val="000000" w:themeColor="text1"/>
+        </w:rPr>
+        <w:t>6</w:t>
+      </w:r>
+      <w:r>
+        <w:rPr>
+          <w:rFonts w:ascii="Arial" w:hAnsi="Arial" w:cs="Arial"/>
+          <w:color w:val="000000" w:themeColor="text1"/>
+        </w:rPr>
+        <w:fldChar w:fldCharType="end"/>
+      </w:r>
+      <w:r>
+        <w:rPr>
+          <w:rFonts w:ascii="Arial" w:hAnsi="Arial" w:cs="Arial"/>
+          <w:color w:val="000000" w:themeColor="text1"/>
+        </w:rPr>
+        <w:t xml:space="preserve"> Variance Explained for Top N Logistic Model. The relative importance of constructors against drivers steadily increases for N greater than 6</w:t>
       </w:r>
     </w:p>
     <w:p>
@@ -8948,12 +9647,13 @@
       <w:pPr>
         <w:pStyle w:val="Heading3"/>
       </w:pPr>
-      <w:bookmarkStart w:id="14" w:name="_Toc172717670"/>
+      <w:bookmarkStart w:id="20" w:name="_Toc203403171"/>
       <w:r>
         <w:t>Driver and Constructor Coefficients</w:t>
       </w:r>
-      <w:bookmarkEnd w:id="14"/>
-    </w:p>
+      <w:bookmarkEnd w:id="20"/>
+    </w:p>
+    <w:p/>
     <w:p>
       <w:r>
         <w:t>Analyzing driver and constructor coefficients provides additional context for intra-team driver performances and inter-team driver comparisons.</w:t>
@@ -8974,10 +9674,11 @@
         <w:rPr>
           <w:noProof/>
         </w:rPr>
+        <w:lastRenderedPageBreak/>
         <w:drawing>
-          <wp:inline distT="0" distB="0" distL="0" distR="0" wp14:anchorId="73F8C0CA" wp14:editId="5C583B9B">
-            <wp:extent cx="5912413" cy="1504315"/>
-            <wp:effectExtent l="0" t="0" r="0" b="635"/>
+          <wp:inline distT="0" distB="0" distL="0" distR="0" wp14:anchorId="07367D35" wp14:editId="0CA7F253">
+            <wp:extent cx="5826840" cy="1504315"/>
+            <wp:effectExtent l="0" t="0" r="2540" b="0"/>
             <wp:docPr id="12" name="Picture 11">
               <a:extLst xmlns:a="http://schemas.openxmlformats.org/drawingml/2006/main">
                 <a:ext uri="{FF2B5EF4-FFF2-40B4-BE49-F238E27FC236}">
@@ -9004,7 +9705,7 @@
                     </pic:cNvPicPr>
                   </pic:nvPicPr>
                   <pic:blipFill>
-                    <a:blip r:embed="rId19" cstate="print">
+                    <a:blip r:embed="rId25">
                       <a:extLst>
                         <a:ext uri="{28A0092B-C50C-407E-A947-70E740481C1C}">
                           <a14:useLocalDpi xmlns:a14="http://schemas.microsoft.com/office/drawing/2010/main" val="0"/>
@@ -9018,7 +9719,7 @@
                   <pic:spPr>
                     <a:xfrm>
                       <a:off x="0" y="0"/>
-                      <a:ext cx="5912413" cy="1504315"/>
+                      <a:ext cx="5826840" cy="1504315"/>
                     </a:xfrm>
                     <a:prstGeom prst="rect">
                       <a:avLst/>
@@ -9077,7 +9778,7 @@
           <w:noProof/>
           <w:color w:val="auto"/>
         </w:rPr>
-        <w:t>5</w:t>
+        <w:t>7</w:t>
       </w:r>
       <w:r>
         <w:rPr>
@@ -9091,26 +9792,32 @@
           <w:rFonts w:ascii="Arial" w:hAnsi="Arial" w:cs="Arial"/>
           <w:color w:val="auto"/>
         </w:rPr>
-        <w:t>:</w:t>
-      </w:r>
-      <w:r>
-        <w:rPr>
-          <w:rFonts w:ascii="Arial" w:hAnsi="Arial" w:cs="Arial"/>
-          <w:color w:val="auto"/>
-        </w:rPr>
-        <w:t xml:space="preserve"> Max Verstappen vs Daniel Ricciardo LOESS-Blended Coefficients/Ratings</w:t>
-      </w:r>
-      <w:r>
-        <w:rPr>
-          <w:rFonts w:ascii="Arial" w:hAnsi="Arial" w:cs="Arial"/>
-          <w:color w:val="auto"/>
-        </w:rPr>
-        <w:t xml:space="preserve">. Verstappen has a similar coefficient at the end of his 2015 Toro Rosso as Ricciardo’s 2015 Red Bull Stint despite nearly doubling Verstappen’s WDC total. The two drivers performed similarly in the 2016 season under the same constructor. </w:t>
-      </w:r>
-    </w:p>
-    <w:p>
-      <w:r>
-        <w:lastRenderedPageBreak/>
+        <w:t xml:space="preserve">: Daniel Ricciardo </w:t>
+      </w:r>
+      <w:r>
+        <w:rPr>
+          <w:rFonts w:ascii="Arial" w:hAnsi="Arial" w:cs="Arial"/>
+          <w:color w:val="auto"/>
+        </w:rPr>
+        <w:t xml:space="preserve">vs </w:t>
+      </w:r>
+      <w:r>
+        <w:rPr>
+          <w:rFonts w:ascii="Arial" w:hAnsi="Arial" w:cs="Arial"/>
+          <w:color w:val="auto"/>
+        </w:rPr>
+        <w:t xml:space="preserve">Max Verstappen </w:t>
+      </w:r>
+      <w:r>
+        <w:rPr>
+          <w:rFonts w:ascii="Arial" w:hAnsi="Arial" w:cs="Arial"/>
+          <w:color w:val="auto"/>
+        </w:rPr>
+        <w:t xml:space="preserve">LOESS-Blended Coefficients/Ratings. Verstappen has a similar coefficient at the end of his 2015 Toro Rosso as Ricciardo’s 2015 Red Bull Stint despite nearly doubling Verstappen’s WDC total. The two drivers performed similarly in the 2016 season under the same constructor. </w:t>
+      </w:r>
+    </w:p>
+    <w:p>
+      <w:r>
         <w:t>A similar phenomenon is observed in comparing constructor coefficients. Mercedes is consistently seen as the dominant constructor throughout the 2014-2021 period, coinciding with their eight consecutive World Constructors' Championships.</w:t>
       </w:r>
     </w:p>
@@ -9124,8 +9831,8 @@
           <w:noProof/>
         </w:rPr>
         <w:drawing>
-          <wp:inline distT="0" distB="0" distL="0" distR="0" wp14:anchorId="694B6CDD" wp14:editId="41000046">
-            <wp:extent cx="5797698" cy="1483995"/>
+          <wp:inline distT="0" distB="0" distL="0" distR="0" wp14:anchorId="28A175A7" wp14:editId="3774D766">
+            <wp:extent cx="5784744" cy="1483995"/>
             <wp:effectExtent l="0" t="0" r="0" b="1905"/>
             <wp:docPr id="384768874" name="Picture 10">
               <a:extLst xmlns:a="http://schemas.openxmlformats.org/drawingml/2006/main">
@@ -9153,7 +9860,7 @@
                     </pic:cNvPicPr>
                   </pic:nvPicPr>
                   <pic:blipFill>
-                    <a:blip r:embed="rId20" cstate="print">
+                    <a:blip r:embed="rId26">
                       <a:extLst>
                         <a:ext uri="{28A0092B-C50C-407E-A947-70E740481C1C}">
                           <a14:useLocalDpi xmlns:a14="http://schemas.microsoft.com/office/drawing/2010/main" val="0"/>
@@ -9167,7 +9874,7 @@
                   <pic:spPr>
                     <a:xfrm>
                       <a:off x="0" y="0"/>
-                      <a:ext cx="5797698" cy="1483995"/>
+                      <a:ext cx="5784744" cy="1483995"/>
                     </a:xfrm>
                     <a:prstGeom prst="rect">
                       <a:avLst/>
@@ -9223,7 +9930,7 @@
           <w:noProof/>
           <w:color w:val="auto"/>
         </w:rPr>
-        <w:t>6</w:t>
+        <w:t>8</w:t>
       </w:r>
       <w:r>
         <w:rPr>
@@ -9237,43 +9944,33 @@
           <w:rFonts w:ascii="Arial" w:hAnsi="Arial" w:cs="Arial"/>
           <w:color w:val="auto"/>
         </w:rPr>
-        <w:t>: Mercedes vs Red Bull LOESS-Blended Coefficients/Ratings</w:t>
-      </w:r>
-      <w:r>
-        <w:rPr>
-          <w:rFonts w:ascii="Arial" w:hAnsi="Arial" w:cs="Arial"/>
-          <w:color w:val="auto"/>
-        </w:rPr>
-        <w:t>. Mercedes has a higher coefficient until the 2022 season which is consistent with both teams’ performances in the World Constructor Championships. Mercedes won the WCC from 2014 – 2021 while Red Bull won in 2022 and 2023.</w:t>
-      </w:r>
-      <w:r>
-        <w:rPr>
-          <w:rFonts w:ascii="Arial" w:hAnsi="Arial" w:cs="Arial"/>
-          <w:color w:val="auto"/>
-        </w:rPr>
-        <w:t xml:space="preserve"> Shaded area represents a 95% confidence interval.</w:t>
-      </w:r>
-    </w:p>
-    <w:p>
-      <w:r>
-        <w:t>While coefficients are useful for intra-team driver and constructor comparisons, similar conclusions can often be drawn from Formula 1 point totals. The back-and-forth between Verstappen and Ricciardo is evident in their point totals for the 2016-2018 seasons. Mercedes' dominance over Red Bull is also clear from their point totals relative to other constructors.</w:t>
-      </w:r>
-    </w:p>
-    <w:p>
-      <w:r>
-        <w:t>The unique insight provided by the ridge regression model lies in inter-team driver comparisons. This is illustrated with Max Verstappen, Lewis Hamilton, and Valtteri Bottas. Hamilton and Bottas finished 1st and 2nd</w:t>
-      </w:r>
-      <w:r>
-        <w:t>,</w:t>
-      </w:r>
-      <w:r>
-        <w:t>respectively</w:t>
-      </w:r>
-      <w:r>
-        <w:t>,</w:t>
-      </w:r>
-      <w:r>
-        <w:t xml:space="preserve"> in both the 2019 and 2020 seasons, with Verstappen finishing 3rd in both seasons. Despite these results, Verstappen’s driver coefficient for both seasons is higher than Bottas’s and in line with Hamilton's.</w:t>
+        <w:t>: Mercedes vs Red Bull LOESS-Blended Coefficients/Ratings. Mercedes has a higher coefficient until the 2022 season which is consistent with both teams’ performances in the World Constructor Championships. Mercedes won the WCC from 2014 – 2021 while Red Bull won in 2022 and 2023. Shaded area represents a 95% confidence interval.</w:t>
+      </w:r>
+    </w:p>
+    <w:p>
+      <w:r>
+        <w:t xml:space="preserve">While coefficients are useful for intra-team driver and constructor comparisons, similar conclusions can often be drawn from Formula </w:t>
+      </w:r>
+      <w:proofErr w:type="gramStart"/>
+      <w:r>
+        <w:t>1 point</w:t>
+      </w:r>
+      <w:proofErr w:type="gramEnd"/>
+      <w:r>
+        <w:t xml:space="preserve"> totals. The back-and-forth between Verstappen and Ricciardo is evident in their point totals for the 2016-2018 seasons. Mercedes' dominance over Red Bull is also clear from their point totals relative to other constructors.</w:t>
+      </w:r>
+    </w:p>
+    <w:p>
+      <w:r>
+        <w:t>The unique insight provided by the ridge regression model lies in inter-team driver comparisons. This is illustrated with Max Verstappen, Lewis Hamilton, and Valtteri Bottas. Hamilton and Bottas finished 1st and 2</w:t>
+      </w:r>
+      <w:proofErr w:type="gramStart"/>
+      <w:r>
+        <w:t>nd,respectively</w:t>
+      </w:r>
+      <w:proofErr w:type="gramEnd"/>
+      <w:r>
+        <w:t>, in both the 2019 and 2020 seasons, with Verstappen finishing 3rd in both seasons. Despite these results, Verstappen’s driver coefficient for both seasons is higher than Bottas’s and in line with Hamilton's.</w:t>
       </w:r>
     </w:p>
     <w:p>
@@ -9286,9 +9983,9 @@
           <w:noProof/>
         </w:rPr>
         <w:drawing>
-          <wp:inline distT="0" distB="0" distL="0" distR="0" wp14:anchorId="5C3E70FC" wp14:editId="2CDA6724">
-            <wp:extent cx="5846447" cy="1007745"/>
-            <wp:effectExtent l="0" t="0" r="1905" b="1905"/>
+          <wp:inline distT="0" distB="0" distL="0" distR="0" wp14:anchorId="778E6057" wp14:editId="5C74B095">
+            <wp:extent cx="5846447" cy="1003066"/>
+            <wp:effectExtent l="0" t="0" r="0" b="635"/>
             <wp:docPr id="1670723810" name="Picture 15">
               <a:extLst xmlns:a="http://schemas.openxmlformats.org/drawingml/2006/main">
                 <a:ext uri="{FF2B5EF4-FFF2-40B4-BE49-F238E27FC236}">
@@ -9315,7 +10012,7 @@
                     </pic:cNvPicPr>
                   </pic:nvPicPr>
                   <pic:blipFill>
-                    <a:blip r:embed="rId21" cstate="print">
+                    <a:blip r:embed="rId27">
                       <a:extLst>
                         <a:ext uri="{28A0092B-C50C-407E-A947-70E740481C1C}">
                           <a14:useLocalDpi xmlns:a14="http://schemas.microsoft.com/office/drawing/2010/main" val="0"/>
@@ -9329,7 +10026,7 @@
                   <pic:spPr>
                     <a:xfrm>
                       <a:off x="0" y="0"/>
-                      <a:ext cx="5846447" cy="1007745"/>
+                      <a:ext cx="5846447" cy="1003066"/>
                     </a:xfrm>
                     <a:prstGeom prst="rect">
                       <a:avLst/>
@@ -9385,7 +10082,7 @@
           <w:noProof/>
           <w:color w:val="auto"/>
         </w:rPr>
-        <w:t>7</w:t>
+        <w:t>9</w:t>
       </w:r>
       <w:r>
         <w:rPr>
@@ -9399,277 +10096,516 @@
           <w:rFonts w:ascii="Arial" w:hAnsi="Arial" w:cs="Arial"/>
           <w:color w:val="auto"/>
         </w:rPr>
-        <w:t>:</w:t>
-      </w:r>
-      <w:r>
-        <w:rPr>
-          <w:rFonts w:ascii="Arial" w:hAnsi="Arial" w:cs="Arial"/>
-          <w:color w:val="auto"/>
-        </w:rPr>
-        <w:t xml:space="preserve"> Max Verstappen, Valtreri Bottas, Lewis Hamilton LOESS-Blended Coefficients/Rating</w:t>
-      </w:r>
-      <w:r>
-        <w:rPr>
-          <w:rFonts w:ascii="Arial" w:hAnsi="Arial" w:cs="Arial"/>
-          <w:color w:val="auto"/>
-        </w:rPr>
-        <w:t>. Verstappen has a higher coefficient than Bottas in the 2017 to 2020 seasons despite Bottas scoring more Formula 1 points in that time frame, suggesting that the Bottas’ performance was booster by the strength of the Mercedes</w:t>
-      </w:r>
-      <w:r>
-        <w:rPr>
-          <w:rFonts w:ascii="Arial" w:hAnsi="Arial" w:cs="Arial"/>
-          <w:color w:val="auto"/>
-        </w:rPr>
+        <w:t>: Max Verstappen, Lewis Hamilton</w:t>
+      </w:r>
+      <w:r>
+        <w:rPr>
+          <w:rFonts w:ascii="Arial" w:hAnsi="Arial" w:cs="Arial"/>
+          <w:color w:val="auto"/>
+        </w:rPr>
+        <w:t xml:space="preserve">, </w:t>
+      </w:r>
+      <w:proofErr w:type="spellStart"/>
+      <w:r>
+        <w:rPr>
+          <w:rFonts w:ascii="Arial" w:hAnsi="Arial" w:cs="Arial"/>
+          <w:color w:val="auto"/>
+        </w:rPr>
+        <w:t>Valtreri</w:t>
+      </w:r>
+      <w:proofErr w:type="spellEnd"/>
+      <w:r>
+        <w:rPr>
+          <w:rFonts w:ascii="Arial" w:hAnsi="Arial" w:cs="Arial"/>
+          <w:color w:val="auto"/>
+        </w:rPr>
+        <w:t xml:space="preserve"> Bottas</w:t>
+      </w:r>
+      <w:r>
+        <w:rPr>
+          <w:rFonts w:ascii="Arial" w:hAnsi="Arial" w:cs="Arial"/>
+          <w:color w:val="auto"/>
+        </w:rPr>
+        <w:t xml:space="preserve"> LOESS-Blended Coefficients/Rating. Verstappen has a higher coefficient than Bottas in the 2017 to 2020 seasons despite Bottas scoring more Formula 1 points in that time </w:t>
+      </w:r>
+      <w:r>
+        <w:rPr>
+          <w:rFonts w:ascii="Arial" w:hAnsi="Arial" w:cs="Arial"/>
+          <w:color w:val="auto"/>
+        </w:rPr>
+        <w:lastRenderedPageBreak/>
+        <w:t>frame, suggesting that the Bottas’ performance was booster by the strength of the Mercedes. Shaded area represents a 95% confidence interval.</w:t>
+      </w:r>
+    </w:p>
+    <w:p>
+      <w:commentRangeStart w:id="21"/>
+      <w:r>
+        <w:t xml:space="preserve">Bottas </w:t>
+      </w:r>
+      <w:commentRangeEnd w:id="21"/>
+      <w:r>
+        <w:rPr>
+          <w:rStyle w:val="CommentReference"/>
+        </w:rPr>
+        <w:commentReference w:id="21"/>
+      </w:r>
+      <w:r>
+        <w:t>outperforming Verstappen in the World Driver’s Championship is largely attributed to the quality of the Mercedes in the 2019 and 2020 seasons. Verstappen’s talent was fully displayed in the 2021 season when he won the World Drivers' Championship as the gap between Mercedes and Red Bull closed. Hamilton and Bottas finished 2nd and 3rd respectively</w:t>
+      </w:r>
+      <w:r>
         <w:t>.</w:t>
       </w:r>
       <w:r>
-        <w:rPr>
-          <w:rFonts w:ascii="Arial" w:hAnsi="Arial" w:cs="Arial"/>
-          <w:color w:val="auto"/>
-        </w:rPr>
         <w:t xml:space="preserve"> </w:t>
       </w:r>
       <w:r>
-        <w:rPr>
-          <w:rFonts w:ascii="Arial" w:hAnsi="Arial" w:cs="Arial"/>
-          <w:color w:val="auto"/>
-        </w:rPr>
-        <w:t>Shaded area represents a 95% confidence interval.</w:t>
-      </w:r>
-    </w:p>
-    <w:p>
-      <w:r>
-        <w:t>Bottas outperforming Verstappen in the World Driver’s Championship is largely attributed to the quality of the Mercedes in the 2019 and 2020 seasons. Verstappen’s talent was fully displayed in the 2021 season when he won the World Drivers' Championship as the gap between Mercedes and Red Bull closed. Hamilton and Bottas finished 2nd and 3rd respectively</w:t>
-      </w:r>
-      <w:r>
-        <w:t>.</w:t>
+        <w:t xml:space="preserve">While Bottas’s rating is largely unchanged after leaving Wiliams for Mercedes, as expected, </w:t>
+      </w:r>
+      <w:r>
+        <w:t xml:space="preserve">Bottas’s steep drop off after leaving Mercedes </w:t>
+      </w:r>
+      <w:r>
+        <w:t xml:space="preserve">for Sauber </w:t>
+      </w:r>
+      <w:r>
+        <w:t>seems unlikely</w:t>
+      </w:r>
+      <w:r>
+        <w:t>. T</w:t>
+      </w:r>
+      <w:r>
+        <w:t xml:space="preserve">he model </w:t>
+      </w:r>
+      <w:proofErr w:type="gramStart"/>
+      <w:r>
+        <w:t xml:space="preserve">may be </w:t>
+      </w:r>
+      <w:r>
+        <w:t>not be</w:t>
+      </w:r>
+      <w:proofErr w:type="gramEnd"/>
+      <w:r>
+        <w:t xml:space="preserve"> fully separating constructor and driver performance. </w:t>
       </w:r>
     </w:p>
     <w:p/>
     <w:p>
       <w:pPr>
-        <w:pStyle w:val="Heading2"/>
-      </w:pPr>
-      <w:bookmarkStart w:id="15" w:name="_Toc172717671"/>
-      <w:r>
-        <w:lastRenderedPageBreak/>
-        <w:t>Discussion</w:t>
-      </w:r>
-      <w:bookmarkEnd w:id="15"/>
-    </w:p>
-    <w:p>
-      <w:pPr>
         <w:pStyle w:val="Heading3"/>
       </w:pPr>
-      <w:bookmarkStart w:id="16" w:name="_Toc172717672"/>
-      <w:r>
-        <w:t>Model Discussion</w:t>
-      </w:r>
-      <w:bookmarkEnd w:id="16"/>
-    </w:p>
-    <w:p>
-      <w:r>
-        <w:t>The overall DNF-Excluded model has a strong predictive power with a Kendall’s coefficient of 0.62</w:t>
-      </w:r>
-      <w:r>
-        <w:t>4</w:t>
-      </w:r>
-      <w:r>
-        <w:t>.  This robustness instills confidence in the other derived conclusions. Measuring the coefficients of both drivers and constructors over time enables more informative inter-constructor driver comparisons</w:t>
-      </w:r>
-      <w:r>
-        <w:t>.</w:t>
-      </w:r>
-    </w:p>
-    <w:p>
-      <w:r>
-        <w:t xml:space="preserve">The 67.1% variance explained by constructors, </w:t>
-      </w:r>
-      <w:r>
-        <w:t xml:space="preserve">along with </w:t>
-      </w:r>
-      <w:r>
-        <w:t xml:space="preserve">model metrics for qualification and logistic regression models, highlights the significant impact of constructors on driver finishing positions. The logistic model, in particular, </w:t>
-      </w:r>
-      <w:r>
-        <w:t>highlights</w:t>
-      </w:r>
-      <w:r>
-        <w:t xml:space="preserve"> the crucial role of constructors in determining cohort placements. Conversely, the qualification models emphasize the relative importance of drivers, suggesting potential value in incorporating qualification-informed models.</w:t>
-      </w:r>
-    </w:p>
-    <w:p>
-      <w:pPr>
-        <w:pStyle w:val="Heading3"/>
-      </w:pPr>
-      <w:bookmarkStart w:id="17" w:name="_Toc172717673"/>
-      <w:r>
-        <w:t>Model Extensibility</w:t>
-      </w:r>
-      <w:bookmarkEnd w:id="17"/>
-    </w:p>
-    <w:p>
-      <w:r>
-        <w:t>There are many opportunities to expand the modeling process outlined throughout this paper.  For the sake of interpretability, the current model only includes drivers and (parent) constructors as features. Incorporating additional features</w:t>
-      </w:r>
-      <w:r>
-        <w:t xml:space="preserve">, </w:t>
-      </w:r>
-      <w:r>
-        <w:t>such as circuit type and separating the engine and constructor components</w:t>
-      </w:r>
-      <w:r>
-        <w:t>,</w:t>
-      </w:r>
-      <w:r>
-        <w:t xml:space="preserve"> could enhance predictive accuracy. Moreover, the existing prediction process yields singular predictions. Implementing a bootstrapped model could provide probabilistic outcomes, thereby increasing the model's applicability to sports betting.</w:t>
-      </w:r>
-    </w:p>
-    <w:p>
-      <w:r>
-        <w:t>The presented methodology can also be extended to previous eras of Formula 1, allowing for cross-era comparisons. Expanding the model to cover earlier periods would likely necessitate recalibrating the time-decay factor to account for significant changes when engine regulations are altered. Given the impending new engine regulations in the 2026 Formula 1 season, it will be essential to recalibrate the model to maintain its relevance and accuracy.</w:t>
-      </w:r>
-    </w:p>
-    <w:p>
-      <w:r>
-        <w:t xml:space="preserve">The methodology can be extended </w:t>
-      </w:r>
-      <w:r>
-        <w:t>to other sports</w:t>
-      </w:r>
-      <w:r>
-        <w:t xml:space="preserve">, particularly </w:t>
-      </w:r>
-      <w:r>
-        <w:t>those related to racing</w:t>
-      </w:r>
-      <w:r>
-        <w:t xml:space="preserve">. </w:t>
-      </w:r>
-      <w:r>
-        <w:t>The methodology can largely be shifted over to horse racing, sailboat racing, and other motorsports. Extending the methodology to one-</w:t>
-      </w:r>
-      <w:r>
-        <w:t xml:space="preserve">make (spec) racing where </w:t>
-      </w:r>
-      <w:r>
-        <w:t xml:space="preserve">cars usually have the same chassis, powertrain, tires, brakes, and fuel would be an interesting contrast to </w:t>
-      </w:r>
-      <w:r>
-        <w:t xml:space="preserve">the analysis presented in this paper. For example, we would expect almost all the variance to be explained by drivers in Formula 2 </w:t>
-      </w:r>
-      <w:r>
-        <w:t xml:space="preserve">where all the chassis and </w:t>
-      </w:r>
-      <w:r>
-        <w:t xml:space="preserve">engines are the same. </w:t>
-      </w:r>
-      <w:r>
-        <w:t>Contrasting</w:t>
-      </w:r>
-      <w:r>
-        <w:t xml:space="preserve"> to semi-spec series such as IndyCar and Formula-E where chassis are the same, but power units can vary could provide </w:t>
-      </w:r>
-      <w:r>
-        <w:t xml:space="preserve">a unique perspective on the impact of the driver. </w:t>
-      </w:r>
-    </w:p>
-    <w:p>
-      <w:pPr>
-        <w:pStyle w:val="Heading3"/>
-      </w:pPr>
-      <w:bookmarkStart w:id="18" w:name="_Toc172717674"/>
-      <w:r>
-        <w:t>Applications &amp; Conclusions</w:t>
-      </w:r>
-      <w:bookmarkEnd w:id="18"/>
+      <w:bookmarkStart w:id="22" w:name="_Toc203403172"/>
+      <w:r>
+        <w:t>Alternate Methods</w:t>
+      </w:r>
+      <w:bookmarkEnd w:id="22"/>
     </w:p>
     <w:p/>
-    <w:p>
-      <w:pPr>
-        <w:pStyle w:val="Caption"/>
-        <w:jc w:val="center"/>
-        <w:rPr>
-          <w:rFonts w:ascii="Arial" w:hAnsi="Arial" w:cs="Arial"/>
-          <w:color w:val="auto"/>
-        </w:rPr>
-      </w:pPr>
-      <w:r>
-        <w:rPr>
-          <w:rFonts w:ascii="Arial" w:hAnsi="Arial" w:cs="Arial"/>
-          <w:color w:val="auto"/>
-        </w:rPr>
-        <w:t xml:space="preserve">Table </w:t>
-      </w:r>
-      <w:r>
-        <w:rPr>
-          <w:rFonts w:ascii="Arial" w:hAnsi="Arial" w:cs="Arial"/>
-          <w:color w:val="auto"/>
-        </w:rPr>
-        <w:fldChar w:fldCharType="begin"/>
-      </w:r>
-      <w:r>
-        <w:rPr>
-          <w:rFonts w:ascii="Arial" w:hAnsi="Arial" w:cs="Arial"/>
-          <w:color w:val="auto"/>
-        </w:rPr>
-        <w:instrText xml:space="preserve"> SEQ Table \* ARABIC </w:instrText>
-      </w:r>
-      <w:r>
-        <w:rPr>
-          <w:rFonts w:ascii="Arial" w:hAnsi="Arial" w:cs="Arial"/>
-          <w:color w:val="auto"/>
-        </w:rPr>
-        <w:fldChar w:fldCharType="separate"/>
-      </w:r>
-      <w:r>
-        <w:rPr>
-          <w:rFonts w:ascii="Arial" w:hAnsi="Arial" w:cs="Arial"/>
-          <w:noProof/>
-          <w:color w:val="auto"/>
-        </w:rPr>
-        <w:t>3</w:t>
-      </w:r>
-      <w:r>
-        <w:rPr>
-          <w:rFonts w:ascii="Arial" w:hAnsi="Arial" w:cs="Arial"/>
-          <w:color w:val="auto"/>
-        </w:rPr>
-        <w:fldChar w:fldCharType="end"/>
-      </w:r>
-      <w:r>
-        <w:rPr>
-          <w:rFonts w:ascii="Arial" w:hAnsi="Arial" w:cs="Arial"/>
-          <w:color w:val="auto"/>
-        </w:rPr>
-        <w:t xml:space="preserve">: </w:t>
-      </w:r>
-      <w:r>
-        <w:rPr>
-          <w:rFonts w:ascii="Arial" w:hAnsi="Arial" w:cs="Arial"/>
-          <w:color w:val="auto"/>
-        </w:rPr>
-        <w:t>Top 10 Constructor/Driver composite rankings as of the end of the 2023 F1 Season. Composite ranking is defined as driver rating plus constructor rating. ± values represent a 95% confidence interval. Driver and constructor independence is assumed for the overall confidence interval</w:t>
-      </w:r>
-    </w:p>
     <w:p>
       <w:pPr>
         <w:pStyle w:val="Caption"/>
         <w:keepNext/>
         <w:jc w:val="center"/>
-      </w:pPr>
-    </w:p>
-    <w:p>
-      <w:pPr>
+        <w:rPr>
+          <w:rFonts w:ascii="Arial" w:hAnsi="Arial" w:cs="Arial"/>
+          <w:color w:val="000000" w:themeColor="text1"/>
+        </w:rPr>
+      </w:pPr>
+      <w:r>
+        <w:rPr>
+          <w:rFonts w:ascii="Arial" w:hAnsi="Arial" w:cs="Arial"/>
+          <w:color w:val="000000" w:themeColor="text1"/>
+        </w:rPr>
+        <w:t xml:space="preserve">Table </w:t>
+      </w:r>
+      <w:r>
+        <w:rPr>
+          <w:rFonts w:ascii="Arial" w:hAnsi="Arial" w:cs="Arial"/>
+          <w:color w:val="000000" w:themeColor="text1"/>
+        </w:rPr>
+        <w:fldChar w:fldCharType="begin"/>
+      </w:r>
+      <w:r>
+        <w:rPr>
+          <w:rFonts w:ascii="Arial" w:hAnsi="Arial" w:cs="Arial"/>
+          <w:color w:val="000000" w:themeColor="text1"/>
+        </w:rPr>
+        <w:instrText xml:space="preserve"> SEQ Table \* ARABIC </w:instrText>
+      </w:r>
+      <w:r>
+        <w:rPr>
+          <w:rFonts w:ascii="Arial" w:hAnsi="Arial" w:cs="Arial"/>
+          <w:color w:val="000000" w:themeColor="text1"/>
+        </w:rPr>
+        <w:fldChar w:fldCharType="separate"/>
+      </w:r>
+      <w:r>
+        <w:rPr>
+          <w:rFonts w:ascii="Arial" w:hAnsi="Arial" w:cs="Arial"/>
+          <w:noProof/>
+          <w:color w:val="000000" w:themeColor="text1"/>
+        </w:rPr>
+        <w:t>3</w:t>
+      </w:r>
+      <w:r>
+        <w:rPr>
+          <w:rFonts w:ascii="Arial" w:hAnsi="Arial" w:cs="Arial"/>
+          <w:color w:val="000000" w:themeColor="text1"/>
+        </w:rPr>
+        <w:fldChar w:fldCharType="end"/>
+      </w:r>
+      <w:r>
+        <w:rPr>
+          <w:rFonts w:ascii="Arial" w:hAnsi="Arial" w:cs="Arial"/>
+          <w:color w:val="000000" w:themeColor="text1"/>
+        </w:rPr>
+        <w:t xml:space="preserve"> Model performance based on position weighting decision for DNF inclusive and exclusive models. No </w:t>
+      </w:r>
+      <w:proofErr w:type="spellStart"/>
+      <w:r>
+        <w:rPr>
+          <w:rFonts w:ascii="Arial" w:hAnsi="Arial" w:cs="Arial"/>
+          <w:color w:val="000000" w:themeColor="text1"/>
+        </w:rPr>
+        <w:t>signifncant</w:t>
+      </w:r>
+      <w:proofErr w:type="spellEnd"/>
+      <w:r>
+        <w:rPr>
+          <w:rFonts w:ascii="Arial" w:hAnsi="Arial" w:cs="Arial"/>
+          <w:color w:val="000000" w:themeColor="text1"/>
+        </w:rPr>
+        <w:t xml:space="preserve"> </w:t>
+      </w:r>
+      <w:proofErr w:type="spellStart"/>
+      <w:r>
+        <w:rPr>
+          <w:rFonts w:ascii="Arial" w:hAnsi="Arial" w:cs="Arial"/>
+          <w:color w:val="000000" w:themeColor="text1"/>
+        </w:rPr>
+        <w:t>perfromancme</w:t>
+      </w:r>
+      <w:proofErr w:type="spellEnd"/>
+      <w:r>
+        <w:rPr>
+          <w:rFonts w:ascii="Arial" w:hAnsi="Arial" w:cs="Arial"/>
+          <w:color w:val="000000" w:themeColor="text1"/>
+        </w:rPr>
+        <w:t xml:space="preserve"> difference realized </w:t>
+      </w:r>
+      <w:proofErr w:type="spellStart"/>
+      <w:r>
+        <w:rPr>
+          <w:rFonts w:ascii="Arial" w:hAnsi="Arial" w:cs="Arial"/>
+          <w:color w:val="000000" w:themeColor="text1"/>
+        </w:rPr>
+        <w:t>thruogh</w:t>
+      </w:r>
+      <w:proofErr w:type="spellEnd"/>
+      <w:r>
+        <w:rPr>
+          <w:rFonts w:ascii="Arial" w:hAnsi="Arial" w:cs="Arial"/>
+          <w:color w:val="000000" w:themeColor="text1"/>
+        </w:rPr>
+        <w:t xml:space="preserve"> current weighting system</w:t>
+      </w:r>
+    </w:p>
+    <w:p>
+      <w:pPr>
+        <w:jc w:val="center"/>
+      </w:pPr>
+      <w:r>
+        <w:rPr>
+          <w:noProof/>
+        </w:rPr>
+        <w:drawing>
+          <wp:inline distT="0" distB="0" distL="0" distR="0" wp14:anchorId="4A2C0FDC" wp14:editId="0555B5EC">
+            <wp:extent cx="4572000" cy="2457938"/>
+            <wp:effectExtent l="0" t="0" r="0" b="6350"/>
+            <wp:docPr id="1046699028" name="Picture 4"/>
+            <wp:cNvGraphicFramePr>
+              <a:graphicFrameLocks xmlns:a="http://schemas.openxmlformats.org/drawingml/2006/main" noChangeAspect="1"/>
+            </wp:cNvGraphicFramePr>
+            <a:graphic xmlns:a="http://schemas.openxmlformats.org/drawingml/2006/main">
+              <a:graphicData uri="http://schemas.openxmlformats.org/drawingml/2006/picture">
+                <pic:pic xmlns:pic="http://schemas.openxmlformats.org/drawingml/2006/picture">
+                  <pic:nvPicPr>
+                    <pic:cNvPr id="1046699028" name="Picture 1046699028"/>
+                    <pic:cNvPicPr/>
+                  </pic:nvPicPr>
+                  <pic:blipFill>
+                    <a:blip r:embed="rId28" cstate="print">
+                      <a:extLst>
+                        <a:ext uri="{28A0092B-C50C-407E-A947-70E740481C1C}">
+                          <a14:useLocalDpi xmlns:a14="http://schemas.microsoft.com/office/drawing/2010/main" val="0"/>
+                        </a:ext>
+                      </a:extLst>
+                    </a:blip>
+                    <a:stretch>
+                      <a:fillRect/>
+                    </a:stretch>
+                  </pic:blipFill>
+                  <pic:spPr>
+                    <a:xfrm>
+                      <a:off x="0" y="0"/>
+                      <a:ext cx="4572000" cy="2457938"/>
+                    </a:xfrm>
+                    <a:prstGeom prst="rect">
+                      <a:avLst/>
+                    </a:prstGeom>
+                  </pic:spPr>
+                </pic:pic>
+              </a:graphicData>
+            </a:graphic>
+          </wp:inline>
+        </w:drawing>
+      </w:r>
+    </w:p>
+    <w:p>
+      <w:pPr>
+        <w:jc w:val="center"/>
+      </w:pPr>
+    </w:p>
+    <w:p>
+      <w:r>
+        <w:t xml:space="preserve">While the design decision to weigh higher placed positions higher, the model performance remains largely consisting independent of position weights. There may be future opportunities to further tune the weights to index heavier on points positions. </w:t>
+      </w:r>
+    </w:p>
+    <w:p>
+      <w:pPr>
+        <w:jc w:val="center"/>
+      </w:pPr>
+    </w:p>
+    <w:p>
+      <w:pPr>
+        <w:pStyle w:val="Heading2"/>
+      </w:pPr>
+      <w:bookmarkStart w:id="23" w:name="_Toc203403173"/>
+      <w:r>
+        <w:t>Discussion</w:t>
+      </w:r>
+      <w:bookmarkEnd w:id="23"/>
+    </w:p>
+    <w:p>
+      <w:pPr>
+        <w:pStyle w:val="Heading3"/>
+      </w:pPr>
+      <w:bookmarkStart w:id="24" w:name="_Toc203403174"/>
+      <w:r>
+        <w:t>Model Discussion</w:t>
+      </w:r>
+      <w:bookmarkEnd w:id="24"/>
+    </w:p>
+    <w:p>
+      <w:r>
+        <w:t>The overall DNF-Excluded model has a strong predictive power with a Kendall’s coefficient of 0.62</w:t>
+      </w:r>
+      <w:r>
+        <w:t>5</w:t>
+      </w:r>
+      <w:r>
+        <w:t>.  This robustness instills confidence in the other derived conclusions. Measuring the coefficients of both drivers and constructors over time enables more informative inter-constructor driver comparisons</w:t>
+      </w:r>
+      <w:r>
+        <w:t>.</w:t>
+      </w:r>
+    </w:p>
+    <w:p>
+      <w:r>
+        <w:t xml:space="preserve">The </w:t>
+      </w:r>
+      <w:r>
+        <w:t>64</w:t>
+      </w:r>
+      <w:r>
+        <w:t xml:space="preserve">% variance explained by constructors, </w:t>
+      </w:r>
+      <w:r>
+        <w:t xml:space="preserve">along with </w:t>
+      </w:r>
+      <w:r>
+        <w:t xml:space="preserve">model metrics for qualification and logistic regression models, highlights the significant impact of constructors on driver finishing positions. The </w:t>
+      </w:r>
+      <w:r>
+        <w:lastRenderedPageBreak/>
+        <w:t>logistic model</w:t>
+      </w:r>
+      <w:proofErr w:type="gramStart"/>
+      <w:r>
+        <w:t xml:space="preserve">, in particular, </w:t>
+      </w:r>
+      <w:r>
+        <w:t>highlights</w:t>
+      </w:r>
+      <w:proofErr w:type="gramEnd"/>
+      <w:r>
+        <w:t xml:space="preserve"> the crucial role of constructors in determining cohort placements. Conversely, the qualification models emphasize the relative importance of drivers, suggesting potential value in incorporating qualification-informed models.</w:t>
+      </w:r>
+    </w:p>
+    <w:p>
+      <w:pPr>
+        <w:pStyle w:val="Heading3"/>
+      </w:pPr>
+      <w:bookmarkStart w:id="25" w:name="_Toc203403175"/>
+      <w:r>
+        <w:t>Model Extensibility</w:t>
+      </w:r>
+      <w:bookmarkEnd w:id="25"/>
+    </w:p>
+    <w:p>
+      <w:r>
+        <w:t>There are many opportunities to expand the modeling process outlined throughout this paper.  For the sake of interpretability, the current model only includes drivers and (parent) constructors as features. Incorporating additional features</w:t>
+      </w:r>
+      <w:r>
+        <w:t xml:space="preserve">, </w:t>
+      </w:r>
+      <w:r>
+        <w:t>such as circuit type and separating the engine and constructor components</w:t>
+      </w:r>
+      <w:r>
+        <w:t>,</w:t>
+      </w:r>
+      <w:r>
+        <w:t xml:space="preserve"> could enhance predictive accuracy. Moreover, the existing prediction process yields singular predictions. Implementing a bootstrapped model could provide probabilistic outcomes, thereby increasing the model's applicability to sports betting.</w:t>
+      </w:r>
+    </w:p>
+    <w:p>
+      <w:r>
+        <w:t>The presented methodology can also be extended to previous eras of Formula 1, allowing for cross-era comparisons. Expanding the model to cover earlier periods would likely necessitate recalibrating the time-decay factor to account for significant changes when engine regulations are altered. Given the impending new engine regulations in the 2026 Formula 1 season, it will be essential to recalibrate the model to maintain its relevance and accuracy.</w:t>
+      </w:r>
+    </w:p>
+    <w:p>
+      <w:r>
+        <w:t xml:space="preserve">The methodology can be extended </w:t>
+      </w:r>
+      <w:r>
+        <w:t>to other sports</w:t>
+      </w:r>
+      <w:r>
+        <w:t xml:space="preserve">, particularly </w:t>
+      </w:r>
+      <w:r>
+        <w:t>those related to racing</w:t>
+      </w:r>
+      <w:r>
+        <w:t xml:space="preserve">. </w:t>
+      </w:r>
+      <w:r>
+        <w:t>The methodology can largely be shifted over to horse racing, sailboat racing, and other motorsports. Extending the methodology to one-</w:t>
+      </w:r>
+      <w:r>
+        <w:t xml:space="preserve">make (spec) racing where </w:t>
+      </w:r>
+      <w:r>
+        <w:t xml:space="preserve">cars usually have the same chassis, powertrain, tires, brakes, and fuel would be an interesting contrast to </w:t>
+      </w:r>
+      <w:r>
+        <w:t xml:space="preserve">the analysis presented in this paper. For example, we would expect almost all the variance to be explained by drivers in Formula 2 </w:t>
+      </w:r>
+      <w:r>
+        <w:t xml:space="preserve">where all the chassis and </w:t>
+      </w:r>
+      <w:r>
+        <w:t xml:space="preserve">engines are the same. </w:t>
+      </w:r>
+      <w:r>
+        <w:t>Contrasting</w:t>
+      </w:r>
+      <w:r>
+        <w:t xml:space="preserve"> to semi-spec series such as IndyCar and Formula-E where chassis are the same, but power units can vary could provide </w:t>
+      </w:r>
+      <w:r>
+        <w:t xml:space="preserve">a unique perspective on the impact of the driver. </w:t>
+      </w:r>
+    </w:p>
+    <w:p>
+      <w:pPr>
+        <w:pStyle w:val="Heading3"/>
+      </w:pPr>
+      <w:bookmarkStart w:id="26" w:name="_Toc203403176"/>
+      <w:r>
+        <w:t>Applications &amp; Conclusions</w:t>
+      </w:r>
+      <w:bookmarkEnd w:id="26"/>
+    </w:p>
+    <w:p/>
+    <w:p>
+      <w:pPr>
+        <w:pStyle w:val="Caption"/>
+        <w:jc w:val="center"/>
+        <w:rPr>
+          <w:rFonts w:ascii="Arial" w:hAnsi="Arial" w:cs="Arial"/>
+          <w:color w:val="auto"/>
+        </w:rPr>
+      </w:pPr>
+      <w:r>
+        <w:rPr>
+          <w:rFonts w:ascii="Arial" w:hAnsi="Arial" w:cs="Arial"/>
+          <w:color w:val="auto"/>
+        </w:rPr>
+        <w:t xml:space="preserve">Table </w:t>
+      </w:r>
+      <w:r>
+        <w:rPr>
+          <w:rFonts w:ascii="Arial" w:hAnsi="Arial" w:cs="Arial"/>
+          <w:color w:val="auto"/>
+        </w:rPr>
+        <w:fldChar w:fldCharType="begin"/>
+      </w:r>
+      <w:r>
+        <w:rPr>
+          <w:rFonts w:ascii="Arial" w:hAnsi="Arial" w:cs="Arial"/>
+          <w:color w:val="auto"/>
+        </w:rPr>
+        <w:instrText xml:space="preserve"> SEQ Table \* ARABIC </w:instrText>
+      </w:r>
+      <w:r>
+        <w:rPr>
+          <w:rFonts w:ascii="Arial" w:hAnsi="Arial" w:cs="Arial"/>
+          <w:color w:val="auto"/>
+        </w:rPr>
+        <w:fldChar w:fldCharType="separate"/>
+      </w:r>
+      <w:r>
+        <w:rPr>
+          <w:rFonts w:ascii="Arial" w:hAnsi="Arial" w:cs="Arial"/>
+          <w:noProof/>
+          <w:color w:val="auto"/>
+        </w:rPr>
+        <w:t>4</w:t>
+      </w:r>
+      <w:r>
+        <w:rPr>
+          <w:rFonts w:ascii="Arial" w:hAnsi="Arial" w:cs="Arial"/>
+          <w:color w:val="auto"/>
+        </w:rPr>
+        <w:fldChar w:fldCharType="end"/>
+      </w:r>
+      <w:r>
+        <w:rPr>
+          <w:rFonts w:ascii="Arial" w:hAnsi="Arial" w:cs="Arial"/>
+          <w:color w:val="auto"/>
+        </w:rPr>
+        <w:t>: Top 10 Constructor/Driver composite rankings as of the end of the 2023 F1 Season. Composite ranking is defined as driver rating plus constructor rating. ± values represent a 95% confidence interval. Driver and constructor independence is assumed for the overall confidence interval</w:t>
+      </w:r>
+    </w:p>
+    <w:p>
+      <w:pPr>
+        <w:pStyle w:val="Caption"/>
         <w:keepNext/>
         <w:jc w:val="center"/>
       </w:pPr>
+    </w:p>
+    <w:p>
+      <w:pPr>
+        <w:keepNext/>
+        <w:jc w:val="center"/>
+      </w:pPr>
       <w:r>
         <w:rPr>
           <w:noProof/>
         </w:rPr>
         <w:drawing>
-          <wp:inline distT="0" distB="0" distL="0" distR="0" wp14:anchorId="2E41A168" wp14:editId="39E3E6A7">
+          <wp:inline distT="0" distB="0" distL="0" distR="0" wp14:anchorId="2E41A168" wp14:editId="73288122">
             <wp:extent cx="5943600" cy="5754930"/>
             <wp:effectExtent l="0" t="0" r="0" b="0"/>
             <wp:docPr id="1506329886" name="Picture 3"/>
@@ -9685,16 +10621,18 @@
                       <a:picLocks noChangeAspect="1" noChangeArrowheads="1"/>
                     </pic:cNvPicPr>
                   </pic:nvPicPr>
-                  <pic:blipFill rotWithShape="1">
-                    <a:blip r:embed="rId22" cstate="print">
+                  <pic:blipFill>
+                    <a:blip r:embed="rId29" cstate="print">
                       <a:extLst>
                         <a:ext uri="{28A0092B-C50C-407E-A947-70E740481C1C}">
                           <a14:useLocalDpi xmlns:a14="http://schemas.microsoft.com/office/drawing/2010/main" val="0"/>
                         </a:ext>
                       </a:extLst>
                     </a:blip>
-                    <a:srcRect l="17524" r="17511"/>
-                    <a:stretch/>
+                    <a:srcRect l="17490" r="17490"/>
+                    <a:stretch>
+                      <a:fillRect/>
+                    </a:stretch>
                   </pic:blipFill>
                   <pic:spPr bwMode="auto">
                     <a:xfrm>
@@ -9735,7 +10673,15 @@
         <w:t xml:space="preserve"> </w:t>
       </w:r>
       <w:r>
-        <w:t xml:space="preserve">we are able to capture point-time ratings for constructor/driver combinations </w:t>
+        <w:t xml:space="preserve">we </w:t>
+      </w:r>
+      <w:proofErr w:type="gramStart"/>
+      <w:r>
+        <w:t>are able to</w:t>
+      </w:r>
+      <w:proofErr w:type="gramEnd"/>
+      <w:r>
+        <w:t xml:space="preserve"> capture point-time ratings for constructor/driver combinations </w:t>
       </w:r>
       <w:r>
         <w:t xml:space="preserve">to predict race outcomes as highlighted in the table above. </w:t>
@@ -9760,11 +10706,11 @@
         </w:numPr>
         <w:ind w:left="720"/>
       </w:pPr>
-      <w:bookmarkStart w:id="19" w:name="_Toc172717675"/>
+      <w:bookmarkStart w:id="27" w:name="_Toc203403177"/>
       <w:r>
         <w:t>Acknowledgements</w:t>
       </w:r>
-      <w:bookmarkEnd w:id="19"/>
+      <w:bookmarkEnd w:id="27"/>
     </w:p>
     <w:p>
       <w:r>
@@ -9781,11 +10727,11 @@
         </w:numPr>
         <w:ind w:left="720"/>
       </w:pPr>
-      <w:bookmarkStart w:id="20" w:name="_Toc172717676"/>
+      <w:bookmarkStart w:id="28" w:name="_Toc203403178"/>
       <w:r>
         <w:t>References</w:t>
       </w:r>
-      <w:bookmarkEnd w:id="20"/>
+      <w:bookmarkEnd w:id="28"/>
     </w:p>
     <w:p>
       <w:r>
@@ -9839,7 +10785,15 @@
     </w:p>
     <w:p>
       <w:r>
-        <w:t>Jacoby, W.G., 2000. Loess:: a nonparametric, graphical tool for depicting relationships between variables. Electoral studies, 19(4), pp.577-613.</w:t>
+        <w:t xml:space="preserve">Jacoby, W.G., 2000. </w:t>
+      </w:r>
+      <w:proofErr w:type="gramStart"/>
+      <w:r>
+        <w:t>Loess::</w:t>
+      </w:r>
+      <w:proofErr w:type="gramEnd"/>
+      <w:r>
+        <w:t xml:space="preserve"> a nonparametric, graphical tool for depicting relationships between variables. Electoral studies, 19(4), pp.577-613.</w:t>
       </w:r>
     </w:p>
     <w:p>
@@ -9854,13 +10808,13 @@
       </w:r>
     </w:p>
     <w:p>
-      <w:r>
-        <w:t>Phillips, A. (2014) Uncovering Formula One driver performances from 1950 to 2013 by adjusting for team and competition effects. Journal of Quantitative Analysis in Sports, Vol. 10 (Issue 2), pp. 261-278. https://doi.org/10.1515/jqas-2013-0031</w:t>
-      </w:r>
-    </w:p>
-    <w:p>
-      <w:r>
-        <w:t>Rockerbie, D. W. and Easton, S. T. (2022) ‘Race to the podium: separating and conjoining the car and driver in F1 racing’, Applied Economics, 54(54), pp. 6272–6285. doi: 10.1080/00036846.2022.2083068.</w:t>
+      <w:proofErr w:type="spellStart"/>
+      <w:r>
+        <w:t>Rockerbie</w:t>
+      </w:r>
+      <w:proofErr w:type="spellEnd"/>
+      <w:r>
+        <w:t>, D. W. and Easton, S. T. (2022) ‘Race to the podium: separating and conjoining the car and driver in F1 racing’, Applied Economics, 54(54), pp. 6272–6285. doi: 10.1080/00036846.2022.2083068.</w:t>
       </w:r>
     </w:p>
     <w:p>
@@ -9883,7 +10837,7 @@
       <w:r>
         <w:t xml:space="preserve">van Kesteren, E. and Bergkamp, T. (2023) Bayesian analysis of Formula One race results: disentangling driver skill and constructor advantage. Journal of Quantitative Analysis in Sports, Vol. 19 (Issue 4), pp. 273-293. </w:t>
       </w:r>
-      <w:hyperlink r:id="rId23" w:history="1">
+      <w:hyperlink r:id="rId30" w:history="1">
         <w:r>
           <w:rPr>
             <w:rStyle w:val="Hyperlink"/>
@@ -9901,13 +10855,12 @@
         </w:numPr>
         <w:ind w:left="720"/>
       </w:pPr>
-      <w:bookmarkStart w:id="21" w:name="_Toc172717677"/>
+      <w:bookmarkStart w:id="29" w:name="_Toc203403179"/>
       <w:r>
         <w:t>Appendix</w:t>
       </w:r>
-      <w:bookmarkEnd w:id="21"/>
-    </w:p>
-    <w:p/>
+      <w:bookmarkEnd w:id="29"/>
+    </w:p>
     <w:p>
       <w:pPr>
         <w:pStyle w:val="Heading3"/>
@@ -9917,14 +10870,11 @@
         </w:numPr>
         <w:ind w:left="720"/>
       </w:pPr>
-      <w:bookmarkStart w:id="22" w:name="_Toc172717678"/>
-      <w:r>
-        <w:t xml:space="preserve">A1. Metrics by </w:t>
-      </w:r>
-      <w:r>
-        <w:t>Driver-Season Type</w:t>
-      </w:r>
-      <w:bookmarkEnd w:id="22"/>
+      <w:bookmarkStart w:id="30" w:name="_Toc203403180"/>
+      <w:r>
+        <w:t>A1. Time Decay Selection</w:t>
+      </w:r>
+      <w:bookmarkEnd w:id="30"/>
     </w:p>
     <w:p>
       <w:pPr>
@@ -9933,34 +10883,34 @@
         <w:jc w:val="center"/>
         <w:rPr>
           <w:rFonts w:ascii="Arial" w:hAnsi="Arial" w:cs="Arial"/>
-          <w:color w:val="auto"/>
-        </w:rPr>
-      </w:pPr>
-      <w:r>
-        <w:rPr>
-          <w:rFonts w:ascii="Arial" w:hAnsi="Arial" w:cs="Arial"/>
-          <w:color w:val="auto"/>
+          <w:color w:val="000000" w:themeColor="text1"/>
+        </w:rPr>
+      </w:pPr>
+      <w:r>
+        <w:rPr>
+          <w:rFonts w:ascii="Arial" w:hAnsi="Arial" w:cs="Arial"/>
+          <w:color w:val="000000" w:themeColor="text1"/>
         </w:rPr>
         <w:t xml:space="preserve">Table </w:t>
       </w:r>
       <w:r>
         <w:rPr>
           <w:rFonts w:ascii="Arial" w:hAnsi="Arial" w:cs="Arial"/>
-          <w:color w:val="auto"/>
+          <w:color w:val="000000" w:themeColor="text1"/>
         </w:rPr>
         <w:fldChar w:fldCharType="begin"/>
       </w:r>
       <w:r>
         <w:rPr>
           <w:rFonts w:ascii="Arial" w:hAnsi="Arial" w:cs="Arial"/>
-          <w:color w:val="auto"/>
+          <w:color w:val="000000" w:themeColor="text1"/>
         </w:rPr>
         <w:instrText xml:space="preserve"> SEQ Table \* ARABIC </w:instrText>
       </w:r>
       <w:r>
         <w:rPr>
           <w:rFonts w:ascii="Arial" w:hAnsi="Arial" w:cs="Arial"/>
-          <w:color w:val="auto"/>
+          <w:color w:val="000000" w:themeColor="text1"/>
         </w:rPr>
         <w:fldChar w:fldCharType="separate"/>
       </w:r>
@@ -9968,36 +10918,237 @@
         <w:rPr>
           <w:rFonts w:ascii="Arial" w:hAnsi="Arial" w:cs="Arial"/>
           <w:noProof/>
-          <w:color w:val="auto"/>
-        </w:rPr>
-        <w:t>4</w:t>
-      </w:r>
-      <w:r>
-        <w:rPr>
-          <w:rFonts w:ascii="Arial" w:hAnsi="Arial" w:cs="Arial"/>
-          <w:color w:val="auto"/>
+          <w:color w:val="000000" w:themeColor="text1"/>
+        </w:rPr>
+        <w:t>5</w:t>
+      </w:r>
+      <w:r>
+        <w:rPr>
+          <w:rFonts w:ascii="Arial" w:hAnsi="Arial" w:cs="Arial"/>
+          <w:color w:val="000000" w:themeColor="text1"/>
         </w:rPr>
         <w:fldChar w:fldCharType="end"/>
       </w:r>
       <w:r>
         <w:rPr>
           <w:rFonts w:ascii="Arial" w:hAnsi="Arial" w:cs="Arial"/>
-          <w:color w:val="auto"/>
-        </w:rPr>
-        <w:t>: Mean Absolute Error (MAE) by Driver Type. Driver predictions in seasons after they have switched teams are less robust than predictions when the team has stayed the same.</w:t>
-      </w:r>
-    </w:p>
-    <w:p>
-      <w:pPr>
+          <w:color w:val="000000" w:themeColor="text1"/>
+        </w:rPr>
+        <w:t xml:space="preserve"> Hyperparameter selection for time-decay </w:t>
+      </w:r>
+      <w:r>
+        <w:rPr>
+          <w:rFonts w:ascii="Arial" w:hAnsi="Arial" w:cs="Arial"/>
+          <w:color w:val="000000" w:themeColor="text1"/>
+        </w:rPr>
+        <w:t>season</w:t>
+      </w:r>
+      <w:r>
+        <w:rPr>
+          <w:rFonts w:ascii="Arial" w:hAnsi="Arial" w:cs="Arial"/>
+          <w:color w:val="000000" w:themeColor="text1"/>
+        </w:rPr>
+        <w:t xml:space="preserve"> and round parameters. Season decay factor of 0.75 and round decay of 0.0750 was chosen.</w:t>
+      </w:r>
+    </w:p>
+    <w:p>
+      <w:pPr>
+        <w:jc w:val="center"/>
+      </w:pPr>
+      <w:r>
+        <w:rPr>
+          <w:noProof/>
+        </w:rPr>
+        <w:drawing>
+          <wp:inline distT="0" distB="0" distL="0" distR="0" wp14:anchorId="5D4133DC" wp14:editId="1281EBDF">
+            <wp:extent cx="4571999" cy="3173591"/>
+            <wp:effectExtent l="0" t="0" r="635" b="1905"/>
+            <wp:docPr id="999873629" name="Picture 3"/>
+            <wp:cNvGraphicFramePr>
+              <a:graphicFrameLocks xmlns:a="http://schemas.openxmlformats.org/drawingml/2006/main" noChangeAspect="1"/>
+            </wp:cNvGraphicFramePr>
+            <a:graphic xmlns:a="http://schemas.openxmlformats.org/drawingml/2006/main">
+              <a:graphicData uri="http://schemas.openxmlformats.org/drawingml/2006/picture">
+                <pic:pic xmlns:pic="http://schemas.openxmlformats.org/drawingml/2006/picture">
+                  <pic:nvPicPr>
+                    <pic:cNvPr id="999873629" name="Picture 3"/>
+                    <pic:cNvPicPr/>
+                  </pic:nvPicPr>
+                  <pic:blipFill>
+                    <a:blip r:embed="rId31" cstate="print">
+                      <a:extLst>
+                        <a:ext uri="{28A0092B-C50C-407E-A947-70E740481C1C}">
+                          <a14:useLocalDpi xmlns:a14="http://schemas.microsoft.com/office/drawing/2010/main" val="0"/>
+                        </a:ext>
+                      </a:extLst>
+                    </a:blip>
+                    <a:stretch>
+                      <a:fillRect/>
+                    </a:stretch>
+                  </pic:blipFill>
+                  <pic:spPr>
+                    <a:xfrm>
+                      <a:off x="0" y="0"/>
+                      <a:ext cx="4571999" cy="3173591"/>
+                    </a:xfrm>
+                    <a:prstGeom prst="rect">
+                      <a:avLst/>
+                    </a:prstGeom>
+                  </pic:spPr>
+                </pic:pic>
+              </a:graphicData>
+            </a:graphic>
+          </wp:inline>
+        </w:drawing>
+      </w:r>
+    </w:p>
+    <w:p>
+      <w:pPr>
+        <w:keepNext/>
+      </w:pPr>
+    </w:p>
+    <w:p>
+      <w:r>
+        <w:t xml:space="preserve">The time-decay factor is chosen through a grid-search for both season and round level decay. A season decay factor of 0.75 and round decay of 0.075 was found to have the best performance by MAE. </w:t>
+      </w:r>
+      <w:r>
+        <w:t xml:space="preserve">Kendall Tau and </w:t>
+      </w:r>
+      <w:proofErr w:type="spellStart"/>
+      <w:r>
+        <w:t>nDCG</w:t>
+      </w:r>
+      <w:proofErr w:type="spellEnd"/>
+      <w:r>
+        <w:t xml:space="preserve"> were used as additional </w:t>
+      </w:r>
+      <w:r>
+        <w:t>guardrails</w:t>
+      </w:r>
+      <w:r>
+        <w:t xml:space="preserve"> for hyperparameter selection. </w:t>
+      </w:r>
+    </w:p>
+    <w:p>
+      <w:pPr>
+        <w:pStyle w:val="Heading3"/>
+        <w:numPr>
+          <w:ilvl w:val="0"/>
+          <w:numId w:val="0"/>
+        </w:numPr>
+        <w:ind w:left="720"/>
+      </w:pPr>
+    </w:p>
+    <w:p>
+      <w:pPr>
+        <w:pStyle w:val="Heading3"/>
+        <w:numPr>
+          <w:ilvl w:val="0"/>
+          <w:numId w:val="0"/>
+        </w:numPr>
+        <w:ind w:left="720"/>
+      </w:pPr>
+      <w:bookmarkStart w:id="31" w:name="_Toc203403181"/>
+      <w:commentRangeStart w:id="32"/>
+      <w:r>
+        <w:t>A</w:t>
+      </w:r>
+      <w:r>
+        <w:t>2</w:t>
+      </w:r>
+      <w:r>
+        <w:t xml:space="preserve">. Metrics by </w:t>
+      </w:r>
+      <w:r>
+        <w:t>Driver-Season Type</w:t>
+      </w:r>
+      <w:bookmarkEnd w:id="31"/>
+      <w:commentRangeEnd w:id="32"/>
+      <w:r>
+        <w:rPr>
+          <w:rStyle w:val="CommentReference"/>
+          <w:rFonts w:eastAsiaTheme="minorHAnsi"/>
+          <w:b w:val="0"/>
+          <w:bCs w:val="0"/>
+        </w:rPr>
+        <w:commentReference w:id="32"/>
+      </w:r>
+    </w:p>
+    <w:p>
+      <w:pPr>
+        <w:pStyle w:val="Caption"/>
         <w:keepNext/>
         <w:jc w:val="center"/>
-      </w:pPr>
-      <w:r>
-        <w:rPr>
+        <w:rPr>
+          <w:rFonts w:ascii="Arial" w:hAnsi="Arial" w:cs="Arial"/>
+          <w:color w:val="auto"/>
+        </w:rPr>
+      </w:pPr>
+      <w:bookmarkStart w:id="33" w:name="OLE_LINK1"/>
+      <w:r>
+        <w:rPr>
+          <w:rFonts w:ascii="Arial" w:hAnsi="Arial" w:cs="Arial"/>
+          <w:color w:val="auto"/>
+        </w:rPr>
+        <w:t xml:space="preserve">Table </w:t>
+      </w:r>
+      <w:r>
+        <w:rPr>
+          <w:rFonts w:ascii="Arial" w:hAnsi="Arial" w:cs="Arial"/>
+          <w:color w:val="auto"/>
+        </w:rPr>
+        <w:fldChar w:fldCharType="begin"/>
+      </w:r>
+      <w:r>
+        <w:rPr>
+          <w:rFonts w:ascii="Arial" w:hAnsi="Arial" w:cs="Arial"/>
+          <w:color w:val="auto"/>
+        </w:rPr>
+        <w:instrText xml:space="preserve"> SEQ Table \* ARABIC </w:instrText>
+      </w:r>
+      <w:r>
+        <w:rPr>
+          <w:rFonts w:ascii="Arial" w:hAnsi="Arial" w:cs="Arial"/>
+          <w:color w:val="auto"/>
+        </w:rPr>
+        <w:fldChar w:fldCharType="separate"/>
+      </w:r>
+      <w:r>
+        <w:rPr>
+          <w:rFonts w:ascii="Arial" w:hAnsi="Arial" w:cs="Arial"/>
           <w:noProof/>
+          <w:color w:val="auto"/>
+        </w:rPr>
+        <w:t>6</w:t>
+      </w:r>
+      <w:r>
+        <w:rPr>
+          <w:rFonts w:ascii="Arial" w:hAnsi="Arial" w:cs="Arial"/>
+          <w:color w:val="auto"/>
+        </w:rPr>
+        <w:fldChar w:fldCharType="end"/>
+      </w:r>
+      <w:r>
+        <w:rPr>
+          <w:rFonts w:ascii="Arial" w:hAnsi="Arial" w:cs="Arial"/>
+          <w:color w:val="auto"/>
+        </w:rPr>
+        <w:t>: Mean Absolute Error (MAE) by Driver Type. Driver predictions in seasons after they have switched teams are less robust than predictions when the team has stayed the same.</w:t>
+      </w:r>
+    </w:p>
+    <w:p>
+      <w:pPr>
+        <w:keepNext/>
+        <w:jc w:val="center"/>
+      </w:pPr>
+      <w:bookmarkStart w:id="34" w:name="OLE_LINK2"/>
+      <w:bookmarkEnd w:id="33"/>
+      <w:r>
+        <w:rPr>
+          <w:noProof/>
         </w:rPr>
         <w:drawing>
-          <wp:inline distT="0" distB="0" distL="0" distR="0" wp14:anchorId="4DBD23A4" wp14:editId="660CFFEC">
+          <wp:inline distT="0" distB="0" distL="0" distR="0" wp14:anchorId="4DBD23A4" wp14:editId="55AEE887">
             <wp:extent cx="2971800" cy="1626250"/>
             <wp:effectExtent l="0" t="0" r="0" b="0"/>
             <wp:docPr id="111138984" name="Picture 22"/>
@@ -10013,16 +11164,18 @@
                       <a:picLocks noChangeAspect="1" noChangeArrowheads="1"/>
                     </pic:cNvPicPr>
                   </pic:nvPicPr>
-                  <pic:blipFill rotWithShape="1">
-                    <a:blip r:embed="rId24" cstate="print">
+                  <pic:blipFill>
+                    <a:blip r:embed="rId32" cstate="print">
                       <a:extLst>
                         <a:ext uri="{28A0092B-C50C-407E-A947-70E740481C1C}">
                           <a14:useLocalDpi xmlns:a14="http://schemas.microsoft.com/office/drawing/2010/main" val="0"/>
                         </a:ext>
                       </a:extLst>
                     </a:blip>
-                    <a:srcRect l="30172" r="30407"/>
-                    <a:stretch/>
+                    <a:srcRect l="30296" r="30296"/>
+                    <a:stretch>
+                      <a:fillRect/>
+                    </a:stretch>
                   </pic:blipFill>
                   <pic:spPr bwMode="auto">
                     <a:xfrm>
@@ -10069,7 +11222,11 @@
         <w:t xml:space="preserve">As expected, the model is stronger at predicting the performance of teams staying with the same constructor than those </w:t>
       </w:r>
       <w:r>
-        <w:t xml:space="preserve">that have switched teams. </w:t>
+        <w:t xml:space="preserve">that have switched </w:t>
+      </w:r>
+      <w:bookmarkEnd w:id="34"/>
+      <w:r>
+        <w:t xml:space="preserve">teams. </w:t>
       </w:r>
       <w:r>
         <w:t xml:space="preserve">Counter-intuitively to that, we see that the error amongst new drivers altogether is </w:t>
@@ -10078,7 +11235,15 @@
         <w:t>better than the other categories.</w:t>
       </w:r>
       <w:r>
-        <w:t xml:space="preserve"> The lower error amongst that cohort can potentially by explained by the nature of the constructors new drivers go to. New drivers are </w:t>
+        <w:t xml:space="preserve"> The lower error amongst that cohort can potentially by explained by the nature of the </w:t>
+      </w:r>
+      <w:proofErr w:type="gramStart"/>
+      <w:r>
+        <w:t>constructors</w:t>
+      </w:r>
+      <w:proofErr w:type="gramEnd"/>
+      <w:r>
+        <w:t xml:space="preserve"> new drivers go to. New drivers are </w:t>
       </w:r>
       <w:r>
         <w:t xml:space="preserve">often going to </w:t>
@@ -10108,6 +11273,7 @@
         <w:t xml:space="preserve"> Ferrari). </w:t>
       </w:r>
     </w:p>
+    <w:p/>
     <w:p>
       <w:pPr>
         <w:pStyle w:val="Heading3"/>
@@ -10117,13 +11283,12 @@
         </w:numPr>
         <w:ind w:left="720"/>
       </w:pPr>
-      <w:bookmarkStart w:id="23" w:name="_Toc172717679"/>
-      <w:r>
-        <w:lastRenderedPageBreak/>
+      <w:bookmarkStart w:id="35" w:name="_Toc203403182"/>
+      <w:r>
         <w:t>A</w:t>
       </w:r>
       <w:r>
-        <w:t>2</w:t>
+        <w:t>3</w:t>
       </w:r>
       <w:r>
         <w:t xml:space="preserve">. </w:t>
@@ -10137,7 +11302,7 @@
       <w:r>
         <w:t xml:space="preserve"> Mapping</w:t>
       </w:r>
-      <w:bookmarkEnd w:id="23"/>
+      <w:bookmarkEnd w:id="35"/>
     </w:p>
     <w:p>
       <w:pPr>
@@ -10179,7 +11344,7 @@
                     </pic:cNvPicPr>
                   </pic:nvPicPr>
                   <pic:blipFill>
-                    <a:blip r:embed="rId25" cstate="print">
+                    <a:blip r:embed="rId33" cstate="print">
                       <a:extLst>
                         <a:ext uri="{28A0092B-C50C-407E-A947-70E740481C1C}">
                           <a14:useLocalDpi xmlns:a14="http://schemas.microsoft.com/office/drawing/2010/main" val="0"/>
@@ -10249,7 +11414,7 @@
           <w:noProof/>
           <w:color w:val="auto"/>
         </w:rPr>
-        <w:t>8</w:t>
+        <w:t>10</w:t>
       </w:r>
       <w:r>
         <w:rPr>
@@ -10275,12 +11440,12 @@
         </w:numPr>
         <w:ind w:left="720"/>
       </w:pPr>
-      <w:bookmarkStart w:id="24" w:name="_Toc172717680"/>
+      <w:bookmarkStart w:id="36" w:name="_Toc203403183"/>
       <w:r>
         <w:t>A</w:t>
       </w:r>
       <w:r>
-        <w:t>3</w:t>
+        <w:t>4</w:t>
       </w:r>
       <w:r>
         <w:t xml:space="preserve">. </w:t>
@@ -10294,7 +11459,7 @@
       <w:r>
         <w:t xml:space="preserve"> Ratings as of 2024 British GP</w:t>
       </w:r>
-      <w:bookmarkEnd w:id="24"/>
+      <w:bookmarkEnd w:id="36"/>
     </w:p>
     <w:p/>
     <w:p>
@@ -10312,6 +11477,7 @@
           <w:rFonts w:ascii="Arial" w:hAnsi="Arial" w:cs="Arial"/>
           <w:color w:val="auto"/>
         </w:rPr>
+        <w:lastRenderedPageBreak/>
         <w:t xml:space="preserve">Table </w:t>
       </w:r>
       <w:r>
@@ -10341,7 +11507,7 @@
           <w:noProof/>
           <w:color w:val="auto"/>
         </w:rPr>
-        <w:t>5</w:t>
+        <w:t>7</w:t>
       </w:r>
       <w:r>
         <w:rPr>
@@ -10368,9 +11534,9 @@
           <w:noProof/>
         </w:rPr>
         <w:drawing>
-          <wp:inline distT="0" distB="0" distL="0" distR="0" wp14:anchorId="6799AD91" wp14:editId="2F82A010">
-            <wp:extent cx="5943600" cy="2722245"/>
-            <wp:effectExtent l="0" t="0" r="0" b="1905"/>
+          <wp:inline distT="0" distB="0" distL="0" distR="0" wp14:anchorId="6799AD91" wp14:editId="31E267A5">
+            <wp:extent cx="5909733" cy="3869913"/>
+            <wp:effectExtent l="0" t="0" r="0" b="3810"/>
             <wp:docPr id="1957599217" name="Picture 7">
               <a:extLst xmlns:a="http://schemas.openxmlformats.org/drawingml/2006/main">
                 <a:ext uri="{FF2B5EF4-FFF2-40B4-BE49-F238E27FC236}">
@@ -10396,27 +11562,33 @@
                       <a:picLocks noChangeAspect="1"/>
                     </pic:cNvPicPr>
                   </pic:nvPicPr>
-                  <pic:blipFill>
-                    <a:blip r:embed="rId26" cstate="print">
+                  <pic:blipFill rotWithShape="1">
+                    <a:blip r:embed="rId34" cstate="print">
                       <a:extLst>
                         <a:ext uri="{28A0092B-C50C-407E-A947-70E740481C1C}">
                           <a14:useLocalDpi xmlns:a14="http://schemas.microsoft.com/office/drawing/2010/main" val="0"/>
                         </a:ext>
                       </a:extLst>
                     </a:blip>
-                    <a:srcRect t="463" b="463"/>
-                    <a:stretch>
-                      <a:fillRect/>
-                    </a:stretch>
+                    <a:srcRect l="15100" t="1589" r="14957" b="1589"/>
+                    <a:stretch/>
                   </pic:blipFill>
-                  <pic:spPr>
+                  <pic:spPr bwMode="auto">
                     <a:xfrm>
                       <a:off x="0" y="0"/>
-                      <a:ext cx="5943600" cy="2722245"/>
+                      <a:ext cx="5955261" cy="3899727"/>
                     </a:xfrm>
                     <a:prstGeom prst="rect">
                       <a:avLst/>
                     </a:prstGeom>
+                    <a:ln>
+                      <a:noFill/>
+                    </a:ln>
+                    <a:extLst>
+                      <a:ext uri="{53640926-AAD7-44D8-BBD7-CCE9431645EC}">
+                        <a14:shadowObscured xmlns:a14="http://schemas.microsoft.com/office/drawing/2010/main"/>
+                      </a:ext>
+                    </a:extLst>
                   </pic:spPr>
                 </pic:pic>
               </a:graphicData>
@@ -10471,7 +11643,7 @@
           <w:noProof/>
           <w:color w:val="auto"/>
         </w:rPr>
-        <w:t>6</w:t>
+        <w:t>8</w:t>
       </w:r>
       <w:r>
         <w:rPr>
@@ -10498,9 +11670,9 @@
           <w:noProof/>
         </w:rPr>
         <w:drawing>
-          <wp:inline distT="0" distB="0" distL="0" distR="0" wp14:anchorId="2837F3D7" wp14:editId="38FAD6EF">
+          <wp:inline distT="0" distB="0" distL="0" distR="0" wp14:anchorId="2837F3D7" wp14:editId="2CB32283">
             <wp:extent cx="5943600" cy="4921250"/>
-            <wp:effectExtent l="0" t="0" r="0" b="0"/>
+            <wp:effectExtent l="0" t="0" r="0" b="6350"/>
             <wp:docPr id="10" name="Picture 9">
               <a:extLst xmlns:a="http://schemas.openxmlformats.org/drawingml/2006/main">
                 <a:ext uri="{FF2B5EF4-FFF2-40B4-BE49-F238E27FC236}">
@@ -10527,14 +11699,14 @@
                     </pic:cNvPicPr>
                   </pic:nvPicPr>
                   <pic:blipFill>
-                    <a:blip r:embed="rId27" cstate="print">
+                    <a:blip r:embed="rId35" cstate="print">
                       <a:extLst>
                         <a:ext uri="{28A0092B-C50C-407E-A947-70E740481C1C}">
                           <a14:useLocalDpi xmlns:a14="http://schemas.microsoft.com/office/drawing/2010/main" val="0"/>
                         </a:ext>
                       </a:extLst>
                     </a:blip>
-                    <a:srcRect l="12011" r="12011"/>
+                    <a:srcRect l="11877" r="11877"/>
                     <a:stretch>
                       <a:fillRect/>
                     </a:stretch>
@@ -10602,7 +11774,7 @@
           <w:noProof/>
           <w:color w:val="auto"/>
         </w:rPr>
-        <w:t>7</w:t>
+        <w:t>9</w:t>
       </w:r>
       <w:r>
         <w:rPr>
@@ -10629,9 +11801,9 @@
           <w:noProof/>
         </w:rPr>
         <w:drawing>
-          <wp:inline distT="0" distB="0" distL="0" distR="0" wp14:anchorId="463C4C90" wp14:editId="15ED966A">
-            <wp:extent cx="5783738" cy="4469130"/>
-            <wp:effectExtent l="0" t="0" r="7620" b="7620"/>
+          <wp:inline distT="0" distB="0" distL="0" distR="0" wp14:anchorId="463C4C90" wp14:editId="564EEBA6">
+            <wp:extent cx="4047067" cy="3266166"/>
+            <wp:effectExtent l="0" t="0" r="4445" b="0"/>
             <wp:docPr id="7" name="Picture 6">
               <a:extLst xmlns:a="http://schemas.openxmlformats.org/drawingml/2006/main">
                 <a:ext uri="{FF2B5EF4-FFF2-40B4-BE49-F238E27FC236}">
@@ -10657,26 +11829,33 @@
                       <a:picLocks noChangeAspect="1"/>
                     </pic:cNvPicPr>
                   </pic:nvPicPr>
-                  <pic:blipFill>
-                    <a:blip r:embed="rId28" cstate="print">
+                  <pic:blipFill rotWithShape="1">
+                    <a:blip r:embed="rId36" cstate="print">
                       <a:extLst>
                         <a:ext uri="{28A0092B-C50C-407E-A947-70E740481C1C}">
                           <a14:useLocalDpi xmlns:a14="http://schemas.microsoft.com/office/drawing/2010/main" val="0"/>
                         </a:ext>
                       </a:extLst>
                     </a:blip>
-                    <a:stretch>
-                      <a:fillRect/>
-                    </a:stretch>
+                    <a:srcRect l="26797" r="26488"/>
+                    <a:stretch/>
                   </pic:blipFill>
-                  <pic:spPr>
+                  <pic:spPr bwMode="auto">
                     <a:xfrm>
                       <a:off x="0" y="0"/>
-                      <a:ext cx="5783738" cy="4469130"/>
+                      <a:ext cx="4080631" cy="3293254"/>
                     </a:xfrm>
                     <a:prstGeom prst="rect">
                       <a:avLst/>
                     </a:prstGeom>
+                    <a:ln>
+                      <a:noFill/>
+                    </a:ln>
+                    <a:extLst>
+                      <a:ext uri="{53640926-AAD7-44D8-BBD7-CCE9431645EC}">
+                        <a14:shadowObscured xmlns:a14="http://schemas.microsoft.com/office/drawing/2010/main"/>
+                      </a:ext>
+                    </a:extLst>
                   </pic:spPr>
                 </pic:pic>
               </a:graphicData>
@@ -10755,17 +11934,28 @@
         </w:numPr>
         <w:ind w:left="720" w:hanging="360"/>
       </w:pPr>
-      <w:bookmarkStart w:id="25" w:name="_Toc172717681"/>
+      <w:bookmarkStart w:id="37" w:name="_Toc203403184"/>
+      <w:commentRangeStart w:id="38"/>
       <w:r>
         <w:t>A</w:t>
       </w:r>
       <w:r>
-        <w:t>4</w:t>
+        <w:t>5</w:t>
       </w:r>
       <w:r>
         <w:t>. Driver/Constructor Coefficient/Ratings Trends 2014 - 2024 British GP</w:t>
       </w:r>
-      <w:bookmarkEnd w:id="25"/>
+      <w:commentRangeEnd w:id="38"/>
+      <w:r>
+        <w:rPr>
+          <w:rStyle w:val="CommentReference"/>
+          <w:rFonts w:eastAsiaTheme="minorHAnsi"/>
+          <w:b w:val="0"/>
+          <w:bCs w:val="0"/>
+        </w:rPr>
+        <w:commentReference w:id="38"/>
+      </w:r>
+      <w:bookmarkEnd w:id="37"/>
     </w:p>
     <w:p/>
     <w:p>
@@ -10776,9 +11966,10 @@
         <w:rPr>
           <w:noProof/>
         </w:rPr>
+        <w:lastRenderedPageBreak/>
         <w:drawing>
-          <wp:inline distT="0" distB="0" distL="0" distR="0" wp14:anchorId="55CB02C9" wp14:editId="0EF62909">
-            <wp:extent cx="5943600" cy="6884169"/>
+          <wp:inline distT="0" distB="0" distL="0" distR="0" wp14:anchorId="55CB02C9" wp14:editId="4FF3A590">
+            <wp:extent cx="5943600" cy="6813126"/>
             <wp:effectExtent l="0" t="0" r="0" b="0"/>
             <wp:docPr id="44" name="Picture 43">
               <a:extLst xmlns:a="http://schemas.openxmlformats.org/drawingml/2006/main">
@@ -10806,7 +11997,7 @@
                     </pic:cNvPicPr>
                   </pic:nvPicPr>
                   <pic:blipFill>
-                    <a:blip r:embed="rId29" cstate="print">
+                    <a:blip r:embed="rId37" cstate="print">
                       <a:extLst>
                         <a:ext uri="{28A0092B-C50C-407E-A947-70E740481C1C}">
                           <a14:useLocalDpi xmlns:a14="http://schemas.microsoft.com/office/drawing/2010/main" val="0"/>
@@ -10820,7 +12011,7 @@
                   <pic:spPr>
                     <a:xfrm>
                       <a:off x="0" y="0"/>
-                      <a:ext cx="5943600" cy="6884169"/>
+                      <a:ext cx="5943600" cy="6813126"/>
                     </a:xfrm>
                     <a:prstGeom prst="rect">
                       <a:avLst/>
@@ -10878,7 +12069,7 @@
           <w:noProof/>
           <w:color w:val="auto"/>
         </w:rPr>
-        <w:t>9</w:t>
+        <w:t>11</w:t>
       </w:r>
       <w:r>
         <w:rPr>
@@ -10905,9 +12096,9 @@
         </w:rPr>
         <w:lastRenderedPageBreak/>
         <w:drawing>
-          <wp:inline distT="0" distB="0" distL="0" distR="0" wp14:anchorId="0E5ABABC" wp14:editId="19C7218F">
-            <wp:extent cx="5943600" cy="7425899"/>
-            <wp:effectExtent l="0" t="0" r="0" b="3810"/>
+          <wp:inline distT="0" distB="0" distL="0" distR="0" wp14:anchorId="0E5ABABC" wp14:editId="12D28C12">
+            <wp:extent cx="5940719" cy="7425899"/>
+            <wp:effectExtent l="0" t="0" r="3175" b="3810"/>
             <wp:docPr id="26" name="Picture 25">
               <a:extLst xmlns:a="http://schemas.openxmlformats.org/drawingml/2006/main">
                 <a:ext uri="{FF2B5EF4-FFF2-40B4-BE49-F238E27FC236}">
@@ -10934,7 +12125,7 @@
                     </pic:cNvPicPr>
                   </pic:nvPicPr>
                   <pic:blipFill>
-                    <a:blip r:embed="rId30" cstate="print">
+                    <a:blip r:embed="rId38" cstate="print">
                       <a:extLst>
                         <a:ext uri="{28A0092B-C50C-407E-A947-70E740481C1C}">
                           <a14:useLocalDpi xmlns:a14="http://schemas.microsoft.com/office/drawing/2010/main" val="0"/>
@@ -10948,7 +12139,7 @@
                   <pic:spPr>
                     <a:xfrm>
                       <a:off x="0" y="0"/>
-                      <a:ext cx="5943600" cy="7425899"/>
+                      <a:ext cx="5940719" cy="7425899"/>
                     </a:xfrm>
                     <a:prstGeom prst="rect">
                       <a:avLst/>
@@ -10973,6 +12164,7 @@
           <w:color w:val="auto"/>
         </w:rPr>
       </w:pPr>
+      <w:commentRangeStart w:id="39"/>
       <w:r>
         <w:rPr>
           <w:rFonts w:ascii="Arial" w:hAnsi="Arial" w:cs="Arial"/>
@@ -11007,7 +12199,7 @@
           <w:noProof/>
           <w:color w:val="auto"/>
         </w:rPr>
-        <w:t>10</w:t>
+        <w:t>12</w:t>
       </w:r>
       <w:r>
         <w:rPr>
@@ -11023,9 +12215,19 @@
         </w:rPr>
         <w:t>: Constructor Ranking/Coefficient Trend 2014 - 2024 British GP. Shaded area represents a 95% confidence interval.</w:t>
       </w:r>
+      <w:commentRangeEnd w:id="39"/>
+      <w:r>
+        <w:rPr>
+          <w:rStyle w:val="CommentReference"/>
+          <w:i w:val="0"/>
+          <w:iCs w:val="0"/>
+          <w:color w:val="auto"/>
+        </w:rPr>
+        <w:commentReference w:id="39"/>
+      </w:r>
     </w:p>
     <w:sectPr>
-      <w:footerReference w:type="default" r:id="rId31"/>
+      <w:footerReference w:type="default" r:id="rId39"/>
       <w:pgSz w:w="12240" w:h="15840"/>
       <w:pgMar w:top="1440" w:right="1440" w:bottom="1440" w:left="1440" w:header="720" w:footer="720" w:gutter="0"/>
       <w:cols w:space="720"/>
@@ -11035,8 +12237,238 @@
 </w:document>
 </file>
 
+<file path=word/comments.xml><?xml version="1.0" encoding="utf-8"?>
+<w:comments xmlns:wpc="http://schemas.microsoft.com/office/word/2010/wordprocessingCanvas" xmlns:cx="http://schemas.microsoft.com/office/drawing/2014/chartex" xmlns:cx1="http://schemas.microsoft.com/office/drawing/2015/9/8/chartex" xmlns:cx2="http://schemas.microsoft.com/office/drawing/2015/10/21/chartex" xmlns:cx3="http://schemas.microsoft.com/office/drawing/2016/5/9/chartex" xmlns:cx4="http://schemas.microsoft.com/office/drawing/2016/5/10/chartex" xmlns:cx5="http://schemas.microsoft.com/office/drawing/2016/5/11/chartex" xmlns:cx6="http://schemas.microsoft.com/office/drawing/2016/5/12/chartex" xmlns:cx7="http://schemas.microsoft.com/office/drawing/2016/5/13/chartex" xmlns:cx8="http://schemas.microsoft.com/office/drawing/2016/5/14/chartex" xmlns:mc="http://schemas.openxmlformats.org/markup-compatibility/2006" xmlns:aink="http://schemas.microsoft.com/office/drawing/2016/ink" xmlns:am3d="http://schemas.microsoft.com/office/drawing/2017/model3d" xmlns:o="urn:schemas-microsoft-com:office:office" xmlns:oel="http://schemas.microsoft.com/office/2019/extlst" xmlns:r="http://schemas.openxmlformats.org/officeDocument/2006/relationships" xmlns:m="http://schemas.openxmlformats.org/officeDocument/2006/math" xmlns:v="urn:schemas-microsoft-com:vml" xmlns:wp14="http://schemas.microsoft.com/office/word/2010/wordprocessingDrawing" xmlns:wp="http://schemas.openxmlformats.org/drawingml/2006/wordprocessingDrawing" xmlns:w10="urn:schemas-microsoft-com:office:word" xmlns:w="http://schemas.openxmlformats.org/wordprocessingml/2006/main" xmlns:w14="http://schemas.microsoft.com/office/word/2010/wordml" xmlns:w15="http://schemas.microsoft.com/office/word/2012/wordml" xmlns:w16cex="http://schemas.microsoft.com/office/word/2018/wordml/cex" xmlns:w16cid="http://schemas.microsoft.com/office/word/2016/wordml/cid" xmlns:w16="http://schemas.microsoft.com/office/word/2018/wordml" xmlns:w16du="http://schemas.microsoft.com/office/word/2023/wordml/word16du" xmlns:w16sdtdh="http://schemas.microsoft.com/office/word/2020/wordml/sdtdatahash" xmlns:w16sdtfl="http://schemas.microsoft.com/office/word/2024/wordml/sdtformatlock" xmlns:w16se="http://schemas.microsoft.com/office/word/2015/wordml/symex" xmlns:wpg="http://schemas.microsoft.com/office/word/2010/wordprocessingGroup" xmlns:wpi="http://schemas.microsoft.com/office/word/2010/wordprocessingInk" xmlns:wne="http://schemas.microsoft.com/office/word/2006/wordml" xmlns:wps="http://schemas.microsoft.com/office/word/2010/wordprocessingShape" mc:Ignorable="w14 w15 w16se w16cid w16 w16cex w16sdtdh w16sdtfl w16du wp14">
+  <w:comment w:id="2" w:author="Saurabh Rane" w:date="2025-07-12T11:00:00Z" w:initials="SR">
+    <w:p>
+      <w:r>
+        <w:rPr>
+          <w:rStyle w:val="CommentReference"/>
+        </w:rPr>
+        <w:annotationRef/>
+      </w:r>
+      <w:r>
+        <w:rPr>
+          <w:color w:val="000000"/>
+          <w:sz w:val="20"/>
+          <w:szCs w:val="20"/>
+        </w:rPr>
+        <w:t>Validate number</w:t>
+      </w:r>
+    </w:p>
+  </w:comment>
+  <w:comment w:id="4" w:author="Saurabh Rane" w:date="2025-07-08T15:01:00Z" w:initials="SR">
+    <w:p>
+      <w:r>
+        <w:rPr>
+          <w:rStyle w:val="CommentReference"/>
+        </w:rPr>
+        <w:annotationRef/>
+      </w:r>
+      <w:r>
+        <w:rPr>
+          <w:color w:val="000000"/>
+          <w:sz w:val="20"/>
+          <w:szCs w:val="20"/>
+        </w:rPr>
+        <w:t>Talk about Philips paper</w:t>
+      </w:r>
+    </w:p>
+  </w:comment>
+  <w:comment w:id="6" w:author="Saurabh Rane" w:date="2025-07-08T15:02:00Z" w:initials="SR">
+    <w:p>
+      <w:r>
+        <w:rPr>
+          <w:rStyle w:val="CommentReference"/>
+        </w:rPr>
+        <w:annotationRef/>
+      </w:r>
+      <w:r>
+        <w:rPr>
+          <w:color w:val="000000"/>
+          <w:sz w:val="20"/>
+          <w:szCs w:val="20"/>
+        </w:rPr>
+        <w:t>Add figure to address exclusion of DNF</w:t>
+      </w:r>
+    </w:p>
+  </w:comment>
+  <w:comment w:id="7" w:author="Saurabh Rane" w:date="2025-07-12T11:22:00Z" w:initials="SR">
+    <w:p>
+      <w:r>
+        <w:rPr>
+          <w:rStyle w:val="CommentReference"/>
+        </w:rPr>
+        <w:annotationRef/>
+      </w:r>
+      <w:r>
+        <w:rPr>
+          <w:color w:val="000000"/>
+          <w:sz w:val="20"/>
+          <w:szCs w:val="20"/>
+        </w:rPr>
+        <w:t>Add reference to in later section on validity of points weighting</w:t>
+      </w:r>
+    </w:p>
+  </w:comment>
+  <w:comment w:id="10" w:author="Saurabh Rane" w:date="2025-07-08T15:04:00Z" w:initials="SR">
+    <w:p>
+      <w:r>
+        <w:rPr>
+          <w:rStyle w:val="CommentReference"/>
+        </w:rPr>
+        <w:annotationRef/>
+      </w:r>
+      <w:r>
+        <w:rPr>
+          <w:color w:val="000000"/>
+          <w:sz w:val="20"/>
+          <w:szCs w:val="20"/>
+        </w:rPr>
+        <w:t>Add item about time decay parameter selection</w:t>
+      </w:r>
+    </w:p>
+  </w:comment>
+  <w:comment w:id="15" w:author="Saurabh Rane" w:date="2025-07-11T18:17:00Z" w:initials="SR">
+    <w:p>
+      <w:r>
+        <w:rPr>
+          <w:rStyle w:val="CommentReference"/>
+        </w:rPr>
+        <w:annotationRef/>
+      </w:r>
+      <w:r>
+        <w:rPr>
+          <w:color w:val="000000"/>
+          <w:sz w:val="20"/>
+          <w:szCs w:val="20"/>
+        </w:rPr>
+        <w:t>Add in nDCG as consideration</w:t>
+      </w:r>
+    </w:p>
+  </w:comment>
+  <w:comment w:id="21" w:author="Saurabh Rane" w:date="2025-07-08T15:06:00Z" w:initials="SR">
+    <w:p>
+      <w:r>
+        <w:rPr>
+          <w:rStyle w:val="CommentReference"/>
+        </w:rPr>
+        <w:annotationRef/>
+      </w:r>
+      <w:r>
+        <w:rPr>
+          <w:color w:val="000000"/>
+          <w:sz w:val="20"/>
+          <w:szCs w:val="20"/>
+        </w:rPr>
+        <w:t>Commentary on Alonso</w:t>
+      </w:r>
+    </w:p>
+  </w:comment>
+  <w:comment w:id="32" w:author="Saurabh Rane" w:date="2025-07-14T22:52:00Z" w:initials="SR">
+    <w:p>
+      <w:r>
+        <w:rPr>
+          <w:rStyle w:val="CommentReference"/>
+        </w:rPr>
+        <w:annotationRef/>
+      </w:r>
+      <w:r>
+        <w:rPr>
+          <w:color w:val="000000"/>
+          <w:sz w:val="20"/>
+          <w:szCs w:val="20"/>
+        </w:rPr>
+        <w:t>Update MAE by Driver-Season</w:t>
+      </w:r>
+    </w:p>
+  </w:comment>
+  <w:comment w:id="38" w:author="Saurabh Rane" w:date="2025-07-14T16:29:00Z" w:initials="SR">
+    <w:p>
+      <w:r>
+        <w:rPr>
+          <w:rStyle w:val="CommentReference"/>
+        </w:rPr>
+        <w:annotationRef/>
+      </w:r>
+      <w:r>
+        <w:rPr>
+          <w:color w:val="000000"/>
+          <w:sz w:val="20"/>
+          <w:szCs w:val="20"/>
+        </w:rPr>
+        <w:t>Update Charts</w:t>
+      </w:r>
+    </w:p>
+  </w:comment>
+  <w:comment w:id="39" w:author="Saurabh Rane" w:date="2025-07-14T16:29:00Z" w:initials="SR">
+    <w:p>
+      <w:r>
+        <w:rPr>
+          <w:rStyle w:val="CommentReference"/>
+        </w:rPr>
+        <w:annotationRef/>
+      </w:r>
+      <w:r>
+        <w:rPr>
+          <w:color w:val="000000"/>
+          <w:sz w:val="20"/>
+          <w:szCs w:val="20"/>
+        </w:rPr>
+        <w:t>Update Charts</w:t>
+      </w:r>
+    </w:p>
+  </w:comment>
+</w:comments>
+</file>
+
+<file path=word/commentsExtended.xml><?xml version="1.0" encoding="utf-8"?>
+<w15:commentsEx xmlns:wpc="http://schemas.microsoft.com/office/word/2010/wordprocessingCanvas" xmlns:cx="http://schemas.microsoft.com/office/drawing/2014/chartex" xmlns:cx1="http://schemas.microsoft.com/office/drawing/2015/9/8/chartex" xmlns:cx2="http://schemas.microsoft.com/office/drawing/2015/10/21/chartex" xmlns:cx3="http://schemas.microsoft.com/office/drawing/2016/5/9/chartex" xmlns:cx4="http://schemas.microsoft.com/office/drawing/2016/5/10/chartex" xmlns:cx5="http://schemas.microsoft.com/office/drawing/2016/5/11/chartex" xmlns:cx6="http://schemas.microsoft.com/office/drawing/2016/5/12/chartex" xmlns:cx7="http://schemas.microsoft.com/office/drawing/2016/5/13/chartex" xmlns:cx8="http://schemas.microsoft.com/office/drawing/2016/5/14/chartex" xmlns:mc="http://schemas.openxmlformats.org/markup-compatibility/2006" xmlns:aink="http://schemas.microsoft.com/office/drawing/2016/ink" xmlns:am3d="http://schemas.microsoft.com/office/drawing/2017/model3d" xmlns:o="urn:schemas-microsoft-com:office:office" xmlns:oel="http://schemas.microsoft.com/office/2019/extlst" xmlns:r="http://schemas.openxmlformats.org/officeDocument/2006/relationships" xmlns:m="http://schemas.openxmlformats.org/officeDocument/2006/math" xmlns:v="urn:schemas-microsoft-com:vml" xmlns:wp14="http://schemas.microsoft.com/office/word/2010/wordprocessingDrawing" xmlns:wp="http://schemas.openxmlformats.org/drawingml/2006/wordprocessingDrawing" xmlns:w10="urn:schemas-microsoft-com:office:word" xmlns:w="http://schemas.openxmlformats.org/wordprocessingml/2006/main" xmlns:w14="http://schemas.microsoft.com/office/word/2010/wordml" xmlns:w15="http://schemas.microsoft.com/office/word/2012/wordml" xmlns:w16cex="http://schemas.microsoft.com/office/word/2018/wordml/cex" xmlns:w16cid="http://schemas.microsoft.com/office/word/2016/wordml/cid" xmlns:w16="http://schemas.microsoft.com/office/word/2018/wordml" xmlns:w16du="http://schemas.microsoft.com/office/word/2023/wordml/word16du" xmlns:w16sdtdh="http://schemas.microsoft.com/office/word/2020/wordml/sdtdatahash" xmlns:w16sdtfl="http://schemas.microsoft.com/office/word/2024/wordml/sdtformatlock" xmlns:w16se="http://schemas.microsoft.com/office/word/2015/wordml/symex" xmlns:wpg="http://schemas.microsoft.com/office/word/2010/wordprocessingGroup" xmlns:wpi="http://schemas.microsoft.com/office/word/2010/wordprocessingInk" xmlns:wne="http://schemas.microsoft.com/office/word/2006/wordml" xmlns:wps="http://schemas.microsoft.com/office/word/2010/wordprocessingShape" mc:Ignorable="w14 w15 w16se w16cid w16 w16cex w16sdtdh w16sdtfl w16du wp14">
+  <w15:commentEx w15:paraId="32225ED0" w15:done="1"/>
+  <w15:commentEx w15:paraId="2FE6128C" w15:done="1"/>
+  <w15:commentEx w15:paraId="380FAD3E" w15:done="1"/>
+  <w15:commentEx w15:paraId="51891760" w15:done="1"/>
+  <w15:commentEx w15:paraId="32AAD01F" w15:done="1"/>
+  <w15:commentEx w15:paraId="64AD6308" w15:done="1"/>
+  <w15:commentEx w15:paraId="6DD9CDC6" w15:done="1"/>
+  <w15:commentEx w15:paraId="5CDDED9F" w15:done="1"/>
+  <w15:commentEx w15:paraId="00649800" w15:done="1"/>
+  <w15:commentEx w15:paraId="731CB766" w15:done="1"/>
+</w15:commentsEx>
+</file>
+
+<file path=word/commentsExtensible.xml><?xml version="1.0" encoding="utf-8"?>
+<w16cex:commentsExtensible xmlns:wpc="http://schemas.microsoft.com/office/word/2010/wordprocessingCanvas" xmlns:cx="http://schemas.microsoft.com/office/drawing/2014/chartex" xmlns:cx1="http://schemas.microsoft.com/office/drawing/2015/9/8/chartex" xmlns:cx2="http://schemas.microsoft.com/office/drawing/2015/10/21/chartex" xmlns:cx3="http://schemas.microsoft.com/office/drawing/2016/5/9/chartex" xmlns:cx4="http://schemas.microsoft.com/office/drawing/2016/5/10/chartex" xmlns:cx5="http://schemas.microsoft.com/office/drawing/2016/5/11/chartex" xmlns:cx6="http://schemas.microsoft.com/office/drawing/2016/5/12/chartex" xmlns:cx7="http://schemas.microsoft.com/office/drawing/2016/5/13/chartex" xmlns:cx8="http://schemas.microsoft.com/office/drawing/2016/5/14/chartex" xmlns:cr="http://schemas.microsoft.com/office/comments/2020/reactions" xmlns:mc="http://schemas.openxmlformats.org/markup-compatibility/2006" xmlns:aink="http://schemas.microsoft.com/office/drawing/2016/ink" xmlns:am3d="http://schemas.microsoft.com/office/drawing/2017/model3d" xmlns:o="urn:schemas-microsoft-com:office:office" xmlns:oel="http://schemas.microsoft.com/office/2019/extlst" xmlns:r="http://schemas.openxmlformats.org/officeDocument/2006/relationships" xmlns:m="http://schemas.openxmlformats.org/officeDocument/2006/math" xmlns:v="urn:schemas-microsoft-com:vml" xmlns:wp14="http://schemas.microsoft.com/office/word/2010/wordprocessingDrawing" xmlns:wp="http://schemas.openxmlformats.org/drawingml/2006/wordprocessingDrawing" xmlns:w10="urn:schemas-microsoft-com:office:word" xmlns:w="http://schemas.openxmlformats.org/wordprocessingml/2006/main" xmlns:w14="http://schemas.microsoft.com/office/word/2010/wordml" xmlns:w15="http://schemas.microsoft.com/office/word/2012/wordml" xmlns:w16cex="http://schemas.microsoft.com/office/word/2018/wordml/cex" xmlns:w16cid="http://schemas.microsoft.com/office/word/2016/wordml/cid" xmlns:w16="http://schemas.microsoft.com/office/word/2018/wordml" xmlns:w16du="http://schemas.microsoft.com/office/word/2023/wordml/word16du" xmlns:w16sdtdh="http://schemas.microsoft.com/office/word/2020/wordml/sdtdatahash" xmlns:w16sdtfl="http://schemas.microsoft.com/office/word/2024/wordml/sdtformatlock" xmlns:w16se="http://schemas.microsoft.com/office/word/2015/wordml/symex" xmlns:wpg="http://schemas.microsoft.com/office/word/2010/wordprocessingGroup" xmlns:wpi="http://schemas.microsoft.com/office/word/2010/wordprocessingInk" xmlns:wne="http://schemas.microsoft.com/office/word/2006/wordml" xmlns:wps="http://schemas.microsoft.com/office/word/2010/wordprocessingShape" mc:Ignorable="w14 w15 w16se w16cid w16 w16cex w16sdtdh w16sdtfl cr w16du wp14">
+  <w16cex:commentExtensible w16cex:durableId="05EC8475" w16cex:dateUtc="2025-07-12T15:00:00Z"/>
+  <w16cex:commentExtensible w16cex:durableId="27D33B88" w16cex:dateUtc="2025-07-08T19:01:00Z"/>
+  <w16cex:commentExtensible w16cex:durableId="6775E508" w16cex:dateUtc="2025-07-08T19:02:00Z"/>
+  <w16cex:commentExtensible w16cex:durableId="1EFD6F90" w16cex:dateUtc="2025-07-12T15:22:00Z"/>
+  <w16cex:commentExtensible w16cex:durableId="46F8B2B6" w16cex:dateUtc="2025-07-08T19:04:00Z"/>
+  <w16cex:commentExtensible w16cex:durableId="415E5C80" w16cex:dateUtc="2025-07-11T22:17:00Z"/>
+  <w16cex:commentExtensible w16cex:durableId="16A47A0C" w16cex:dateUtc="2025-07-08T19:06:00Z"/>
+  <w16cex:commentExtensible w16cex:durableId="408AA7F5" w16cex:dateUtc="2025-07-15T02:52:00Z"/>
+  <w16cex:commentExtensible w16cex:durableId="41BB12FD" w16cex:dateUtc="2025-07-14T20:29:00Z"/>
+  <w16cex:commentExtensible w16cex:durableId="7A7DADD5" w16cex:dateUtc="2025-07-14T20:29:00Z"/>
+</w16cex:commentsExtensible>
+</file>
+
+<file path=word/commentsIds.xml><?xml version="1.0" encoding="utf-8"?>
+<w16cid:commentsIds xmlns:wpc="http://schemas.microsoft.com/office/word/2010/wordprocessingCanvas" xmlns:cx="http://schemas.microsoft.com/office/drawing/2014/chartex" xmlns:cx1="http://schemas.microsoft.com/office/drawing/2015/9/8/chartex" xmlns:cx2="http://schemas.microsoft.com/office/drawing/2015/10/21/chartex" xmlns:cx3="http://schemas.microsoft.com/office/drawing/2016/5/9/chartex" xmlns:cx4="http://schemas.microsoft.com/office/drawing/2016/5/10/chartex" xmlns:cx5="http://schemas.microsoft.com/office/drawing/2016/5/11/chartex" xmlns:cx6="http://schemas.microsoft.com/office/drawing/2016/5/12/chartex" xmlns:cx7="http://schemas.microsoft.com/office/drawing/2016/5/13/chartex" xmlns:cx8="http://schemas.microsoft.com/office/drawing/2016/5/14/chartex" xmlns:mc="http://schemas.openxmlformats.org/markup-compatibility/2006" xmlns:aink="http://schemas.microsoft.com/office/drawing/2016/ink" xmlns:am3d="http://schemas.microsoft.com/office/drawing/2017/model3d" xmlns:o="urn:schemas-microsoft-com:office:office" xmlns:oel="http://schemas.microsoft.com/office/2019/extlst" xmlns:r="http://schemas.openxmlformats.org/officeDocument/2006/relationships" xmlns:m="http://schemas.openxmlformats.org/officeDocument/2006/math" xmlns:v="urn:schemas-microsoft-com:vml" xmlns:wp14="http://schemas.microsoft.com/office/word/2010/wordprocessingDrawing" xmlns:wp="http://schemas.openxmlformats.org/drawingml/2006/wordprocessingDrawing" xmlns:w10="urn:schemas-microsoft-com:office:word" xmlns:w="http://schemas.openxmlformats.org/wordprocessingml/2006/main" xmlns:w14="http://schemas.microsoft.com/office/word/2010/wordml" xmlns:w15="http://schemas.microsoft.com/office/word/2012/wordml" xmlns:w16cex="http://schemas.microsoft.com/office/word/2018/wordml/cex" xmlns:w16cid="http://schemas.microsoft.com/office/word/2016/wordml/cid" xmlns:w16="http://schemas.microsoft.com/office/word/2018/wordml" xmlns:w16du="http://schemas.microsoft.com/office/word/2023/wordml/word16du" xmlns:w16sdtdh="http://schemas.microsoft.com/office/word/2020/wordml/sdtdatahash" xmlns:w16sdtfl="http://schemas.microsoft.com/office/word/2024/wordml/sdtformatlock" xmlns:w16se="http://schemas.microsoft.com/office/word/2015/wordml/symex" xmlns:wpg="http://schemas.microsoft.com/office/word/2010/wordprocessingGroup" xmlns:wpi="http://schemas.microsoft.com/office/word/2010/wordprocessingInk" xmlns:wne="http://schemas.microsoft.com/office/word/2006/wordml" xmlns:wps="http://schemas.microsoft.com/office/word/2010/wordprocessingShape" mc:Ignorable="w14 w15 w16se w16cid w16 w16cex w16sdtdh w16sdtfl w16du wp14">
+  <w16cid:commentId w16cid:paraId="32225ED0" w16cid:durableId="05EC8475"/>
+  <w16cid:commentId w16cid:paraId="2FE6128C" w16cid:durableId="27D33B88"/>
+  <w16cid:commentId w16cid:paraId="380FAD3E" w16cid:durableId="6775E508"/>
+  <w16cid:commentId w16cid:paraId="51891760" w16cid:durableId="1EFD6F90"/>
+  <w16cid:commentId w16cid:paraId="32AAD01F" w16cid:durableId="46F8B2B6"/>
+  <w16cid:commentId w16cid:paraId="64AD6308" w16cid:durableId="415E5C80"/>
+  <w16cid:commentId w16cid:paraId="6DD9CDC6" w16cid:durableId="16A47A0C"/>
+  <w16cid:commentId w16cid:paraId="5CDDED9F" w16cid:durableId="408AA7F5"/>
+  <w16cid:commentId w16cid:paraId="00649800" w16cid:durableId="41BB12FD"/>
+  <w16cid:commentId w16cid:paraId="731CB766" w16cid:durableId="7A7DADD5"/>
+</w16cid:commentsIds>
+</file>
+
 <file path=word/endnotes.xml><?xml version="1.0" encoding="utf-8"?>
-<w:endnotes xmlns:wpc="http://schemas.microsoft.com/office/word/2010/wordprocessingCanvas" xmlns:cx="http://schemas.microsoft.com/office/drawing/2014/chartex" xmlns:cx1="http://schemas.microsoft.com/office/drawing/2015/9/8/chartex" xmlns:cx2="http://schemas.microsoft.com/office/drawing/2015/10/21/chartex" xmlns:cx3="http://schemas.microsoft.com/office/drawing/2016/5/9/chartex" xmlns:cx4="http://schemas.microsoft.com/office/drawing/2016/5/10/chartex" xmlns:cx5="http://schemas.microsoft.com/office/drawing/2016/5/11/chartex" xmlns:cx6="http://schemas.microsoft.com/office/drawing/2016/5/12/chartex" xmlns:cx7="http://schemas.microsoft.com/office/drawing/2016/5/13/chartex" xmlns:cx8="http://schemas.microsoft.com/office/drawing/2016/5/14/chartex" xmlns:mc="http://schemas.openxmlformats.org/markup-compatibility/2006" xmlns:aink="http://schemas.microsoft.com/office/drawing/2016/ink" xmlns:am3d="http://schemas.microsoft.com/office/drawing/2017/model3d" xmlns:o="urn:schemas-microsoft-com:office:office" xmlns:oel="http://schemas.microsoft.com/office/2019/extlst" xmlns:r="http://schemas.openxmlformats.org/officeDocument/2006/relationships" xmlns:m="http://schemas.openxmlformats.org/officeDocument/2006/math" xmlns:v="urn:schemas-microsoft-com:vml" xmlns:wp14="http://schemas.microsoft.com/office/word/2010/wordprocessingDrawing" xmlns:wp="http://schemas.openxmlformats.org/drawingml/2006/wordprocessingDrawing" xmlns:w10="urn:schemas-microsoft-com:office:word" xmlns:w="http://schemas.openxmlformats.org/wordprocessingml/2006/main" xmlns:w14="http://schemas.microsoft.com/office/word/2010/wordml" xmlns:w15="http://schemas.microsoft.com/office/word/2012/wordml" xmlns:w16cex="http://schemas.microsoft.com/office/word/2018/wordml/cex" xmlns:w16cid="http://schemas.microsoft.com/office/word/2016/wordml/cid" xmlns:w16="http://schemas.microsoft.com/office/word/2018/wordml" xmlns:w16du="http://schemas.microsoft.com/office/word/2023/wordml/word16du" xmlns:w16sdtdh="http://schemas.microsoft.com/office/word/2020/wordml/sdtdatahash" xmlns:w16se="http://schemas.microsoft.com/office/word/2015/wordml/symex" xmlns:wpg="http://schemas.microsoft.com/office/word/2010/wordprocessingGroup" xmlns:wpi="http://schemas.microsoft.com/office/word/2010/wordprocessingInk" xmlns:wne="http://schemas.microsoft.com/office/word/2006/wordml" xmlns:wps="http://schemas.microsoft.com/office/word/2010/wordprocessingShape" mc:Ignorable="w14 w15 w16se w16cid w16 w16cex w16sdtdh w16du wp14">
+<w:endnotes xmlns:wpc="http://schemas.microsoft.com/office/word/2010/wordprocessingCanvas" xmlns:cx="http://schemas.microsoft.com/office/drawing/2014/chartex" xmlns:cx1="http://schemas.microsoft.com/office/drawing/2015/9/8/chartex" xmlns:cx2="http://schemas.microsoft.com/office/drawing/2015/10/21/chartex" xmlns:cx3="http://schemas.microsoft.com/office/drawing/2016/5/9/chartex" xmlns:cx4="http://schemas.microsoft.com/office/drawing/2016/5/10/chartex" xmlns:cx5="http://schemas.microsoft.com/office/drawing/2016/5/11/chartex" xmlns:cx6="http://schemas.microsoft.com/office/drawing/2016/5/12/chartex" xmlns:cx7="http://schemas.microsoft.com/office/drawing/2016/5/13/chartex" xmlns:cx8="http://schemas.microsoft.com/office/drawing/2016/5/14/chartex" xmlns:mc="http://schemas.openxmlformats.org/markup-compatibility/2006" xmlns:aink="http://schemas.microsoft.com/office/drawing/2016/ink" xmlns:am3d="http://schemas.microsoft.com/office/drawing/2017/model3d" xmlns:o="urn:schemas-microsoft-com:office:office" xmlns:oel="http://schemas.microsoft.com/office/2019/extlst" xmlns:r="http://schemas.openxmlformats.org/officeDocument/2006/relationships" xmlns:m="http://schemas.openxmlformats.org/officeDocument/2006/math" xmlns:v="urn:schemas-microsoft-com:vml" xmlns:wp14="http://schemas.microsoft.com/office/word/2010/wordprocessingDrawing" xmlns:wp="http://schemas.openxmlformats.org/drawingml/2006/wordprocessingDrawing" xmlns:w10="urn:schemas-microsoft-com:office:word" xmlns:w="http://schemas.openxmlformats.org/wordprocessingml/2006/main" xmlns:w14="http://schemas.microsoft.com/office/word/2010/wordml" xmlns:w15="http://schemas.microsoft.com/office/word/2012/wordml" xmlns:w16cex="http://schemas.microsoft.com/office/word/2018/wordml/cex" xmlns:w16cid="http://schemas.microsoft.com/office/word/2016/wordml/cid" xmlns:w16="http://schemas.microsoft.com/office/word/2018/wordml" xmlns:w16du="http://schemas.microsoft.com/office/word/2023/wordml/word16du" xmlns:w16sdtdh="http://schemas.microsoft.com/office/word/2020/wordml/sdtdatahash" xmlns:w16sdtfl="http://schemas.microsoft.com/office/word/2024/wordml/sdtformatlock" xmlns:w16se="http://schemas.microsoft.com/office/word/2015/wordml/symex" xmlns:wpg="http://schemas.microsoft.com/office/word/2010/wordprocessingGroup" xmlns:wpi="http://schemas.microsoft.com/office/word/2010/wordprocessingInk" xmlns:wne="http://schemas.microsoft.com/office/word/2006/wordml" xmlns:wps="http://schemas.microsoft.com/office/word/2010/wordprocessingShape" mc:Ignorable="w14 w15 w16se w16cid w16 w16cex w16sdtdh w16sdtfl w16du wp14">
   <w:endnote w:type="separator" w:id="-1">
     <w:p>
       <w:pPr>
@@ -11061,7 +12493,7 @@
 </file>
 
 <file path=word/footer1.xml><?xml version="1.0" encoding="utf-8"?>
-<w:ftr xmlns:wpc="http://schemas.microsoft.com/office/word/2010/wordprocessingCanvas" xmlns:cx="http://schemas.microsoft.com/office/drawing/2014/chartex" xmlns:cx1="http://schemas.microsoft.com/office/drawing/2015/9/8/chartex" xmlns:cx2="http://schemas.microsoft.com/office/drawing/2015/10/21/chartex" xmlns:cx3="http://schemas.microsoft.com/office/drawing/2016/5/9/chartex" xmlns:cx4="http://schemas.microsoft.com/office/drawing/2016/5/10/chartex" xmlns:cx5="http://schemas.microsoft.com/office/drawing/2016/5/11/chartex" xmlns:cx6="http://schemas.microsoft.com/office/drawing/2016/5/12/chartex" xmlns:cx7="http://schemas.microsoft.com/office/drawing/2016/5/13/chartex" xmlns:cx8="http://schemas.microsoft.com/office/drawing/2016/5/14/chartex" xmlns:mc="http://schemas.openxmlformats.org/markup-compatibility/2006" xmlns:aink="http://schemas.microsoft.com/office/drawing/2016/ink" xmlns:am3d="http://schemas.microsoft.com/office/drawing/2017/model3d" xmlns:o="urn:schemas-microsoft-com:office:office" xmlns:oel="http://schemas.microsoft.com/office/2019/extlst" xmlns:r="http://schemas.openxmlformats.org/officeDocument/2006/relationships" xmlns:m="http://schemas.openxmlformats.org/officeDocument/2006/math" xmlns:v="urn:schemas-microsoft-com:vml" xmlns:wp14="http://schemas.microsoft.com/office/word/2010/wordprocessingDrawing" xmlns:wp="http://schemas.openxmlformats.org/drawingml/2006/wordprocessingDrawing" xmlns:w10="urn:schemas-microsoft-com:office:word" xmlns:w="http://schemas.openxmlformats.org/wordprocessingml/2006/main" xmlns:w14="http://schemas.microsoft.com/office/word/2010/wordml" xmlns:w15="http://schemas.microsoft.com/office/word/2012/wordml" xmlns:w16cex="http://schemas.microsoft.com/office/word/2018/wordml/cex" xmlns:w16cid="http://schemas.microsoft.com/office/word/2016/wordml/cid" xmlns:w16="http://schemas.microsoft.com/office/word/2018/wordml" xmlns:w16du="http://schemas.microsoft.com/office/word/2023/wordml/word16du" xmlns:w16sdtdh="http://schemas.microsoft.com/office/word/2020/wordml/sdtdatahash" xmlns:w16se="http://schemas.microsoft.com/office/word/2015/wordml/symex" xmlns:wpg="http://schemas.microsoft.com/office/word/2010/wordprocessingGroup" xmlns:wpi="http://schemas.microsoft.com/office/word/2010/wordprocessingInk" xmlns:wne="http://schemas.microsoft.com/office/word/2006/wordml" xmlns:wps="http://schemas.microsoft.com/office/word/2010/wordprocessingShape" mc:Ignorable="w14 w15 w16se w16cid w16 w16cex w16sdtdh w16du wp14">
+<w:ftr xmlns:wpc="http://schemas.microsoft.com/office/word/2010/wordprocessingCanvas" xmlns:cx="http://schemas.microsoft.com/office/drawing/2014/chartex" xmlns:cx1="http://schemas.microsoft.com/office/drawing/2015/9/8/chartex" xmlns:cx2="http://schemas.microsoft.com/office/drawing/2015/10/21/chartex" xmlns:cx3="http://schemas.microsoft.com/office/drawing/2016/5/9/chartex" xmlns:cx4="http://schemas.microsoft.com/office/drawing/2016/5/10/chartex" xmlns:cx5="http://schemas.microsoft.com/office/drawing/2016/5/11/chartex" xmlns:cx6="http://schemas.microsoft.com/office/drawing/2016/5/12/chartex" xmlns:cx7="http://schemas.microsoft.com/office/drawing/2016/5/13/chartex" xmlns:cx8="http://schemas.microsoft.com/office/drawing/2016/5/14/chartex" xmlns:mc="http://schemas.openxmlformats.org/markup-compatibility/2006" xmlns:aink="http://schemas.microsoft.com/office/drawing/2016/ink" xmlns:am3d="http://schemas.microsoft.com/office/drawing/2017/model3d" xmlns:o="urn:schemas-microsoft-com:office:office" xmlns:oel="http://schemas.microsoft.com/office/2019/extlst" xmlns:r="http://schemas.openxmlformats.org/officeDocument/2006/relationships" xmlns:m="http://schemas.openxmlformats.org/officeDocument/2006/math" xmlns:v="urn:schemas-microsoft-com:vml" xmlns:wp14="http://schemas.microsoft.com/office/word/2010/wordprocessingDrawing" xmlns:wp="http://schemas.openxmlformats.org/drawingml/2006/wordprocessingDrawing" xmlns:w10="urn:schemas-microsoft-com:office:word" xmlns:w="http://schemas.openxmlformats.org/wordprocessingml/2006/main" xmlns:w14="http://schemas.microsoft.com/office/word/2010/wordml" xmlns:w15="http://schemas.microsoft.com/office/word/2012/wordml" xmlns:w16cex="http://schemas.microsoft.com/office/word/2018/wordml/cex" xmlns:w16cid="http://schemas.microsoft.com/office/word/2016/wordml/cid" xmlns:w16="http://schemas.microsoft.com/office/word/2018/wordml" xmlns:w16du="http://schemas.microsoft.com/office/word/2023/wordml/word16du" xmlns:w16sdtdh="http://schemas.microsoft.com/office/word/2020/wordml/sdtdatahash" xmlns:w16sdtfl="http://schemas.microsoft.com/office/word/2024/wordml/sdtformatlock" xmlns:w16se="http://schemas.microsoft.com/office/word/2015/wordml/symex" xmlns:wpg="http://schemas.microsoft.com/office/word/2010/wordprocessingGroup" xmlns:wpi="http://schemas.microsoft.com/office/word/2010/wordprocessingInk" xmlns:wne="http://schemas.microsoft.com/office/word/2006/wordml" xmlns:wps="http://schemas.microsoft.com/office/word/2010/wordprocessingShape" mc:Ignorable="w14 w15 w16se w16cid w16 w16cex w16sdtdh w16sdtfl w16du wp14">
   <w:sdt>
     <w:sdtPr>
       <w:id w:val="-1609965600"/>
@@ -11114,7 +12546,7 @@
 </file>
 
 <file path=word/footnotes.xml><?xml version="1.0" encoding="utf-8"?>
-<w:footnotes xmlns:wpc="http://schemas.microsoft.com/office/word/2010/wordprocessingCanvas" xmlns:cx="http://schemas.microsoft.com/office/drawing/2014/chartex" xmlns:cx1="http://schemas.microsoft.com/office/drawing/2015/9/8/chartex" xmlns:cx2="http://schemas.microsoft.com/office/drawing/2015/10/21/chartex" xmlns:cx3="http://schemas.microsoft.com/office/drawing/2016/5/9/chartex" xmlns:cx4="http://schemas.microsoft.com/office/drawing/2016/5/10/chartex" xmlns:cx5="http://schemas.microsoft.com/office/drawing/2016/5/11/chartex" xmlns:cx6="http://schemas.microsoft.com/office/drawing/2016/5/12/chartex" xmlns:cx7="http://schemas.microsoft.com/office/drawing/2016/5/13/chartex" xmlns:cx8="http://schemas.microsoft.com/office/drawing/2016/5/14/chartex" xmlns:mc="http://schemas.openxmlformats.org/markup-compatibility/2006" xmlns:aink="http://schemas.microsoft.com/office/drawing/2016/ink" xmlns:am3d="http://schemas.microsoft.com/office/drawing/2017/model3d" xmlns:o="urn:schemas-microsoft-com:office:office" xmlns:oel="http://schemas.microsoft.com/office/2019/extlst" xmlns:r="http://schemas.openxmlformats.org/officeDocument/2006/relationships" xmlns:m="http://schemas.openxmlformats.org/officeDocument/2006/math" xmlns:v="urn:schemas-microsoft-com:vml" xmlns:wp14="http://schemas.microsoft.com/office/word/2010/wordprocessingDrawing" xmlns:wp="http://schemas.openxmlformats.org/drawingml/2006/wordprocessingDrawing" xmlns:w10="urn:schemas-microsoft-com:office:word" xmlns:w="http://schemas.openxmlformats.org/wordprocessingml/2006/main" xmlns:w14="http://schemas.microsoft.com/office/word/2010/wordml" xmlns:w15="http://schemas.microsoft.com/office/word/2012/wordml" xmlns:w16cex="http://schemas.microsoft.com/office/word/2018/wordml/cex" xmlns:w16cid="http://schemas.microsoft.com/office/word/2016/wordml/cid" xmlns:w16="http://schemas.microsoft.com/office/word/2018/wordml" xmlns:w16du="http://schemas.microsoft.com/office/word/2023/wordml/word16du" xmlns:w16sdtdh="http://schemas.microsoft.com/office/word/2020/wordml/sdtdatahash" xmlns:w16se="http://schemas.microsoft.com/office/word/2015/wordml/symex" xmlns:wpg="http://schemas.microsoft.com/office/word/2010/wordprocessingGroup" xmlns:wpi="http://schemas.microsoft.com/office/word/2010/wordprocessingInk" xmlns:wne="http://schemas.microsoft.com/office/word/2006/wordml" xmlns:wps="http://schemas.microsoft.com/office/word/2010/wordprocessingShape" mc:Ignorable="w14 w15 w16se w16cid w16 w16cex w16sdtdh w16du wp14">
+<w:footnotes xmlns:wpc="http://schemas.microsoft.com/office/word/2010/wordprocessingCanvas" xmlns:cx="http://schemas.microsoft.com/office/drawing/2014/chartex" xmlns:cx1="http://schemas.microsoft.com/office/drawing/2015/9/8/chartex" xmlns:cx2="http://schemas.microsoft.com/office/drawing/2015/10/21/chartex" xmlns:cx3="http://schemas.microsoft.com/office/drawing/2016/5/9/chartex" xmlns:cx4="http://schemas.microsoft.com/office/drawing/2016/5/10/chartex" xmlns:cx5="http://schemas.microsoft.com/office/drawing/2016/5/11/chartex" xmlns:cx6="http://schemas.microsoft.com/office/drawing/2016/5/12/chartex" xmlns:cx7="http://schemas.microsoft.com/office/drawing/2016/5/13/chartex" xmlns:cx8="http://schemas.microsoft.com/office/drawing/2016/5/14/chartex" xmlns:mc="http://schemas.openxmlformats.org/markup-compatibility/2006" xmlns:aink="http://schemas.microsoft.com/office/drawing/2016/ink" xmlns:am3d="http://schemas.microsoft.com/office/drawing/2017/model3d" xmlns:o="urn:schemas-microsoft-com:office:office" xmlns:oel="http://schemas.microsoft.com/office/2019/extlst" xmlns:r="http://schemas.openxmlformats.org/officeDocument/2006/relationships" xmlns:m="http://schemas.openxmlformats.org/officeDocument/2006/math" xmlns:v="urn:schemas-microsoft-com:vml" xmlns:wp14="http://schemas.microsoft.com/office/word/2010/wordprocessingDrawing" xmlns:wp="http://schemas.openxmlformats.org/drawingml/2006/wordprocessingDrawing" xmlns:w10="urn:schemas-microsoft-com:office:word" xmlns:w="http://schemas.openxmlformats.org/wordprocessingml/2006/main" xmlns:w14="http://schemas.microsoft.com/office/word/2010/wordml" xmlns:w15="http://schemas.microsoft.com/office/word/2012/wordml" xmlns:w16cex="http://schemas.microsoft.com/office/word/2018/wordml/cex" xmlns:w16cid="http://schemas.microsoft.com/office/word/2016/wordml/cid" xmlns:w16="http://schemas.microsoft.com/office/word/2018/wordml" xmlns:w16du="http://schemas.microsoft.com/office/word/2023/wordml/word16du" xmlns:w16sdtdh="http://schemas.microsoft.com/office/word/2020/wordml/sdtdatahash" xmlns:w16sdtfl="http://schemas.microsoft.com/office/word/2024/wordml/sdtformatlock" xmlns:w16se="http://schemas.microsoft.com/office/word/2015/wordml/symex" xmlns:wpg="http://schemas.microsoft.com/office/word/2010/wordprocessingGroup" xmlns:wpi="http://schemas.microsoft.com/office/word/2010/wordprocessingInk" xmlns:wne="http://schemas.microsoft.com/office/word/2006/wordml" xmlns:wps="http://schemas.microsoft.com/office/word/2010/wordprocessingShape" mc:Ignorable="w14 w15 w16se w16cid w16 w16cex w16sdtdh w16sdtfl w16du wp14">
   <w:footnote w:type="separator" w:id="-1">
     <w:p>
       <w:pPr>
@@ -11139,7 +12571,7 @@
 </file>
 
 <file path=word/numbering.xml><?xml version="1.0" encoding="utf-8"?>
-<w:numbering xmlns:wpc="http://schemas.microsoft.com/office/word/2010/wordprocessingCanvas" xmlns:cx="http://schemas.microsoft.com/office/drawing/2014/chartex" xmlns:cx1="http://schemas.microsoft.com/office/drawing/2015/9/8/chartex" xmlns:cx2="http://schemas.microsoft.com/office/drawing/2015/10/21/chartex" xmlns:cx3="http://schemas.microsoft.com/office/drawing/2016/5/9/chartex" xmlns:cx4="http://schemas.microsoft.com/office/drawing/2016/5/10/chartex" xmlns:cx5="http://schemas.microsoft.com/office/drawing/2016/5/11/chartex" xmlns:cx6="http://schemas.microsoft.com/office/drawing/2016/5/12/chartex" xmlns:cx7="http://schemas.microsoft.com/office/drawing/2016/5/13/chartex" xmlns:cx8="http://schemas.microsoft.com/office/drawing/2016/5/14/chartex" xmlns:mc="http://schemas.openxmlformats.org/markup-compatibility/2006" xmlns:aink="http://schemas.microsoft.com/office/drawing/2016/ink" xmlns:am3d="http://schemas.microsoft.com/office/drawing/2017/model3d" xmlns:o="urn:schemas-microsoft-com:office:office" xmlns:oel="http://schemas.microsoft.com/office/2019/extlst" xmlns:r="http://schemas.openxmlformats.org/officeDocument/2006/relationships" xmlns:m="http://schemas.openxmlformats.org/officeDocument/2006/math" xmlns:v="urn:schemas-microsoft-com:vml" xmlns:wp14="http://schemas.microsoft.com/office/word/2010/wordprocessingDrawing" xmlns:wp="http://schemas.openxmlformats.org/drawingml/2006/wordprocessingDrawing" xmlns:w10="urn:schemas-microsoft-com:office:word" xmlns:w="http://schemas.openxmlformats.org/wordprocessingml/2006/main" xmlns:w14="http://schemas.microsoft.com/office/word/2010/wordml" xmlns:w15="http://schemas.microsoft.com/office/word/2012/wordml" xmlns:w16cex="http://schemas.microsoft.com/office/word/2018/wordml/cex" xmlns:w16cid="http://schemas.microsoft.com/office/word/2016/wordml/cid" xmlns:w16="http://schemas.microsoft.com/office/word/2018/wordml" xmlns:w16du="http://schemas.microsoft.com/office/word/2023/wordml/word16du" xmlns:w16sdtdh="http://schemas.microsoft.com/office/word/2020/wordml/sdtdatahash" xmlns:w16se="http://schemas.microsoft.com/office/word/2015/wordml/symex" xmlns:wpg="http://schemas.microsoft.com/office/word/2010/wordprocessingGroup" xmlns:wpi="http://schemas.microsoft.com/office/word/2010/wordprocessingInk" xmlns:wne="http://schemas.microsoft.com/office/word/2006/wordml" xmlns:wps="http://schemas.microsoft.com/office/word/2010/wordprocessingShape" mc:Ignorable="w14 w15 w16se w16cid w16 w16cex w16sdtdh w16du wp14">
+<w:numbering xmlns:wpc="http://schemas.microsoft.com/office/word/2010/wordprocessingCanvas" xmlns:cx="http://schemas.microsoft.com/office/drawing/2014/chartex" xmlns:cx1="http://schemas.microsoft.com/office/drawing/2015/9/8/chartex" xmlns:cx2="http://schemas.microsoft.com/office/drawing/2015/10/21/chartex" xmlns:cx3="http://schemas.microsoft.com/office/drawing/2016/5/9/chartex" xmlns:cx4="http://schemas.microsoft.com/office/drawing/2016/5/10/chartex" xmlns:cx5="http://schemas.microsoft.com/office/drawing/2016/5/11/chartex" xmlns:cx6="http://schemas.microsoft.com/office/drawing/2016/5/12/chartex" xmlns:cx7="http://schemas.microsoft.com/office/drawing/2016/5/13/chartex" xmlns:cx8="http://schemas.microsoft.com/office/drawing/2016/5/14/chartex" xmlns:mc="http://schemas.openxmlformats.org/markup-compatibility/2006" xmlns:aink="http://schemas.microsoft.com/office/drawing/2016/ink" xmlns:am3d="http://schemas.microsoft.com/office/drawing/2017/model3d" xmlns:o="urn:schemas-microsoft-com:office:office" xmlns:oel="http://schemas.microsoft.com/office/2019/extlst" xmlns:r="http://schemas.openxmlformats.org/officeDocument/2006/relationships" xmlns:m="http://schemas.openxmlformats.org/officeDocument/2006/math" xmlns:v="urn:schemas-microsoft-com:vml" xmlns:wp14="http://schemas.microsoft.com/office/word/2010/wordprocessingDrawing" xmlns:wp="http://schemas.openxmlformats.org/drawingml/2006/wordprocessingDrawing" xmlns:w10="urn:schemas-microsoft-com:office:word" xmlns:w="http://schemas.openxmlformats.org/wordprocessingml/2006/main" xmlns:w14="http://schemas.microsoft.com/office/word/2010/wordml" xmlns:w15="http://schemas.microsoft.com/office/word/2012/wordml" xmlns:w16cex="http://schemas.microsoft.com/office/word/2018/wordml/cex" xmlns:w16cid="http://schemas.microsoft.com/office/word/2016/wordml/cid" xmlns:w16="http://schemas.microsoft.com/office/word/2018/wordml" xmlns:w16du="http://schemas.microsoft.com/office/word/2023/wordml/word16du" xmlns:w16sdtdh="http://schemas.microsoft.com/office/word/2020/wordml/sdtdatahash" xmlns:w16sdtfl="http://schemas.microsoft.com/office/word/2024/wordml/sdtformatlock" xmlns:w16se="http://schemas.microsoft.com/office/word/2015/wordml/symex" xmlns:wpg="http://schemas.microsoft.com/office/word/2010/wordprocessingGroup" xmlns:wpi="http://schemas.microsoft.com/office/word/2010/wordprocessingInk" xmlns:wne="http://schemas.microsoft.com/office/word/2006/wordml" xmlns:wps="http://schemas.microsoft.com/office/word/2010/wordprocessingShape" mc:Ignorable="w14 w15 w16se w16cid w16 w16cex w16sdtdh w16sdtfl w16du wp14">
   <w:abstractNum w:abstractNumId="0" w15:restartNumberingAfterBreak="0">
     <w:nsid w:val="0EF326C4"/>
     <w:multiLevelType w:val="hybridMultilevel"/>
@@ -11811,11 +13243,109 @@
   <w:num w:numId="15" w16cid:durableId="676080903">
     <w:abstractNumId w:val="3"/>
   </w:num>
+  <w:num w:numId="16" w16cid:durableId="1015499431">
+    <w:abstractNumId w:val="3"/>
+    <w:lvlOverride w:ilvl="0">
+      <w:startOverride w:val="1"/>
+    </w:lvlOverride>
+    <w:lvlOverride w:ilvl="1">
+      <w:startOverride w:val="1"/>
+    </w:lvlOverride>
+    <w:lvlOverride w:ilvl="2">
+      <w:startOverride w:val="1"/>
+    </w:lvlOverride>
+    <w:lvlOverride w:ilvl="3">
+      <w:startOverride w:val="1"/>
+    </w:lvlOverride>
+    <w:lvlOverride w:ilvl="4">
+      <w:startOverride w:val="1"/>
+    </w:lvlOverride>
+    <w:lvlOverride w:ilvl="5">
+      <w:startOverride w:val="1"/>
+    </w:lvlOverride>
+    <w:lvlOverride w:ilvl="6">
+      <w:startOverride w:val="1"/>
+    </w:lvlOverride>
+    <w:lvlOverride w:ilvl="7">
+      <w:startOverride w:val="1"/>
+    </w:lvlOverride>
+    <w:lvlOverride w:ilvl="8">
+      <w:startOverride w:val="1"/>
+    </w:lvlOverride>
+  </w:num>
+  <w:num w:numId="17" w16cid:durableId="714894619">
+    <w:abstractNumId w:val="3"/>
+    <w:lvlOverride w:ilvl="0">
+      <w:startOverride w:val="1"/>
+    </w:lvlOverride>
+    <w:lvlOverride w:ilvl="1">
+      <w:startOverride w:val="1"/>
+    </w:lvlOverride>
+    <w:lvlOverride w:ilvl="2">
+      <w:startOverride w:val="1"/>
+    </w:lvlOverride>
+    <w:lvlOverride w:ilvl="3">
+      <w:startOverride w:val="1"/>
+    </w:lvlOverride>
+    <w:lvlOverride w:ilvl="4">
+      <w:startOverride w:val="1"/>
+    </w:lvlOverride>
+    <w:lvlOverride w:ilvl="5">
+      <w:startOverride w:val="1"/>
+    </w:lvlOverride>
+    <w:lvlOverride w:ilvl="6">
+      <w:startOverride w:val="1"/>
+    </w:lvlOverride>
+    <w:lvlOverride w:ilvl="7">
+      <w:startOverride w:val="1"/>
+    </w:lvlOverride>
+    <w:lvlOverride w:ilvl="8">
+      <w:startOverride w:val="1"/>
+    </w:lvlOverride>
+  </w:num>
+  <w:num w:numId="18" w16cid:durableId="830292562">
+    <w:abstractNumId w:val="3"/>
+    <w:lvlOverride w:ilvl="0">
+      <w:startOverride w:val="1"/>
+    </w:lvlOverride>
+    <w:lvlOverride w:ilvl="1">
+      <w:startOverride w:val="1"/>
+    </w:lvlOverride>
+    <w:lvlOverride w:ilvl="2">
+      <w:startOverride w:val="1"/>
+    </w:lvlOverride>
+    <w:lvlOverride w:ilvl="3">
+      <w:startOverride w:val="1"/>
+    </w:lvlOverride>
+    <w:lvlOverride w:ilvl="4">
+      <w:startOverride w:val="1"/>
+    </w:lvlOverride>
+    <w:lvlOverride w:ilvl="5">
+      <w:startOverride w:val="1"/>
+    </w:lvlOverride>
+    <w:lvlOverride w:ilvl="6">
+      <w:startOverride w:val="1"/>
+    </w:lvlOverride>
+    <w:lvlOverride w:ilvl="7">
+      <w:startOverride w:val="1"/>
+    </w:lvlOverride>
+    <w:lvlOverride w:ilvl="8">
+      <w:startOverride w:val="1"/>
+    </w:lvlOverride>
+  </w:num>
 </w:numbering>
 </file>
 
+<file path=word/people.xml><?xml version="1.0" encoding="utf-8"?>
+<w15:people xmlns:wpc="http://schemas.microsoft.com/office/word/2010/wordprocessingCanvas" xmlns:cx="http://schemas.microsoft.com/office/drawing/2014/chartex" xmlns:cx1="http://schemas.microsoft.com/office/drawing/2015/9/8/chartex" xmlns:cx2="http://schemas.microsoft.com/office/drawing/2015/10/21/chartex" xmlns:cx3="http://schemas.microsoft.com/office/drawing/2016/5/9/chartex" xmlns:cx4="http://schemas.microsoft.com/office/drawing/2016/5/10/chartex" xmlns:cx5="http://schemas.microsoft.com/office/drawing/2016/5/11/chartex" xmlns:cx6="http://schemas.microsoft.com/office/drawing/2016/5/12/chartex" xmlns:cx7="http://schemas.microsoft.com/office/drawing/2016/5/13/chartex" xmlns:cx8="http://schemas.microsoft.com/office/drawing/2016/5/14/chartex" xmlns:mc="http://schemas.openxmlformats.org/markup-compatibility/2006" xmlns:aink="http://schemas.microsoft.com/office/drawing/2016/ink" xmlns:am3d="http://schemas.microsoft.com/office/drawing/2017/model3d" xmlns:o="urn:schemas-microsoft-com:office:office" xmlns:oel="http://schemas.microsoft.com/office/2019/extlst" xmlns:r="http://schemas.openxmlformats.org/officeDocument/2006/relationships" xmlns:m="http://schemas.openxmlformats.org/officeDocument/2006/math" xmlns:v="urn:schemas-microsoft-com:vml" xmlns:wp14="http://schemas.microsoft.com/office/word/2010/wordprocessingDrawing" xmlns:wp="http://schemas.openxmlformats.org/drawingml/2006/wordprocessingDrawing" xmlns:w10="urn:schemas-microsoft-com:office:word" xmlns:w="http://schemas.openxmlformats.org/wordprocessingml/2006/main" xmlns:w14="http://schemas.microsoft.com/office/word/2010/wordml" xmlns:w15="http://schemas.microsoft.com/office/word/2012/wordml" xmlns:w16cex="http://schemas.microsoft.com/office/word/2018/wordml/cex" xmlns:w16cid="http://schemas.microsoft.com/office/word/2016/wordml/cid" xmlns:w16="http://schemas.microsoft.com/office/word/2018/wordml" xmlns:w16du="http://schemas.microsoft.com/office/word/2023/wordml/word16du" xmlns:w16sdtdh="http://schemas.microsoft.com/office/word/2020/wordml/sdtdatahash" xmlns:w16sdtfl="http://schemas.microsoft.com/office/word/2024/wordml/sdtformatlock" xmlns:w16se="http://schemas.microsoft.com/office/word/2015/wordml/symex" xmlns:wpg="http://schemas.microsoft.com/office/word/2010/wordprocessingGroup" xmlns:wpi="http://schemas.microsoft.com/office/word/2010/wordprocessingInk" xmlns:wne="http://schemas.microsoft.com/office/word/2006/wordml" xmlns:wps="http://schemas.microsoft.com/office/word/2010/wordprocessingShape" mc:Ignorable="w14 w15 w16se w16cid w16 w16cex w16sdtdh w16sdtfl w16du wp14">
+  <w15:person w15:author="Saurabh Rane">
+    <w15:presenceInfo w15:providerId="Windows Live" w15:userId="7fa8c2af39dc2a7d"/>
+  </w15:person>
+</w15:people>
+</file>
+
 <file path=word/styles.xml><?xml version="1.0" encoding="utf-8"?>
-<w:styles xmlns:mc="http://schemas.openxmlformats.org/markup-compatibility/2006" xmlns:r="http://schemas.openxmlformats.org/officeDocument/2006/relationships" xmlns:w="http://schemas.openxmlformats.org/wordprocessingml/2006/main" xmlns:w14="http://schemas.microsoft.com/office/word/2010/wordml" xmlns:w15="http://schemas.microsoft.com/office/word/2012/wordml" xmlns:w16cex="http://schemas.microsoft.com/office/word/2018/wordml/cex" xmlns:w16cid="http://schemas.microsoft.com/office/word/2016/wordml/cid" xmlns:w16="http://schemas.microsoft.com/office/word/2018/wordml" xmlns:w16du="http://schemas.microsoft.com/office/word/2023/wordml/word16du" xmlns:w16sdtdh="http://schemas.microsoft.com/office/word/2020/wordml/sdtdatahash" xmlns:w16se="http://schemas.microsoft.com/office/word/2015/wordml/symex" mc:Ignorable="w14 w15 w16se w16cid w16 w16cex w16sdtdh w16du">
+<w:styles xmlns:mc="http://schemas.openxmlformats.org/markup-compatibility/2006" xmlns:r="http://schemas.openxmlformats.org/officeDocument/2006/relationships" xmlns:w="http://schemas.openxmlformats.org/wordprocessingml/2006/main" xmlns:w14="http://schemas.microsoft.com/office/word/2010/wordml" xmlns:w15="http://schemas.microsoft.com/office/word/2012/wordml" xmlns:w16cex="http://schemas.microsoft.com/office/word/2018/wordml/cex" xmlns:w16cid="http://schemas.microsoft.com/office/word/2016/wordml/cid" xmlns:w16="http://schemas.microsoft.com/office/word/2018/wordml" xmlns:w16du="http://schemas.microsoft.com/office/word/2023/wordml/word16du" xmlns:w16sdtdh="http://schemas.microsoft.com/office/word/2020/wordml/sdtdatahash" xmlns:w16sdtfl="http://schemas.microsoft.com/office/word/2024/wordml/sdtformatlock" xmlns:w16se="http://schemas.microsoft.com/office/word/2015/wordml/symex" mc:Ignorable="w14 w15 w16se w16cid w16 w16cex w16sdtdh w16sdtfl w16du">
   <w:docDefaults>
     <w:rPrDefault>
       <w:rPr>

</xml_diff>